<commit_message>
Informe: repositorio publico para evaluacion (historial verificado sin secretos)
Co-Authored-By: Claude Opus 5.5 (1M context) <noreply@anthropic.com>
</commit_message>
<xml_diff>
--- a/informe/Informe-Final-Proyecto-Integrador-TI3V62.docx
+++ b/informe/Informe-Final-Proyecto-Integrador-TI3V62.docx
@@ -642,7 +642,7 @@
                 <w:sz w:val="20"/>
                 <w:szCs w:val="20"/>
               </w:rPr>
-              <w:t>github.com/javiermunoznavarrete/portal-incidentes-ti3v62 (privado)</w:t>
+              <w:t>github.com/javiermunoznavarrete/portal-incidentes-ti3v62 (público para evaluación)</w:t>
             </w:r>
           </w:p>
         </w:tc>
@@ -742,7 +742,7 @@
     <w:sdt>
       <w:sdtPr>
         <w:alias w:val="Índice"/>
-        <w:id w:val="-1732609139"/>
+        <w:id w:val="-737781325"/>
       </w:sdtPr>
       <w:sdtEndPr/>
       <w:sdtContent>
@@ -770,7 +770,7 @@
           <w:r>
             <w:fldChar w:fldCharType="separate"/>
           </w:r>
-          <w:hyperlink w:anchor="_Toc241848352" w:history="1">
+          <w:hyperlink w:anchor="_Toc242043893" w:history="1">
             <w:r>
               <w:rPr>
                 <w:rStyle w:val="Hipervnculo"/>
@@ -794,7 +794,7 @@
               <w:rPr>
                 <w:noProof/>
               </w:rPr>
-              <w:instrText xml:space="preserve"> PAGEREF _Toc241848352 \h </w:instrText>
+              <w:instrText xml:space="preserve"> PAGEREF _Toc242043893 \h </w:instrText>
             </w:r>
             <w:r>
               <w:rPr>
@@ -836,7 +836,7 @@
               <w14:ligatures w14:val="standardContextual"/>
             </w:rPr>
           </w:pPr>
-          <w:hyperlink w:anchor="_Toc241848353" w:history="1">
+          <w:hyperlink w:anchor="_Toc242043894" w:history="1">
             <w:r>
               <w:rPr>
                 <w:rStyle w:val="Hipervnculo"/>
@@ -860,7 +860,7 @@
               <w:rPr>
                 <w:noProof/>
               </w:rPr>
-              <w:instrText xml:space="preserve"> PAGEREF _Toc241848353 \h </w:instrText>
+              <w:instrText xml:space="preserve"> PAGEREF _Toc242043894 \h </w:instrText>
             </w:r>
             <w:r>
               <w:rPr>
@@ -902,7 +902,7 @@
               <w14:ligatures w14:val="standardContextual"/>
             </w:rPr>
           </w:pPr>
-          <w:hyperlink w:anchor="_Toc241848354" w:history="1">
+          <w:hyperlink w:anchor="_Toc242043895" w:history="1">
             <w:r>
               <w:rPr>
                 <w:rStyle w:val="Hipervnculo"/>
@@ -926,7 +926,7 @@
               <w:rPr>
                 <w:noProof/>
               </w:rPr>
-              <w:instrText xml:space="preserve"> PAGEREF _Toc241848354 \h </w:instrText>
+              <w:instrText xml:space="preserve"> PAGEREF _Toc242043895 \h </w:instrText>
             </w:r>
             <w:r>
               <w:rPr>
@@ -968,7 +968,7 @@
               <w14:ligatures w14:val="standardContextual"/>
             </w:rPr>
           </w:pPr>
-          <w:hyperlink w:anchor="_Toc241848355" w:history="1">
+          <w:hyperlink w:anchor="_Toc242043896" w:history="1">
             <w:r>
               <w:rPr>
                 <w:rStyle w:val="Hipervnculo"/>
@@ -992,7 +992,7 @@
               <w:rPr>
                 <w:noProof/>
               </w:rPr>
-              <w:instrText xml:space="preserve"> PAGEREF _Toc241848355 \h </w:instrText>
+              <w:instrText xml:space="preserve"> PAGEREF _Toc242043896 \h </w:instrText>
             </w:r>
             <w:r>
               <w:rPr>
@@ -1034,7 +1034,7 @@
               <w14:ligatures w14:val="standardContextual"/>
             </w:rPr>
           </w:pPr>
-          <w:hyperlink w:anchor="_Toc241848356" w:history="1">
+          <w:hyperlink w:anchor="_Toc242043897" w:history="1">
             <w:r>
               <w:rPr>
                 <w:rStyle w:val="Hipervnculo"/>
@@ -1058,7 +1058,7 @@
               <w:rPr>
                 <w:noProof/>
               </w:rPr>
-              <w:instrText xml:space="preserve"> PAGEREF _Toc241848356 \h </w:instrText>
+              <w:instrText xml:space="preserve"> PAGEREF _Toc242043897 \h </w:instrText>
             </w:r>
             <w:r>
               <w:rPr>
@@ -1100,7 +1100,7 @@
               <w14:ligatures w14:val="standardContextual"/>
             </w:rPr>
           </w:pPr>
-          <w:hyperlink w:anchor="_Toc241848357" w:history="1">
+          <w:hyperlink w:anchor="_Toc242043898" w:history="1">
             <w:r>
               <w:rPr>
                 <w:rStyle w:val="Hipervnculo"/>
@@ -1124,7 +1124,7 @@
               <w:rPr>
                 <w:noProof/>
               </w:rPr>
-              <w:instrText xml:space="preserve"> PAGEREF _Toc241848357 \h </w:instrText>
+              <w:instrText xml:space="preserve"> PAGEREF _Toc242043898 \h </w:instrText>
             </w:r>
             <w:r>
               <w:rPr>
@@ -1166,7 +1166,7 @@
               <w14:ligatures w14:val="standardContextual"/>
             </w:rPr>
           </w:pPr>
-          <w:hyperlink w:anchor="_Toc241848358" w:history="1">
+          <w:hyperlink w:anchor="_Toc242043899" w:history="1">
             <w:r>
               <w:rPr>
                 <w:rStyle w:val="Hipervnculo"/>
@@ -1190,7 +1190,7 @@
               <w:rPr>
                 <w:noProof/>
               </w:rPr>
-              <w:instrText xml:space="preserve"> PAGEREF _Toc241848358 \h </w:instrText>
+              <w:instrText xml:space="preserve"> PAGEREF _Toc242043899 \h </w:instrText>
             </w:r>
             <w:r>
               <w:rPr>
@@ -1232,7 +1232,7 @@
               <w14:ligatures w14:val="standardContextual"/>
             </w:rPr>
           </w:pPr>
-          <w:hyperlink w:anchor="_Toc241848359" w:history="1">
+          <w:hyperlink w:anchor="_Toc242043900" w:history="1">
             <w:r>
               <w:rPr>
                 <w:rStyle w:val="Hipervnculo"/>
@@ -1256,7 +1256,7 @@
               <w:rPr>
                 <w:noProof/>
               </w:rPr>
-              <w:instrText xml:space="preserve"> PAGEREF _Toc241848359 \h </w:instrText>
+              <w:instrText xml:space="preserve"> PAGEREF _Toc242043900 \h </w:instrText>
             </w:r>
             <w:r>
               <w:rPr>
@@ -1298,7 +1298,7 @@
               <w14:ligatures w14:val="standardContextual"/>
             </w:rPr>
           </w:pPr>
-          <w:hyperlink w:anchor="_Toc241848360" w:history="1">
+          <w:hyperlink w:anchor="_Toc242043901" w:history="1">
             <w:r>
               <w:rPr>
                 <w:rStyle w:val="Hipervnculo"/>
@@ -1322,7 +1322,7 @@
               <w:rPr>
                 <w:noProof/>
               </w:rPr>
-              <w:instrText xml:space="preserve"> PAGEREF _Toc241848360 \h </w:instrText>
+              <w:instrText xml:space="preserve"> PAGEREF _Toc242043901 \h </w:instrText>
             </w:r>
             <w:r>
               <w:rPr>
@@ -1364,7 +1364,7 @@
               <w14:ligatures w14:val="standardContextual"/>
             </w:rPr>
           </w:pPr>
-          <w:hyperlink w:anchor="_Toc241848361" w:history="1">
+          <w:hyperlink w:anchor="_Toc242043902" w:history="1">
             <w:r>
               <w:rPr>
                 <w:rStyle w:val="Hipervnculo"/>
@@ -1388,7 +1388,7 @@
               <w:rPr>
                 <w:noProof/>
               </w:rPr>
-              <w:instrText xml:space="preserve"> PAGEREF _Toc241848361 \h </w:instrText>
+              <w:instrText xml:space="preserve"> PAGEREF _Toc242043902 \h </w:instrText>
             </w:r>
             <w:r>
               <w:rPr>
@@ -1430,7 +1430,7 @@
               <w14:ligatures w14:val="standardContextual"/>
             </w:rPr>
           </w:pPr>
-          <w:hyperlink w:anchor="_Toc241848362" w:history="1">
+          <w:hyperlink w:anchor="_Toc242043903" w:history="1">
             <w:r>
               <w:rPr>
                 <w:rStyle w:val="Hipervnculo"/>
@@ -1454,7 +1454,7 @@
               <w:rPr>
                 <w:noProof/>
               </w:rPr>
-              <w:instrText xml:space="preserve"> PAGEREF _Toc241848362 \h </w:instrText>
+              <w:instrText xml:space="preserve"> PAGEREF _Toc242043903 \h </w:instrText>
             </w:r>
             <w:r>
               <w:rPr>
@@ -1496,7 +1496,7 @@
               <w14:ligatures w14:val="standardContextual"/>
             </w:rPr>
           </w:pPr>
-          <w:hyperlink w:anchor="_Toc241848363" w:history="1">
+          <w:hyperlink w:anchor="_Toc242043904" w:history="1">
             <w:r>
               <w:rPr>
                 <w:rStyle w:val="Hipervnculo"/>
@@ -1520,7 +1520,7 @@
               <w:rPr>
                 <w:noProof/>
               </w:rPr>
-              <w:instrText xml:space="preserve"> PAGEREF _Toc241848363 \h </w:instrText>
+              <w:instrText xml:space="preserve"> PAGEREF _Toc242043904 \h </w:instrText>
             </w:r>
             <w:r>
               <w:rPr>
@@ -1562,7 +1562,7 @@
               <w14:ligatures w14:val="standardContextual"/>
             </w:rPr>
           </w:pPr>
-          <w:hyperlink w:anchor="_Toc241848364" w:history="1">
+          <w:hyperlink w:anchor="_Toc242043905" w:history="1">
             <w:r>
               <w:rPr>
                 <w:rStyle w:val="Hipervnculo"/>
@@ -1586,7 +1586,7 @@
               <w:rPr>
                 <w:noProof/>
               </w:rPr>
-              <w:instrText xml:space="preserve"> PAGEREF _Toc241848364 \h </w:instrText>
+              <w:instrText xml:space="preserve"> PAGEREF _Toc242043905 \h </w:instrText>
             </w:r>
             <w:r>
               <w:rPr>
@@ -1628,7 +1628,7 @@
               <w14:ligatures w14:val="standardContextual"/>
             </w:rPr>
           </w:pPr>
-          <w:hyperlink w:anchor="_Toc241848365" w:history="1">
+          <w:hyperlink w:anchor="_Toc242043906" w:history="1">
             <w:r>
               <w:rPr>
                 <w:rStyle w:val="Hipervnculo"/>
@@ -1652,7 +1652,7 @@
               <w:rPr>
                 <w:noProof/>
               </w:rPr>
-              <w:instrText xml:space="preserve"> PAGEREF _Toc241848365 \h </w:instrText>
+              <w:instrText xml:space="preserve"> PAGEREF _Toc242043906 \h </w:instrText>
             </w:r>
             <w:r>
               <w:rPr>
@@ -1694,7 +1694,7 @@
               <w14:ligatures w14:val="standardContextual"/>
             </w:rPr>
           </w:pPr>
-          <w:hyperlink w:anchor="_Toc241848366" w:history="1">
+          <w:hyperlink w:anchor="_Toc242043907" w:history="1">
             <w:r>
               <w:rPr>
                 <w:rStyle w:val="Hipervnculo"/>
@@ -1718,7 +1718,7 @@
               <w:rPr>
                 <w:noProof/>
               </w:rPr>
-              <w:instrText xml:space="preserve"> PAGEREF _Toc241848366 \h </w:instrText>
+              <w:instrText xml:space="preserve"> PAGEREF _Toc242043907 \h </w:instrText>
             </w:r>
             <w:r>
               <w:rPr>
@@ -1760,7 +1760,7 @@
               <w14:ligatures w14:val="standardContextual"/>
             </w:rPr>
           </w:pPr>
-          <w:hyperlink w:anchor="_Toc241848367" w:history="1">
+          <w:hyperlink w:anchor="_Toc242043908" w:history="1">
             <w:r>
               <w:rPr>
                 <w:rStyle w:val="Hipervnculo"/>
@@ -1784,7 +1784,7 @@
               <w:rPr>
                 <w:noProof/>
               </w:rPr>
-              <w:instrText xml:space="preserve"> PAGEREF _Toc241848367 \h </w:instrText>
+              <w:instrText xml:space="preserve"> PAGEREF _Toc242043908 \h </w:instrText>
             </w:r>
             <w:r>
               <w:rPr>
@@ -1826,7 +1826,7 @@
               <w14:ligatures w14:val="standardContextual"/>
             </w:rPr>
           </w:pPr>
-          <w:hyperlink w:anchor="_Toc241848368" w:history="1">
+          <w:hyperlink w:anchor="_Toc242043909" w:history="1">
             <w:r>
               <w:rPr>
                 <w:rStyle w:val="Hipervnculo"/>
@@ -1850,7 +1850,7 @@
               <w:rPr>
                 <w:noProof/>
               </w:rPr>
-              <w:instrText xml:space="preserve"> PAGEREF _Toc241848368 \h </w:instrText>
+              <w:instrText xml:space="preserve"> PAGEREF _Toc242043909 \h </w:instrText>
             </w:r>
             <w:r>
               <w:rPr>
@@ -1892,7 +1892,7 @@
               <w14:ligatures w14:val="standardContextual"/>
             </w:rPr>
           </w:pPr>
-          <w:hyperlink w:anchor="_Toc241848369" w:history="1">
+          <w:hyperlink w:anchor="_Toc242043910" w:history="1">
             <w:r>
               <w:rPr>
                 <w:rStyle w:val="Hipervnculo"/>
@@ -1916,7 +1916,7 @@
               <w:rPr>
                 <w:noProof/>
               </w:rPr>
-              <w:instrText xml:space="preserve"> PAGEREF _Toc241848369 \h </w:instrText>
+              <w:instrText xml:space="preserve"> PAGEREF _Toc242043910 \h </w:instrText>
             </w:r>
             <w:r>
               <w:rPr>
@@ -1958,7 +1958,7 @@
               <w14:ligatures w14:val="standardContextual"/>
             </w:rPr>
           </w:pPr>
-          <w:hyperlink w:anchor="_Toc241848370" w:history="1">
+          <w:hyperlink w:anchor="_Toc242043911" w:history="1">
             <w:r>
               <w:rPr>
                 <w:rStyle w:val="Hipervnculo"/>
@@ -1982,7 +1982,7 @@
               <w:rPr>
                 <w:noProof/>
               </w:rPr>
-              <w:instrText xml:space="preserve"> PAGEREF _Toc241848370 \h </w:instrText>
+              <w:instrText xml:space="preserve"> PAGEREF _Toc242043911 \h </w:instrText>
             </w:r>
             <w:r>
               <w:rPr>
@@ -2024,7 +2024,7 @@
               <w14:ligatures w14:val="standardContextual"/>
             </w:rPr>
           </w:pPr>
-          <w:hyperlink w:anchor="_Toc241848371" w:history="1">
+          <w:hyperlink w:anchor="_Toc242043912" w:history="1">
             <w:r>
               <w:rPr>
                 <w:rStyle w:val="Hipervnculo"/>
@@ -2048,7 +2048,7 @@
               <w:rPr>
                 <w:noProof/>
               </w:rPr>
-              <w:instrText xml:space="preserve"> PAGEREF _Toc241848371 \h </w:instrText>
+              <w:instrText xml:space="preserve"> PAGEREF _Toc242043912 \h </w:instrText>
             </w:r>
             <w:r>
               <w:rPr>
@@ -2090,7 +2090,7 @@
               <w14:ligatures w14:val="standardContextual"/>
             </w:rPr>
           </w:pPr>
-          <w:hyperlink w:anchor="_Toc241848372" w:history="1">
+          <w:hyperlink w:anchor="_Toc242043913" w:history="1">
             <w:r>
               <w:rPr>
                 <w:rStyle w:val="Hipervnculo"/>
@@ -2114,7 +2114,7 @@
               <w:rPr>
                 <w:noProof/>
               </w:rPr>
-              <w:instrText xml:space="preserve"> PAGEREF _Toc241848372 \h </w:instrText>
+              <w:instrText xml:space="preserve"> PAGEREF _Toc242043913 \h </w:instrText>
             </w:r>
             <w:r>
               <w:rPr>
@@ -2156,7 +2156,7 @@
               <w14:ligatures w14:val="standardContextual"/>
             </w:rPr>
           </w:pPr>
-          <w:hyperlink w:anchor="_Toc241848373" w:history="1">
+          <w:hyperlink w:anchor="_Toc242043914" w:history="1">
             <w:r>
               <w:rPr>
                 <w:rStyle w:val="Hipervnculo"/>
@@ -2180,7 +2180,7 @@
               <w:rPr>
                 <w:noProof/>
               </w:rPr>
-              <w:instrText xml:space="preserve"> PAGEREF _Toc241848373 \h </w:instrText>
+              <w:instrText xml:space="preserve"> PAGEREF _Toc242043914 \h </w:instrText>
             </w:r>
             <w:r>
               <w:rPr>
@@ -2222,7 +2222,7 @@
               <w14:ligatures w14:val="standardContextual"/>
             </w:rPr>
           </w:pPr>
-          <w:hyperlink w:anchor="_Toc241848374" w:history="1">
+          <w:hyperlink w:anchor="_Toc242043915" w:history="1">
             <w:r>
               <w:rPr>
                 <w:rStyle w:val="Hipervnculo"/>
@@ -2246,7 +2246,7 @@
               <w:rPr>
                 <w:noProof/>
               </w:rPr>
-              <w:instrText xml:space="preserve"> PAGEREF _Toc241848374 \h </w:instrText>
+              <w:instrText xml:space="preserve"> PAGEREF _Toc242043915 \h </w:instrText>
             </w:r>
             <w:r>
               <w:rPr>
@@ -2288,7 +2288,7 @@
               <w14:ligatures w14:val="standardContextual"/>
             </w:rPr>
           </w:pPr>
-          <w:hyperlink w:anchor="_Toc241848375" w:history="1">
+          <w:hyperlink w:anchor="_Toc242043916" w:history="1">
             <w:r>
               <w:rPr>
                 <w:rStyle w:val="Hipervnculo"/>
@@ -2312,7 +2312,7 @@
               <w:rPr>
                 <w:noProof/>
               </w:rPr>
-              <w:instrText xml:space="preserve"> PAGEREF _Toc241848375 \h </w:instrText>
+              <w:instrText xml:space="preserve"> PAGEREF _Toc242043916 \h </w:instrText>
             </w:r>
             <w:r>
               <w:rPr>
@@ -2354,7 +2354,7 @@
               <w14:ligatures w14:val="standardContextual"/>
             </w:rPr>
           </w:pPr>
-          <w:hyperlink w:anchor="_Toc241848376" w:history="1">
+          <w:hyperlink w:anchor="_Toc242043917" w:history="1">
             <w:r>
               <w:rPr>
                 <w:rStyle w:val="Hipervnculo"/>
@@ -2378,7 +2378,7 @@
               <w:rPr>
                 <w:noProof/>
               </w:rPr>
-              <w:instrText xml:space="preserve"> PAGEREF _Toc241848376 \h </w:instrText>
+              <w:instrText xml:space="preserve"> PAGEREF _Toc242043917 \h </w:instrText>
             </w:r>
             <w:r>
               <w:rPr>
@@ -2420,7 +2420,7 @@
               <w14:ligatures w14:val="standardContextual"/>
             </w:rPr>
           </w:pPr>
-          <w:hyperlink w:anchor="_Toc241848377" w:history="1">
+          <w:hyperlink w:anchor="_Toc242043918" w:history="1">
             <w:r>
               <w:rPr>
                 <w:rStyle w:val="Hipervnculo"/>
@@ -2444,7 +2444,7 @@
               <w:rPr>
                 <w:noProof/>
               </w:rPr>
-              <w:instrText xml:space="preserve"> PAGEREF _Toc241848377 \h </w:instrText>
+              <w:instrText xml:space="preserve"> PAGEREF _Toc242043918 \h </w:instrText>
             </w:r>
             <w:r>
               <w:rPr>
@@ -2486,7 +2486,7 @@
               <w14:ligatures w14:val="standardContextual"/>
             </w:rPr>
           </w:pPr>
-          <w:hyperlink w:anchor="_Toc241848378" w:history="1">
+          <w:hyperlink w:anchor="_Toc242043919" w:history="1">
             <w:r>
               <w:rPr>
                 <w:rStyle w:val="Hipervnculo"/>
@@ -2510,7 +2510,7 @@
               <w:rPr>
                 <w:noProof/>
               </w:rPr>
-              <w:instrText xml:space="preserve"> PAGEREF _Toc241848378 \h </w:instrText>
+              <w:instrText xml:space="preserve"> PAGEREF _Toc242043919 \h </w:instrText>
             </w:r>
             <w:r>
               <w:rPr>
@@ -2552,7 +2552,7 @@
               <w14:ligatures w14:val="standardContextual"/>
             </w:rPr>
           </w:pPr>
-          <w:hyperlink w:anchor="_Toc241848379" w:history="1">
+          <w:hyperlink w:anchor="_Toc242043920" w:history="1">
             <w:r>
               <w:rPr>
                 <w:rStyle w:val="Hipervnculo"/>
@@ -2576,7 +2576,7 @@
               <w:rPr>
                 <w:noProof/>
               </w:rPr>
-              <w:instrText xml:space="preserve"> PAGEREF _Toc241848379 \h </w:instrText>
+              <w:instrText xml:space="preserve"> PAGEREF _Toc242043920 \h </w:instrText>
             </w:r>
             <w:r>
               <w:rPr>
@@ -2618,7 +2618,7 @@
               <w14:ligatures w14:val="standardContextual"/>
             </w:rPr>
           </w:pPr>
-          <w:hyperlink w:anchor="_Toc241848380" w:history="1">
+          <w:hyperlink w:anchor="_Toc242043921" w:history="1">
             <w:r>
               <w:rPr>
                 <w:rStyle w:val="Hipervnculo"/>
@@ -2642,7 +2642,7 @@
               <w:rPr>
                 <w:noProof/>
               </w:rPr>
-              <w:instrText xml:space="preserve"> PAGEREF _Toc241848380 \h </w:instrText>
+              <w:instrText xml:space="preserve"> PAGEREF _Toc242043921 \h </w:instrText>
             </w:r>
             <w:r>
               <w:rPr>
@@ -2684,7 +2684,7 @@
               <w14:ligatures w14:val="standardContextual"/>
             </w:rPr>
           </w:pPr>
-          <w:hyperlink w:anchor="_Toc241848381" w:history="1">
+          <w:hyperlink w:anchor="_Toc242043922" w:history="1">
             <w:r>
               <w:rPr>
                 <w:rStyle w:val="Hipervnculo"/>
@@ -2708,7 +2708,7 @@
               <w:rPr>
                 <w:noProof/>
               </w:rPr>
-              <w:instrText xml:space="preserve"> PAGEREF _Toc241848381 \h </w:instrText>
+              <w:instrText xml:space="preserve"> PAGEREF _Toc242043922 \h </w:instrText>
             </w:r>
             <w:r>
               <w:rPr>
@@ -2747,7 +2747,7 @@
         <w:pStyle w:val="Ttulo1"/>
         <w:pageBreakBefore/>
       </w:pPr>
-      <w:bookmarkStart w:id="0" w:name="_Toc241848352"/>
+      <w:bookmarkStart w:id="0" w:name="_Toc242043893"/>
       <w:r>
         <w:t>1. Descripción de la solución</w:t>
       </w:r>
@@ -2757,7 +2757,7 @@
       <w:pPr>
         <w:pStyle w:val="Ttulo2"/>
       </w:pPr>
-      <w:bookmarkStart w:id="1" w:name="_Toc241848353"/>
+      <w:bookmarkStart w:id="1" w:name="_Toc242043894"/>
       <w:r>
         <w:t>1.1 Problema que resuelve</w:t>
       </w:r>
@@ -2825,7 +2825,7 @@
       <w:pPr>
         <w:pStyle w:val="Ttulo2"/>
       </w:pPr>
-      <w:bookmarkStart w:id="2" w:name="_Toc241848354"/>
+      <w:bookmarkStart w:id="2" w:name="_Toc242043895"/>
       <w:r>
         <w:t>1.2 Usuarios y roles de negocio</w:t>
       </w:r>
@@ -3277,7 +3277,7 @@
       <w:pPr>
         <w:pStyle w:val="Ttulo2"/>
       </w:pPr>
-      <w:bookmarkStart w:id="3" w:name="_Toc241848355"/>
+      <w:bookmarkStart w:id="3" w:name="_Toc242043896"/>
       <w:r>
         <w:t>1.3 Requerimientos (ingeniería de software — criterio 4.1.1)</w:t>
       </w:r>
@@ -4788,7 +4788,7 @@
       <w:pPr>
         <w:pStyle w:val="Ttulo2"/>
       </w:pPr>
-      <w:bookmarkStart w:id="4" w:name="_Toc241848356"/>
+      <w:bookmarkStart w:id="4" w:name="_Toc242043897"/>
       <w:r>
         <w:t>1.4 Selección de la tecnología cloud (criterio 4.1.2)</w:t>
       </w:r>
@@ -5685,7 +5685,7 @@
       <w:pPr>
         <w:pStyle w:val="Ttulo2"/>
       </w:pPr>
-      <w:bookmarkStart w:id="5" w:name="_Toc241848357"/>
+      <w:bookmarkStart w:id="5" w:name="_Toc242043898"/>
       <w:r>
         <w:t>1.5 Formación de roles del equipo</w:t>
       </w:r>
@@ -6242,7 +6242,7 @@
         <w:pStyle w:val="Ttulo1"/>
         <w:pageBreakBefore/>
       </w:pPr>
-      <w:bookmarkStart w:id="6" w:name="_Toc241848358"/>
+      <w:bookmarkStart w:id="6" w:name="_Toc242043899"/>
       <w:r>
         <w:t>2. Arquitectura</w:t>
       </w:r>
@@ -6277,7 +6277,7 @@
           <w:noProof/>
         </w:rPr>
         <w:drawing>
-          <wp:inline distT="0" distB="0" distL="0" distR="0" wp14:anchorId="76A57A5E" wp14:editId="45546940">
+          <wp:inline distT="0" distB="0" distL="0" distR="0" wp14:anchorId="4FCB2866" wp14:editId="3FD9A174">
             <wp:extent cx="5905500" cy="3429000"/>
             <wp:effectExtent l="0" t="0" r="0" b="0"/>
             <wp:docPr id="1" name="Imagen 1"/>
@@ -6336,7 +6336,7 @@
       <w:pPr>
         <w:pStyle w:val="Ttulo2"/>
       </w:pPr>
-      <w:bookmarkStart w:id="7" w:name="_Toc241848359"/>
+      <w:bookmarkStart w:id="7" w:name="_Toc242043900"/>
       <w:r>
         <w:t>2.1 Componentes</w:t>
       </w:r>
@@ -7056,7 +7056,7 @@
                 <w:sz w:val="18"/>
                 <w:szCs w:val="18"/>
               </w:rPr>
-              <w:t>GitHub (repositorio privado)</w:t>
+              <w:t>GitHub (repositorio público para evaluación)</w:t>
             </w:r>
           </w:p>
         </w:tc>
@@ -7097,7 +7097,7 @@
       <w:pPr>
         <w:pStyle w:val="Ttulo2"/>
       </w:pPr>
-      <w:bookmarkStart w:id="8" w:name="_Toc241848360"/>
+      <w:bookmarkStart w:id="8" w:name="_Toc242043901"/>
       <w:r>
         <w:t>2.2 Configuración aplicada en Railway</w:t>
       </w:r>
@@ -8268,7 +8268,7 @@
       <w:pPr>
         <w:pStyle w:val="Ttulo2"/>
       </w:pPr>
-      <w:bookmarkStart w:id="9" w:name="_Toc241848361"/>
+      <w:bookmarkStart w:id="9" w:name="_Toc242043902"/>
       <w:r>
         <w:t>2.3 Modelo de responsabilidad compartida</w:t>
       </w:r>
@@ -9515,7 +9515,7 @@
         <w:pStyle w:val="Ttulo1"/>
         <w:pageBreakBefore/>
       </w:pPr>
-      <w:bookmarkStart w:id="10" w:name="_Toc241848362"/>
+      <w:bookmarkStart w:id="10" w:name="_Toc242043903"/>
       <w:r>
         <w:t>3. Matriz de riesgos</w:t>
       </w:r>
@@ -12428,7 +12428,7 @@
                 <w:sz w:val="15"/>
                 <w:szCs w:val="15"/>
               </w:rPr>
-              <w:t>Secretos y clave de cuenta de servicio Firebase solo en variables de Railway (fuera del repositorio); .gitignore; repo privado; contraseñas fuera de logs</w:t>
+              <w:t>Secretos y clave de cuenta de servicio Firebase solo en variables de Railway (fuera del repositorio); .gitignore; repositorio sin secretos (historial completo verificado antes de publicarlo); contraseñas fuera de logs</w:t>
             </w:r>
           </w:p>
         </w:tc>
@@ -13648,7 +13648,7 @@
                 <w:sz w:val="15"/>
                 <w:szCs w:val="15"/>
               </w:rPr>
-              <w:t>Roles de proyecto mínimos (Viewer/Editor); Owner reservado; repositorio privado. Pendiente: activar 2FA en cuentas Railway/GitHub/Google del equipo</w:t>
+              <w:t>Roles de proyecto mínimos (Viewer/Editor); Owner reservado; solo el titular puede escribir en el repositorio (público para evaluación). Pendiente: activar 2FA en cuentas Railway/GitHub/Google del equipo</w:t>
             </w:r>
           </w:p>
         </w:tc>
@@ -14466,7 +14466,7 @@
         <w:pStyle w:val="Ttulo1"/>
         <w:pageBreakBefore/>
       </w:pPr>
-      <w:bookmarkStart w:id="11" w:name="_Toc241848363"/>
+      <w:bookmarkStart w:id="11" w:name="_Toc242043904"/>
       <w:r>
         <w:t>4. Configuración IAM</w:t>
       </w:r>
@@ -14505,7 +14505,7 @@
       <w:pPr>
         <w:pStyle w:val="Ttulo2"/>
       </w:pPr>
-      <w:bookmarkStart w:id="12" w:name="_Toc241848364"/>
+      <w:bookmarkStart w:id="12" w:name="_Toc242043905"/>
       <w:r>
         <w:t>4.1 Nivel plataforma (Railway y GitHub)</w:t>
       </w:r>
@@ -15394,7 +15394,7 @@
       <w:pPr>
         <w:pStyle w:val="Ttulo2"/>
       </w:pPr>
-      <w:bookmarkStart w:id="13" w:name="_Toc241848365"/>
+      <w:bookmarkStart w:id="13" w:name="_Toc242043906"/>
       <w:r>
         <w:t>4.2 Nivel aplicación: RBAC</w:t>
       </w:r>
@@ -16847,7 +16847,7 @@
       <w:pPr>
         <w:pStyle w:val="Ttulo2"/>
       </w:pPr>
-      <w:bookmarkStart w:id="14" w:name="_Toc241848366"/>
+      <w:bookmarkStart w:id="14" w:name="_Toc242043907"/>
       <w:r>
         <w:t>4.3 Políticas de autenticación y sesión</w:t>
       </w:r>
@@ -17914,7 +17914,7 @@
       <w:pPr>
         <w:pStyle w:val="Ttulo2"/>
       </w:pPr>
-      <w:bookmarkStart w:id="15" w:name="_Toc241848367"/>
+      <w:bookmarkStart w:id="15" w:name="_Toc242043908"/>
       <w:r>
         <w:t>4.4 Autenticación de doble factor con Firebase</w:t>
       </w:r>
@@ -18726,7 +18726,7 @@
           <w:noProof/>
         </w:rPr>
         <w:drawing>
-          <wp:inline distT="0" distB="0" distL="0" distR="0" wp14:anchorId="525694E4" wp14:editId="5E9AC418">
+          <wp:inline distT="0" distB="0" distL="0" distR="0" wp14:anchorId="1B13B529" wp14:editId="5E19AD73">
             <wp:extent cx="4953000" cy="2905125"/>
             <wp:effectExtent l="0" t="0" r="0" b="0"/>
             <wp:docPr id="2" name="Imagen 2"/>
@@ -18791,7 +18791,7 @@
           <w:noProof/>
         </w:rPr>
         <w:drawing>
-          <wp:inline distT="0" distB="0" distL="0" distR="0" wp14:anchorId="7261C1AE" wp14:editId="2B501ECF">
+          <wp:inline distT="0" distB="0" distL="0" distR="0" wp14:anchorId="1A200087" wp14:editId="58C0F629">
             <wp:extent cx="4953000" cy="2905125"/>
             <wp:effectExtent l="0" t="0" r="0" b="0"/>
             <wp:docPr id="3" name="Imagen 3"/>
@@ -18867,7 +18867,7 @@
         <w:pStyle w:val="Ttulo1"/>
         <w:pageBreakBefore/>
       </w:pPr>
-      <w:bookmarkStart w:id="16" w:name="_Toc241848368"/>
+      <w:bookmarkStart w:id="16" w:name="_Toc242043909"/>
       <w:r>
         <w:t>5. Seguridad de red y hardening</w:t>
       </w:r>
@@ -18877,7 +18877,7 @@
       <w:pPr>
         <w:pStyle w:val="Ttulo2"/>
       </w:pPr>
-      <w:bookmarkStart w:id="17" w:name="_Toc241848369"/>
+      <w:bookmarkStart w:id="17" w:name="_Toc242043910"/>
       <w:r>
         <w:t>5.1 Segmentación</w:t>
       </w:r>
@@ -19474,7 +19474,7 @@
       <w:pPr>
         <w:pStyle w:val="Ttulo2"/>
       </w:pPr>
-      <w:bookmarkStart w:id="18" w:name="_Toc241848370"/>
+      <w:bookmarkStart w:id="18" w:name="_Toc242043911"/>
       <w:r>
         <w:t>5.2 Medidas de endurecimiento aplicadas</w:t>
       </w:r>
@@ -20296,7 +20296,7 @@
                 <w:sz w:val="18"/>
                 <w:szCs w:val="18"/>
               </w:rPr>
-              <w:t>Variables de Railway (cifradas); .gitignore; repositorio privado; nada sensible en logs</w:t>
+              <w:t>Variables de Railway (cifradas); .gitignore; repositorio público sin secretos (historial verificado); nada sensible en logs</w:t>
             </w:r>
           </w:p>
         </w:tc>
@@ -20541,7 +20541,7 @@
       <w:pPr>
         <w:pStyle w:val="Ttulo2"/>
       </w:pPr>
-      <w:bookmarkStart w:id="19" w:name="_Toc241848371"/>
+      <w:bookmarkStart w:id="19" w:name="_Toc242043912"/>
       <w:r>
         <w:t>5.3 Registro de eventos (logging)</w:t>
       </w:r>
@@ -20576,7 +20576,7 @@
           <w:noProof/>
         </w:rPr>
         <w:drawing>
-          <wp:inline distT="0" distB="0" distL="0" distR="0" wp14:anchorId="3BBAA292" wp14:editId="01FB9DCC">
+          <wp:inline distT="0" distB="0" distL="0" distR="0" wp14:anchorId="7DB068CB" wp14:editId="73B13525">
             <wp:extent cx="5715000" cy="3343275"/>
             <wp:effectExtent l="0" t="0" r="0" b="0"/>
             <wp:docPr id="4" name="Imagen 4"/>
@@ -20636,7 +20636,7 @@
         <w:pStyle w:val="Ttulo1"/>
         <w:pageBreakBefore/>
       </w:pPr>
-      <w:bookmarkStart w:id="20" w:name="_Toc241848372"/>
+      <w:bookmarkStart w:id="20" w:name="_Toc242043913"/>
       <w:r>
         <w:t>6. Pruebas de disponibilidad y validación de seguridad</w:t>
       </w:r>
@@ -20675,7 +20675,7 @@
       <w:pPr>
         <w:pStyle w:val="Ttulo2"/>
       </w:pPr>
-      <w:bookmarkStart w:id="21" w:name="_Toc241848373"/>
+      <w:bookmarkStart w:id="21" w:name="_Toc242043914"/>
       <w:r>
         <w:t>6.1 Resumen de resultados</w:t>
       </w:r>
@@ -22222,7 +22222,7 @@
       <w:pPr>
         <w:pStyle w:val="Ttulo2"/>
       </w:pPr>
-      <w:bookmarkStart w:id="22" w:name="_Toc241848374"/>
+      <w:bookmarkStart w:id="22" w:name="_Toc242043915"/>
       <w:r>
         <w:t>6.2 Pruebas de disponibilidad</w:t>
       </w:r>
@@ -23082,7 +23082,7 @@
       <w:pPr>
         <w:pStyle w:val="Ttulo2"/>
       </w:pPr>
-      <w:bookmarkStart w:id="23" w:name="_Toc241848375"/>
+      <w:bookmarkStart w:id="23" w:name="_Toc242043916"/>
       <w:r>
         <w:t>6.3 Detalle de pruebas de seguridad en producción</w:t>
       </w:r>
@@ -28912,7 +28912,7 @@
       <w:pPr>
         <w:pStyle w:val="Ttulo2"/>
       </w:pPr>
-      <w:bookmarkStart w:id="24" w:name="_Toc241848376"/>
+      <w:bookmarkStart w:id="24" w:name="_Toc242043917"/>
       <w:r>
         <w:t>6.4 Evidencia visual</w:t>
       </w:r>
@@ -28928,7 +28928,7 @@
           <w:noProof/>
         </w:rPr>
         <w:drawing>
-          <wp:inline distT="0" distB="0" distL="0" distR="0" wp14:anchorId="2CE15E06" wp14:editId="5CE0C786">
+          <wp:inline distT="0" distB="0" distL="0" distR="0" wp14:anchorId="7050C0F4" wp14:editId="65073BDC">
             <wp:extent cx="5334000" cy="3124200"/>
             <wp:effectExtent l="0" t="0" r="0" b="0"/>
             <wp:docPr id="5" name="Imagen 5"/>
@@ -28993,7 +28993,7 @@
           <w:noProof/>
         </w:rPr>
         <w:drawing>
-          <wp:inline distT="0" distB="0" distL="0" distR="0" wp14:anchorId="36534B21" wp14:editId="3475F699">
+          <wp:inline distT="0" distB="0" distL="0" distR="0" wp14:anchorId="6190646D" wp14:editId="7B698CF3">
             <wp:extent cx="5334000" cy="3124200"/>
             <wp:effectExtent l="0" t="0" r="0" b="0"/>
             <wp:docPr id="6" name="Imagen 6"/>
@@ -29058,7 +29058,7 @@
           <w:noProof/>
         </w:rPr>
         <w:drawing>
-          <wp:inline distT="0" distB="0" distL="0" distR="0" wp14:anchorId="2C821B9B" wp14:editId="1669E2DA">
+          <wp:inline distT="0" distB="0" distL="0" distR="0" wp14:anchorId="1B5140F0" wp14:editId="1734F801">
             <wp:extent cx="5334000" cy="3124200"/>
             <wp:effectExtent l="0" t="0" r="0" b="0"/>
             <wp:docPr id="7" name="Imagen 7"/>
@@ -29123,7 +29123,7 @@
           <w:noProof/>
         </w:rPr>
         <w:drawing>
-          <wp:inline distT="0" distB="0" distL="0" distR="0" wp14:anchorId="77307AFE" wp14:editId="19EB4C26">
+          <wp:inline distT="0" distB="0" distL="0" distR="0" wp14:anchorId="661AF668" wp14:editId="336BEEE4">
             <wp:extent cx="5334000" cy="3124200"/>
             <wp:effectExtent l="0" t="0" r="0" b="0"/>
             <wp:docPr id="8" name="Imagen 8"/>
@@ -29188,7 +29188,7 @@
           <w:noProof/>
         </w:rPr>
         <w:drawing>
-          <wp:inline distT="0" distB="0" distL="0" distR="0" wp14:anchorId="72D51A9A" wp14:editId="746A8D1D">
+          <wp:inline distT="0" distB="0" distL="0" distR="0" wp14:anchorId="4EB86503" wp14:editId="1308092C">
             <wp:extent cx="5334000" cy="3124200"/>
             <wp:effectExtent l="0" t="0" r="0" b="0"/>
             <wp:docPr id="9" name="Imagen 9"/>
@@ -29253,7 +29253,7 @@
           <w:noProof/>
         </w:rPr>
         <w:drawing>
-          <wp:inline distT="0" distB="0" distL="0" distR="0" wp14:anchorId="36B48573" wp14:editId="4670669E">
+          <wp:inline distT="0" distB="0" distL="0" distR="0" wp14:anchorId="365491BC" wp14:editId="6567AE57">
             <wp:extent cx="5334000" cy="3124200"/>
             <wp:effectExtent l="0" t="0" r="0" b="0"/>
             <wp:docPr id="10" name="Imagen 10"/>
@@ -29313,7 +29313,7 @@
         <w:pStyle w:val="Ttulo1"/>
         <w:pageBreakBefore/>
       </w:pPr>
-      <w:bookmarkStart w:id="25" w:name="_Toc241848377"/>
+      <w:bookmarkStart w:id="25" w:name="_Toc242043918"/>
       <w:r>
         <w:t>7. Conclusiones</w:t>
       </w:r>
@@ -29323,7 +29323,7 @@
       <w:pPr>
         <w:pStyle w:val="Ttulo2"/>
       </w:pPr>
-      <w:bookmarkStart w:id="26" w:name="_Toc241848378"/>
+      <w:bookmarkStart w:id="26" w:name="_Toc242043919"/>
       <w:r>
         <w:t>7.1 Evaluación de la seguridad de la solución (criterio 4.1.6)</w:t>
       </w:r>
@@ -30312,7 +30312,7 @@
       <w:pPr>
         <w:pStyle w:val="Ttulo2"/>
       </w:pPr>
-      <w:bookmarkStart w:id="27" w:name="_Toc241848379"/>
+      <w:bookmarkStart w:id="27" w:name="_Toc242043920"/>
       <w:r>
         <w:t>7.2 Aprendizajes del equipo</w:t>
       </w:r>
@@ -30422,7 +30422,7 @@
       <w:pPr>
         <w:pStyle w:val="Ttulo2"/>
       </w:pPr>
-      <w:bookmarkStart w:id="28" w:name="_Toc241848380"/>
+      <w:bookmarkStart w:id="28" w:name="_Toc242043921"/>
       <w:r>
         <w:t>7.3 Mejoras futuras</w:t>
       </w:r>
@@ -31490,7 +31490,7 @@
         <w:pStyle w:val="Ttulo1"/>
         <w:pageBreakBefore/>
       </w:pPr>
-      <w:bookmarkStart w:id="29" w:name="_Toc241848381"/>
+      <w:bookmarkStart w:id="29" w:name="_Toc242043922"/>
       <w:r>
         <w:t>Anexo A. Estructura del repositorio y reproducción</w:t>
       </w:r>
@@ -32871,64 +32871,10 @@
 <file path=word/numbering.xml><?xml version="1.0" encoding="utf-8"?>
 <w:numbering xmlns:wpc="http://schemas.microsoft.com/office/word/2010/wordprocessingCanvas" xmlns:cx="http://schemas.microsoft.com/office/drawing/2014/chartex" xmlns:cx1="http://schemas.microsoft.com/office/drawing/2015/9/8/chartex" xmlns:cx2="http://schemas.microsoft.com/office/drawing/2015/10/21/chartex" xmlns:cx3="http://schemas.microsoft.com/office/drawing/2016/5/9/chartex" xmlns:cx4="http://schemas.microsoft.com/office/drawing/2016/5/10/chartex" xmlns:cx5="http://schemas.microsoft.com/office/drawing/2016/5/11/chartex" xmlns:cx6="http://schemas.microsoft.com/office/drawing/2016/5/12/chartex" xmlns:cx7="http://schemas.microsoft.com/office/drawing/2016/5/13/chartex" xmlns:cx8="http://schemas.microsoft.com/office/drawing/2016/5/14/chartex" xmlns:mc="http://schemas.openxmlformats.org/markup-compatibility/2006" xmlns:aink="http://schemas.microsoft.com/office/drawing/2016/ink" xmlns:am3d="http://schemas.microsoft.com/office/drawing/2017/model3d" xmlns:o="urn:schemas-microsoft-com:office:office" xmlns:oel="http://schemas.microsoft.com/office/2019/extlst" xmlns:r="http://schemas.openxmlformats.org/officeDocument/2006/relationships" xmlns:m="http://schemas.openxmlformats.org/officeDocument/2006/math" xmlns:v="urn:schemas-microsoft-com:vml" xmlns:wp14="http://schemas.microsoft.com/office/word/2010/wordprocessingDrawing" xmlns:wp="http://schemas.openxmlformats.org/drawingml/2006/wordprocessingDrawing" xmlns:w10="urn:schemas-microsoft-com:office:word" xmlns:w="http://schemas.openxmlformats.org/wordprocessingml/2006/main" xmlns:w14="http://schemas.microsoft.com/office/word/2010/wordml" xmlns:w15="http://schemas.microsoft.com/office/word/2012/wordml" xmlns:w16cex="http://schemas.microsoft.com/office/word/2018/wordml/cex" xmlns:w16cid="http://schemas.microsoft.com/office/word/2016/wordml/cid" xmlns:w16="http://schemas.microsoft.com/office/word/2018/wordml" xmlns:w16du="http://schemas.microsoft.com/office/word/2023/wordml/word16du" xmlns:w16sdtdh="http://schemas.microsoft.com/office/word/2020/wordml/sdtdatahash" xmlns:w16sdtfl="http://schemas.microsoft.com/office/word/2024/wordml/sdtformatlock" xmlns:w16se="http://schemas.microsoft.com/office/word/2015/wordml/symex" xmlns:wpg="http://schemas.microsoft.com/office/word/2010/wordprocessingGroup" xmlns:wpi="http://schemas.microsoft.com/office/word/2010/wordprocessingInk" xmlns:wne="http://schemas.microsoft.com/office/word/2006/wordml" xmlns:wps="http://schemas.microsoft.com/office/word/2010/wordprocessingShape" mc:Ignorable="w14 w15 w16se w16cid w16 w16cex w16sdtdh w16sdtfl w16du wp14">
   <w:abstractNum w:abstractNumId="0" w15:restartNumberingAfterBreak="0">
-    <w:nsid w:val="07F44884"/>
+    <w:nsid w:val="1D9F1338"/>
     <w:multiLevelType w:val="hybridMultilevel"/>
-    <w:tmpl w:val="4D588772"/>
-    <w:lvl w:ilvl="0" w:tplc="C80649D0" w:tentative="1">
-      <w:start w:val="1"/>
-      <w:numFmt w:val="decimal"/>
-      <w:lvlText w:val="%1."/>
-      <w:lvlJc w:val="left"/>
-      <w:pPr>
-        <w:ind w:left="540" w:hanging="300"/>
-      </w:pPr>
-    </w:lvl>
-    <w:lvl w:ilvl="1" w:tplc="034847C0">
-      <w:numFmt w:val="decimal"/>
-      <w:lvlText w:val=""/>
-      <w:lvlJc w:val="left"/>
-    </w:lvl>
-    <w:lvl w:ilvl="2" w:tplc="FCA26AC4">
-      <w:numFmt w:val="decimal"/>
-      <w:lvlText w:val=""/>
-      <w:lvlJc w:val="left"/>
-    </w:lvl>
-    <w:lvl w:ilvl="3" w:tplc="609EF86C">
-      <w:numFmt w:val="decimal"/>
-      <w:lvlText w:val=""/>
-      <w:lvlJc w:val="left"/>
-    </w:lvl>
-    <w:lvl w:ilvl="4" w:tplc="D8061ECA">
-      <w:numFmt w:val="decimal"/>
-      <w:lvlText w:val=""/>
-      <w:lvlJc w:val="left"/>
-    </w:lvl>
-    <w:lvl w:ilvl="5" w:tplc="7FB0E05E">
-      <w:numFmt w:val="decimal"/>
-      <w:lvlText w:val=""/>
-      <w:lvlJc w:val="left"/>
-    </w:lvl>
-    <w:lvl w:ilvl="6" w:tplc="0E762A62">
-      <w:numFmt w:val="decimal"/>
-      <w:lvlText w:val=""/>
-      <w:lvlJc w:val="left"/>
-    </w:lvl>
-    <w:lvl w:ilvl="7" w:tplc="78F855B8">
-      <w:numFmt w:val="decimal"/>
-      <w:lvlText w:val=""/>
-      <w:lvlJc w:val="left"/>
-    </w:lvl>
-    <w:lvl w:ilvl="8" w:tplc="E9AACAF4">
-      <w:numFmt w:val="decimal"/>
-      <w:lvlText w:val=""/>
-      <w:lvlJc w:val="left"/>
-    </w:lvl>
-  </w:abstractNum>
-  <w:abstractNum w:abstractNumId="1" w15:restartNumberingAfterBreak="0">
-    <w:nsid w:val="48425D3D"/>
-    <w:multiLevelType w:val="hybridMultilevel"/>
-    <w:tmpl w:val="B0BC8D74"/>
-    <w:lvl w:ilvl="0" w:tplc="0504C8CA" w:tentative="1">
+    <w:tmpl w:val="87E0417C"/>
+    <w:lvl w:ilvl="0" w:tplc="83361B4E" w:tentative="1">
       <w:start w:val="1"/>
       <w:numFmt w:val="bullet"/>
       <w:lvlText w:val="●"/>
@@ -32937,7 +32883,7 @@
         <w:ind w:left="720" w:hanging="360"/>
       </w:pPr>
     </w:lvl>
-    <w:lvl w:ilvl="1" w:tplc="99606470" w:tentative="1">
+    <w:lvl w:ilvl="1" w:tplc="0500273A" w:tentative="1">
       <w:start w:val="1"/>
       <w:numFmt w:val="bullet"/>
       <w:lvlText w:val="○"/>
@@ -32946,7 +32892,7 @@
         <w:ind w:left="1440" w:hanging="360"/>
       </w:pPr>
     </w:lvl>
-    <w:lvl w:ilvl="2" w:tplc="9C4C95F0" w:tentative="1">
+    <w:lvl w:ilvl="2" w:tplc="407EB054" w:tentative="1">
       <w:start w:val="1"/>
       <w:numFmt w:val="bullet"/>
       <w:lvlText w:val="■"/>
@@ -32955,7 +32901,7 @@
         <w:ind w:left="2160" w:hanging="360"/>
       </w:pPr>
     </w:lvl>
-    <w:lvl w:ilvl="3" w:tplc="C4AA5366" w:tentative="1">
+    <w:lvl w:ilvl="3" w:tplc="1F5209BC" w:tentative="1">
       <w:start w:val="1"/>
       <w:numFmt w:val="bullet"/>
       <w:lvlText w:val="●"/>
@@ -32964,7 +32910,7 @@
         <w:ind w:left="2880" w:hanging="360"/>
       </w:pPr>
     </w:lvl>
-    <w:lvl w:ilvl="4" w:tplc="020A708E" w:tentative="1">
+    <w:lvl w:ilvl="4" w:tplc="DABE37FC" w:tentative="1">
       <w:start w:val="1"/>
       <w:numFmt w:val="bullet"/>
       <w:lvlText w:val="○"/>
@@ -32973,7 +32919,7 @@
         <w:ind w:left="3600" w:hanging="360"/>
       </w:pPr>
     </w:lvl>
-    <w:lvl w:ilvl="5" w:tplc="908606F2" w:tentative="1">
+    <w:lvl w:ilvl="5" w:tplc="44A279AC" w:tentative="1">
       <w:start w:val="1"/>
       <w:numFmt w:val="bullet"/>
       <w:lvlText w:val="■"/>
@@ -32982,7 +32928,7 @@
         <w:ind w:left="4320" w:hanging="360"/>
       </w:pPr>
     </w:lvl>
-    <w:lvl w:ilvl="6" w:tplc="D0E0B0BA" w:tentative="1">
+    <w:lvl w:ilvl="6" w:tplc="16F07E62" w:tentative="1">
       <w:start w:val="1"/>
       <w:numFmt w:val="bullet"/>
       <w:lvlText w:val="●"/>
@@ -32991,7 +32937,7 @@
         <w:ind w:left="5040" w:hanging="360"/>
       </w:pPr>
     </w:lvl>
-    <w:lvl w:ilvl="7" w:tplc="8438BE0C" w:tentative="1">
+    <w:lvl w:ilvl="7" w:tplc="E600233E" w:tentative="1">
       <w:start w:val="1"/>
       <w:numFmt w:val="bullet"/>
       <w:lvlText w:val="●"/>
@@ -33000,7 +32946,7 @@
         <w:ind w:left="5760" w:hanging="360"/>
       </w:pPr>
     </w:lvl>
-    <w:lvl w:ilvl="8" w:tplc="84BA3F98" w:tentative="1">
+    <w:lvl w:ilvl="8" w:tplc="787CCB4E" w:tentative="1">
       <w:start w:val="1"/>
       <w:numFmt w:val="bullet"/>
       <w:lvlText w:val="●"/>
@@ -33010,11 +32956,65 @@
       </w:pPr>
     </w:lvl>
   </w:abstractNum>
+  <w:abstractNum w:abstractNumId="1" w15:restartNumberingAfterBreak="0">
+    <w:nsid w:val="28557CDA"/>
+    <w:multiLevelType w:val="hybridMultilevel"/>
+    <w:tmpl w:val="FB50F07C"/>
+    <w:lvl w:ilvl="0" w:tplc="7220908C" w:tentative="1">
+      <w:start w:val="1"/>
+      <w:numFmt w:val="decimal"/>
+      <w:lvlText w:val="%1."/>
+      <w:lvlJc w:val="left"/>
+      <w:pPr>
+        <w:ind w:left="540" w:hanging="300"/>
+      </w:pPr>
+    </w:lvl>
+    <w:lvl w:ilvl="1" w:tplc="D5826654">
+      <w:numFmt w:val="decimal"/>
+      <w:lvlText w:val=""/>
+      <w:lvlJc w:val="left"/>
+    </w:lvl>
+    <w:lvl w:ilvl="2" w:tplc="0AB63B50">
+      <w:numFmt w:val="decimal"/>
+      <w:lvlText w:val=""/>
+      <w:lvlJc w:val="left"/>
+    </w:lvl>
+    <w:lvl w:ilvl="3" w:tplc="F704051A">
+      <w:numFmt w:val="decimal"/>
+      <w:lvlText w:val=""/>
+      <w:lvlJc w:val="left"/>
+    </w:lvl>
+    <w:lvl w:ilvl="4" w:tplc="351E0A92">
+      <w:numFmt w:val="decimal"/>
+      <w:lvlText w:val=""/>
+      <w:lvlJc w:val="left"/>
+    </w:lvl>
+    <w:lvl w:ilvl="5" w:tplc="C31470BE">
+      <w:numFmt w:val="decimal"/>
+      <w:lvlText w:val=""/>
+      <w:lvlJc w:val="left"/>
+    </w:lvl>
+    <w:lvl w:ilvl="6" w:tplc="ACE451F6">
+      <w:numFmt w:val="decimal"/>
+      <w:lvlText w:val=""/>
+      <w:lvlJc w:val="left"/>
+    </w:lvl>
+    <w:lvl w:ilvl="7" w:tplc="E4063A30">
+      <w:numFmt w:val="decimal"/>
+      <w:lvlText w:val=""/>
+      <w:lvlJc w:val="left"/>
+    </w:lvl>
+    <w:lvl w:ilvl="8" w:tplc="D6E4864C">
+      <w:numFmt w:val="decimal"/>
+      <w:lvlText w:val=""/>
+      <w:lvlJc w:val="left"/>
+    </w:lvl>
+  </w:abstractNum>
   <w:abstractNum w:abstractNumId="2" w15:restartNumberingAfterBreak="0">
-    <w:nsid w:val="59FB4B6E"/>
+    <w:nsid w:val="693E44BE"/>
     <w:multiLevelType w:val="hybridMultilevel"/>
-    <w:tmpl w:val="1E9EE54E"/>
-    <w:lvl w:ilvl="0" w:tplc="A470DF64">
+    <w:tmpl w:val="04104FE6"/>
+    <w:lvl w:ilvl="0" w:tplc="7A0C7BF8">
       <w:start w:val="1"/>
       <w:numFmt w:val="bullet"/>
       <w:lvlText w:val="•"/>
@@ -33023,7 +33023,7 @@
         <w:ind w:left="540" w:hanging="270"/>
       </w:pPr>
     </w:lvl>
-    <w:lvl w:ilvl="1" w:tplc="B232CB5A" w:tentative="1">
+    <w:lvl w:ilvl="1" w:tplc="4ECE96F0" w:tentative="1">
       <w:start w:val="1"/>
       <w:numFmt w:val="bullet"/>
       <w:lvlText w:val="–"/>
@@ -33032,49 +33032,49 @@
         <w:ind w:left="1080" w:hanging="270"/>
       </w:pPr>
     </w:lvl>
-    <w:lvl w:ilvl="2" w:tplc="EF8C60E4">
+    <w:lvl w:ilvl="2" w:tplc="F3B643F2">
       <w:numFmt w:val="decimal"/>
       <w:lvlText w:val=""/>
       <w:lvlJc w:val="left"/>
     </w:lvl>
-    <w:lvl w:ilvl="3" w:tplc="8FB0F2AE">
+    <w:lvl w:ilvl="3" w:tplc="136A0AB4">
       <w:numFmt w:val="decimal"/>
       <w:lvlText w:val=""/>
       <w:lvlJc w:val="left"/>
     </w:lvl>
-    <w:lvl w:ilvl="4" w:tplc="917CC1D8">
+    <w:lvl w:ilvl="4" w:tplc="14EE4F54">
       <w:numFmt w:val="decimal"/>
       <w:lvlText w:val=""/>
       <w:lvlJc w:val="left"/>
     </w:lvl>
-    <w:lvl w:ilvl="5" w:tplc="15E451E2">
+    <w:lvl w:ilvl="5" w:tplc="9B2C6B4E">
       <w:numFmt w:val="decimal"/>
       <w:lvlText w:val=""/>
       <w:lvlJc w:val="left"/>
     </w:lvl>
-    <w:lvl w:ilvl="6" w:tplc="C8CE0336">
+    <w:lvl w:ilvl="6" w:tplc="ED2894EA">
       <w:numFmt w:val="decimal"/>
       <w:lvlText w:val=""/>
       <w:lvlJc w:val="left"/>
     </w:lvl>
-    <w:lvl w:ilvl="7" w:tplc="975872A2">
+    <w:lvl w:ilvl="7" w:tplc="5B982E94">
       <w:numFmt w:val="decimal"/>
       <w:lvlText w:val=""/>
       <w:lvlJc w:val="left"/>
     </w:lvl>
-    <w:lvl w:ilvl="8" w:tplc="40F46066">
+    <w:lvl w:ilvl="8" w:tplc="713223C2">
       <w:numFmt w:val="decimal"/>
       <w:lvlText w:val=""/>
       <w:lvlJc w:val="left"/>
     </w:lvl>
   </w:abstractNum>
-  <w:num w:numId="1" w16cid:durableId="685986719">
-    <w:abstractNumId w:val="1"/>
+  <w:num w:numId="1" w16cid:durableId="1869685146">
+    <w:abstractNumId w:val="0"/>
     <w:lvlOverride w:ilvl="0">
       <w:startOverride w:val="1"/>
     </w:lvlOverride>
   </w:num>
-  <w:num w:numId="2" w16cid:durableId="105197965">
+  <w:num w:numId="2" w16cid:durableId="1826122432">
     <w:abstractNumId w:val="2"/>
     <w:lvlOverride w:ilvl="0">
       <w:startOverride w:val="1"/>
@@ -33715,7 +33715,7 @@
     <w:autoRedefine/>
     <w:uiPriority w:val="39"/>
     <w:unhideWhenUsed/>
-    <w:rsid w:val="00F70C22"/>
+    <w:rsid w:val="00BB3020"/>
     <w:pPr>
       <w:spacing w:after="100"/>
     </w:pPr>
@@ -33727,7 +33727,7 @@
     <w:autoRedefine/>
     <w:uiPriority w:val="39"/>
     <w:unhideWhenUsed/>
-    <w:rsid w:val="00F70C22"/>
+    <w:rsid w:val="00BB3020"/>
     <w:pPr>
       <w:spacing w:after="100"/>
       <w:ind w:left="220"/>

</xml_diff>

<commit_message>
Informe: docente Freddy Asenjo Perez en portada y tabla IAM
Co-Authored-By: Claude Opus 5.5 (1M context) <noreply@anthropic.com>
</commit_message>
<xml_diff>
--- a/informe/Informe-Final-Proyecto-Integrador-TI3V62.docx
+++ b/informe/Informe-Final-Proyecto-Integrador-TI3V62.docx
@@ -401,7 +401,7 @@
                 <w:sz w:val="20"/>
                 <w:szCs w:val="20"/>
               </w:rPr>
-              <w:t>[Nombre del docente]</w:t>
+              <w:t>Freddy Asenjo Pérez</w:t>
             </w:r>
           </w:p>
         </w:tc>
@@ -742,7 +742,7 @@
     <w:sdt>
       <w:sdtPr>
         <w:alias w:val="Índice"/>
-        <w:id w:val="-737781325"/>
+        <w:id w:val="-340476047"/>
       </w:sdtPr>
       <w:sdtEndPr/>
       <w:sdtContent>
@@ -770,7 +770,7 @@
           <w:r>
             <w:fldChar w:fldCharType="separate"/>
           </w:r>
-          <w:hyperlink w:anchor="_Toc242043893" w:history="1">
+          <w:hyperlink w:anchor="_Toc242047404" w:history="1">
             <w:r>
               <w:rPr>
                 <w:rStyle w:val="Hipervnculo"/>
@@ -794,7 +794,7 @@
               <w:rPr>
                 <w:noProof/>
               </w:rPr>
-              <w:instrText xml:space="preserve"> PAGEREF _Toc242043893 \h </w:instrText>
+              <w:instrText xml:space="preserve"> PAGEREF _Toc242047404 \h </w:instrText>
             </w:r>
             <w:r>
               <w:rPr>
@@ -836,7 +836,7 @@
               <w14:ligatures w14:val="standardContextual"/>
             </w:rPr>
           </w:pPr>
-          <w:hyperlink w:anchor="_Toc242043894" w:history="1">
+          <w:hyperlink w:anchor="_Toc242047405" w:history="1">
             <w:r>
               <w:rPr>
                 <w:rStyle w:val="Hipervnculo"/>
@@ -860,7 +860,7 @@
               <w:rPr>
                 <w:noProof/>
               </w:rPr>
-              <w:instrText xml:space="preserve"> PAGEREF _Toc242043894 \h </w:instrText>
+              <w:instrText xml:space="preserve"> PAGEREF _Toc242047405 \h </w:instrText>
             </w:r>
             <w:r>
               <w:rPr>
@@ -902,7 +902,7 @@
               <w14:ligatures w14:val="standardContextual"/>
             </w:rPr>
           </w:pPr>
-          <w:hyperlink w:anchor="_Toc242043895" w:history="1">
+          <w:hyperlink w:anchor="_Toc242047406" w:history="1">
             <w:r>
               <w:rPr>
                 <w:rStyle w:val="Hipervnculo"/>
@@ -926,7 +926,7 @@
               <w:rPr>
                 <w:noProof/>
               </w:rPr>
-              <w:instrText xml:space="preserve"> PAGEREF _Toc242043895 \h </w:instrText>
+              <w:instrText xml:space="preserve"> PAGEREF _Toc242047406 \h </w:instrText>
             </w:r>
             <w:r>
               <w:rPr>
@@ -968,7 +968,7 @@
               <w14:ligatures w14:val="standardContextual"/>
             </w:rPr>
           </w:pPr>
-          <w:hyperlink w:anchor="_Toc242043896" w:history="1">
+          <w:hyperlink w:anchor="_Toc242047407" w:history="1">
             <w:r>
               <w:rPr>
                 <w:rStyle w:val="Hipervnculo"/>
@@ -992,7 +992,7 @@
               <w:rPr>
                 <w:noProof/>
               </w:rPr>
-              <w:instrText xml:space="preserve"> PAGEREF _Toc242043896 \h </w:instrText>
+              <w:instrText xml:space="preserve"> PAGEREF _Toc242047407 \h </w:instrText>
             </w:r>
             <w:r>
               <w:rPr>
@@ -1034,7 +1034,7 @@
               <w14:ligatures w14:val="standardContextual"/>
             </w:rPr>
           </w:pPr>
-          <w:hyperlink w:anchor="_Toc242043897" w:history="1">
+          <w:hyperlink w:anchor="_Toc242047408" w:history="1">
             <w:r>
               <w:rPr>
                 <w:rStyle w:val="Hipervnculo"/>
@@ -1058,7 +1058,7 @@
               <w:rPr>
                 <w:noProof/>
               </w:rPr>
-              <w:instrText xml:space="preserve"> PAGEREF _Toc242043897 \h </w:instrText>
+              <w:instrText xml:space="preserve"> PAGEREF _Toc242047408 \h </w:instrText>
             </w:r>
             <w:r>
               <w:rPr>
@@ -1100,7 +1100,7 @@
               <w14:ligatures w14:val="standardContextual"/>
             </w:rPr>
           </w:pPr>
-          <w:hyperlink w:anchor="_Toc242043898" w:history="1">
+          <w:hyperlink w:anchor="_Toc242047409" w:history="1">
             <w:r>
               <w:rPr>
                 <w:rStyle w:val="Hipervnculo"/>
@@ -1124,7 +1124,7 @@
               <w:rPr>
                 <w:noProof/>
               </w:rPr>
-              <w:instrText xml:space="preserve"> PAGEREF _Toc242043898 \h </w:instrText>
+              <w:instrText xml:space="preserve"> PAGEREF _Toc242047409 \h </w:instrText>
             </w:r>
             <w:r>
               <w:rPr>
@@ -1166,7 +1166,7 @@
               <w14:ligatures w14:val="standardContextual"/>
             </w:rPr>
           </w:pPr>
-          <w:hyperlink w:anchor="_Toc242043899" w:history="1">
+          <w:hyperlink w:anchor="_Toc242047410" w:history="1">
             <w:r>
               <w:rPr>
                 <w:rStyle w:val="Hipervnculo"/>
@@ -1190,7 +1190,7 @@
               <w:rPr>
                 <w:noProof/>
               </w:rPr>
-              <w:instrText xml:space="preserve"> PAGEREF _Toc242043899 \h </w:instrText>
+              <w:instrText xml:space="preserve"> PAGEREF _Toc242047410 \h </w:instrText>
             </w:r>
             <w:r>
               <w:rPr>
@@ -1232,7 +1232,7 @@
               <w14:ligatures w14:val="standardContextual"/>
             </w:rPr>
           </w:pPr>
-          <w:hyperlink w:anchor="_Toc242043900" w:history="1">
+          <w:hyperlink w:anchor="_Toc242047411" w:history="1">
             <w:r>
               <w:rPr>
                 <w:rStyle w:val="Hipervnculo"/>
@@ -1256,7 +1256,7 @@
               <w:rPr>
                 <w:noProof/>
               </w:rPr>
-              <w:instrText xml:space="preserve"> PAGEREF _Toc242043900 \h </w:instrText>
+              <w:instrText xml:space="preserve"> PAGEREF _Toc242047411 \h </w:instrText>
             </w:r>
             <w:r>
               <w:rPr>
@@ -1298,7 +1298,7 @@
               <w14:ligatures w14:val="standardContextual"/>
             </w:rPr>
           </w:pPr>
-          <w:hyperlink w:anchor="_Toc242043901" w:history="1">
+          <w:hyperlink w:anchor="_Toc242047412" w:history="1">
             <w:r>
               <w:rPr>
                 <w:rStyle w:val="Hipervnculo"/>
@@ -1322,7 +1322,7 @@
               <w:rPr>
                 <w:noProof/>
               </w:rPr>
-              <w:instrText xml:space="preserve"> PAGEREF _Toc242043901 \h </w:instrText>
+              <w:instrText xml:space="preserve"> PAGEREF _Toc242047412 \h </w:instrText>
             </w:r>
             <w:r>
               <w:rPr>
@@ -1364,7 +1364,7 @@
               <w14:ligatures w14:val="standardContextual"/>
             </w:rPr>
           </w:pPr>
-          <w:hyperlink w:anchor="_Toc242043902" w:history="1">
+          <w:hyperlink w:anchor="_Toc242047413" w:history="1">
             <w:r>
               <w:rPr>
                 <w:rStyle w:val="Hipervnculo"/>
@@ -1388,7 +1388,7 @@
               <w:rPr>
                 <w:noProof/>
               </w:rPr>
-              <w:instrText xml:space="preserve"> PAGEREF _Toc242043902 \h </w:instrText>
+              <w:instrText xml:space="preserve"> PAGEREF _Toc242047413 \h </w:instrText>
             </w:r>
             <w:r>
               <w:rPr>
@@ -1430,7 +1430,7 @@
               <w14:ligatures w14:val="standardContextual"/>
             </w:rPr>
           </w:pPr>
-          <w:hyperlink w:anchor="_Toc242043903" w:history="1">
+          <w:hyperlink w:anchor="_Toc242047414" w:history="1">
             <w:r>
               <w:rPr>
                 <w:rStyle w:val="Hipervnculo"/>
@@ -1454,7 +1454,7 @@
               <w:rPr>
                 <w:noProof/>
               </w:rPr>
-              <w:instrText xml:space="preserve"> PAGEREF _Toc242043903 \h </w:instrText>
+              <w:instrText xml:space="preserve"> PAGEREF _Toc242047414 \h </w:instrText>
             </w:r>
             <w:r>
               <w:rPr>
@@ -1496,7 +1496,7 @@
               <w14:ligatures w14:val="standardContextual"/>
             </w:rPr>
           </w:pPr>
-          <w:hyperlink w:anchor="_Toc242043904" w:history="1">
+          <w:hyperlink w:anchor="_Toc242047415" w:history="1">
             <w:r>
               <w:rPr>
                 <w:rStyle w:val="Hipervnculo"/>
@@ -1520,7 +1520,7 @@
               <w:rPr>
                 <w:noProof/>
               </w:rPr>
-              <w:instrText xml:space="preserve"> PAGEREF _Toc242043904 \h </w:instrText>
+              <w:instrText xml:space="preserve"> PAGEREF _Toc242047415 \h </w:instrText>
             </w:r>
             <w:r>
               <w:rPr>
@@ -1562,7 +1562,7 @@
               <w14:ligatures w14:val="standardContextual"/>
             </w:rPr>
           </w:pPr>
-          <w:hyperlink w:anchor="_Toc242043905" w:history="1">
+          <w:hyperlink w:anchor="_Toc242047416" w:history="1">
             <w:r>
               <w:rPr>
                 <w:rStyle w:val="Hipervnculo"/>
@@ -1586,7 +1586,7 @@
               <w:rPr>
                 <w:noProof/>
               </w:rPr>
-              <w:instrText xml:space="preserve"> PAGEREF _Toc242043905 \h </w:instrText>
+              <w:instrText xml:space="preserve"> PAGEREF _Toc242047416 \h </w:instrText>
             </w:r>
             <w:r>
               <w:rPr>
@@ -1628,7 +1628,7 @@
               <w14:ligatures w14:val="standardContextual"/>
             </w:rPr>
           </w:pPr>
-          <w:hyperlink w:anchor="_Toc242043906" w:history="1">
+          <w:hyperlink w:anchor="_Toc242047417" w:history="1">
             <w:r>
               <w:rPr>
                 <w:rStyle w:val="Hipervnculo"/>
@@ -1652,7 +1652,7 @@
               <w:rPr>
                 <w:noProof/>
               </w:rPr>
-              <w:instrText xml:space="preserve"> PAGEREF _Toc242043906 \h </w:instrText>
+              <w:instrText xml:space="preserve"> PAGEREF _Toc242047417 \h </w:instrText>
             </w:r>
             <w:r>
               <w:rPr>
@@ -1694,7 +1694,7 @@
               <w14:ligatures w14:val="standardContextual"/>
             </w:rPr>
           </w:pPr>
-          <w:hyperlink w:anchor="_Toc242043907" w:history="1">
+          <w:hyperlink w:anchor="_Toc242047418" w:history="1">
             <w:r>
               <w:rPr>
                 <w:rStyle w:val="Hipervnculo"/>
@@ -1718,7 +1718,7 @@
               <w:rPr>
                 <w:noProof/>
               </w:rPr>
-              <w:instrText xml:space="preserve"> PAGEREF _Toc242043907 \h </w:instrText>
+              <w:instrText xml:space="preserve"> PAGEREF _Toc242047418 \h </w:instrText>
             </w:r>
             <w:r>
               <w:rPr>
@@ -1760,7 +1760,7 @@
               <w14:ligatures w14:val="standardContextual"/>
             </w:rPr>
           </w:pPr>
-          <w:hyperlink w:anchor="_Toc242043908" w:history="1">
+          <w:hyperlink w:anchor="_Toc242047419" w:history="1">
             <w:r>
               <w:rPr>
                 <w:rStyle w:val="Hipervnculo"/>
@@ -1784,7 +1784,7 @@
               <w:rPr>
                 <w:noProof/>
               </w:rPr>
-              <w:instrText xml:space="preserve"> PAGEREF _Toc242043908 \h </w:instrText>
+              <w:instrText xml:space="preserve"> PAGEREF _Toc242047419 \h </w:instrText>
             </w:r>
             <w:r>
               <w:rPr>
@@ -1826,7 +1826,7 @@
               <w14:ligatures w14:val="standardContextual"/>
             </w:rPr>
           </w:pPr>
-          <w:hyperlink w:anchor="_Toc242043909" w:history="1">
+          <w:hyperlink w:anchor="_Toc242047420" w:history="1">
             <w:r>
               <w:rPr>
                 <w:rStyle w:val="Hipervnculo"/>
@@ -1850,7 +1850,7 @@
               <w:rPr>
                 <w:noProof/>
               </w:rPr>
-              <w:instrText xml:space="preserve"> PAGEREF _Toc242043909 \h </w:instrText>
+              <w:instrText xml:space="preserve"> PAGEREF _Toc242047420 \h </w:instrText>
             </w:r>
             <w:r>
               <w:rPr>
@@ -1892,7 +1892,7 @@
               <w14:ligatures w14:val="standardContextual"/>
             </w:rPr>
           </w:pPr>
-          <w:hyperlink w:anchor="_Toc242043910" w:history="1">
+          <w:hyperlink w:anchor="_Toc242047421" w:history="1">
             <w:r>
               <w:rPr>
                 <w:rStyle w:val="Hipervnculo"/>
@@ -1916,7 +1916,7 @@
               <w:rPr>
                 <w:noProof/>
               </w:rPr>
-              <w:instrText xml:space="preserve"> PAGEREF _Toc242043910 \h </w:instrText>
+              <w:instrText xml:space="preserve"> PAGEREF _Toc242047421 \h </w:instrText>
             </w:r>
             <w:r>
               <w:rPr>
@@ -1958,7 +1958,7 @@
               <w14:ligatures w14:val="standardContextual"/>
             </w:rPr>
           </w:pPr>
-          <w:hyperlink w:anchor="_Toc242043911" w:history="1">
+          <w:hyperlink w:anchor="_Toc242047422" w:history="1">
             <w:r>
               <w:rPr>
                 <w:rStyle w:val="Hipervnculo"/>
@@ -1982,7 +1982,7 @@
               <w:rPr>
                 <w:noProof/>
               </w:rPr>
-              <w:instrText xml:space="preserve"> PAGEREF _Toc242043911 \h </w:instrText>
+              <w:instrText xml:space="preserve"> PAGEREF _Toc242047422 \h </w:instrText>
             </w:r>
             <w:r>
               <w:rPr>
@@ -2024,7 +2024,7 @@
               <w14:ligatures w14:val="standardContextual"/>
             </w:rPr>
           </w:pPr>
-          <w:hyperlink w:anchor="_Toc242043912" w:history="1">
+          <w:hyperlink w:anchor="_Toc242047423" w:history="1">
             <w:r>
               <w:rPr>
                 <w:rStyle w:val="Hipervnculo"/>
@@ -2048,7 +2048,7 @@
               <w:rPr>
                 <w:noProof/>
               </w:rPr>
-              <w:instrText xml:space="preserve"> PAGEREF _Toc242043912 \h </w:instrText>
+              <w:instrText xml:space="preserve"> PAGEREF _Toc242047423 \h </w:instrText>
             </w:r>
             <w:r>
               <w:rPr>
@@ -2090,7 +2090,7 @@
               <w14:ligatures w14:val="standardContextual"/>
             </w:rPr>
           </w:pPr>
-          <w:hyperlink w:anchor="_Toc242043913" w:history="1">
+          <w:hyperlink w:anchor="_Toc242047424" w:history="1">
             <w:r>
               <w:rPr>
                 <w:rStyle w:val="Hipervnculo"/>
@@ -2114,7 +2114,7 @@
               <w:rPr>
                 <w:noProof/>
               </w:rPr>
-              <w:instrText xml:space="preserve"> PAGEREF _Toc242043913 \h </w:instrText>
+              <w:instrText xml:space="preserve"> PAGEREF _Toc242047424 \h </w:instrText>
             </w:r>
             <w:r>
               <w:rPr>
@@ -2156,7 +2156,7 @@
               <w14:ligatures w14:val="standardContextual"/>
             </w:rPr>
           </w:pPr>
-          <w:hyperlink w:anchor="_Toc242043914" w:history="1">
+          <w:hyperlink w:anchor="_Toc242047425" w:history="1">
             <w:r>
               <w:rPr>
                 <w:rStyle w:val="Hipervnculo"/>
@@ -2180,7 +2180,7 @@
               <w:rPr>
                 <w:noProof/>
               </w:rPr>
-              <w:instrText xml:space="preserve"> PAGEREF _Toc242043914 \h </w:instrText>
+              <w:instrText xml:space="preserve"> PAGEREF _Toc242047425 \h </w:instrText>
             </w:r>
             <w:r>
               <w:rPr>
@@ -2222,7 +2222,7 @@
               <w14:ligatures w14:val="standardContextual"/>
             </w:rPr>
           </w:pPr>
-          <w:hyperlink w:anchor="_Toc242043915" w:history="1">
+          <w:hyperlink w:anchor="_Toc242047426" w:history="1">
             <w:r>
               <w:rPr>
                 <w:rStyle w:val="Hipervnculo"/>
@@ -2246,7 +2246,7 @@
               <w:rPr>
                 <w:noProof/>
               </w:rPr>
-              <w:instrText xml:space="preserve"> PAGEREF _Toc242043915 \h </w:instrText>
+              <w:instrText xml:space="preserve"> PAGEREF _Toc242047426 \h </w:instrText>
             </w:r>
             <w:r>
               <w:rPr>
@@ -2288,7 +2288,7 @@
               <w14:ligatures w14:val="standardContextual"/>
             </w:rPr>
           </w:pPr>
-          <w:hyperlink w:anchor="_Toc242043916" w:history="1">
+          <w:hyperlink w:anchor="_Toc242047427" w:history="1">
             <w:r>
               <w:rPr>
                 <w:rStyle w:val="Hipervnculo"/>
@@ -2312,7 +2312,7 @@
               <w:rPr>
                 <w:noProof/>
               </w:rPr>
-              <w:instrText xml:space="preserve"> PAGEREF _Toc242043916 \h </w:instrText>
+              <w:instrText xml:space="preserve"> PAGEREF _Toc242047427 \h </w:instrText>
             </w:r>
             <w:r>
               <w:rPr>
@@ -2354,7 +2354,7 @@
               <w14:ligatures w14:val="standardContextual"/>
             </w:rPr>
           </w:pPr>
-          <w:hyperlink w:anchor="_Toc242043917" w:history="1">
+          <w:hyperlink w:anchor="_Toc242047428" w:history="1">
             <w:r>
               <w:rPr>
                 <w:rStyle w:val="Hipervnculo"/>
@@ -2378,7 +2378,7 @@
               <w:rPr>
                 <w:noProof/>
               </w:rPr>
-              <w:instrText xml:space="preserve"> PAGEREF _Toc242043917 \h </w:instrText>
+              <w:instrText xml:space="preserve"> PAGEREF _Toc242047428 \h </w:instrText>
             </w:r>
             <w:r>
               <w:rPr>
@@ -2420,7 +2420,7 @@
               <w14:ligatures w14:val="standardContextual"/>
             </w:rPr>
           </w:pPr>
-          <w:hyperlink w:anchor="_Toc242043918" w:history="1">
+          <w:hyperlink w:anchor="_Toc242047429" w:history="1">
             <w:r>
               <w:rPr>
                 <w:rStyle w:val="Hipervnculo"/>
@@ -2444,7 +2444,7 @@
               <w:rPr>
                 <w:noProof/>
               </w:rPr>
-              <w:instrText xml:space="preserve"> PAGEREF _Toc242043918 \h </w:instrText>
+              <w:instrText xml:space="preserve"> PAGEREF _Toc242047429 \h </w:instrText>
             </w:r>
             <w:r>
               <w:rPr>
@@ -2486,7 +2486,7 @@
               <w14:ligatures w14:val="standardContextual"/>
             </w:rPr>
           </w:pPr>
-          <w:hyperlink w:anchor="_Toc242043919" w:history="1">
+          <w:hyperlink w:anchor="_Toc242047430" w:history="1">
             <w:r>
               <w:rPr>
                 <w:rStyle w:val="Hipervnculo"/>
@@ -2510,7 +2510,7 @@
               <w:rPr>
                 <w:noProof/>
               </w:rPr>
-              <w:instrText xml:space="preserve"> PAGEREF _Toc242043919 \h </w:instrText>
+              <w:instrText xml:space="preserve"> PAGEREF _Toc242047430 \h </w:instrText>
             </w:r>
             <w:r>
               <w:rPr>
@@ -2552,7 +2552,7 @@
               <w14:ligatures w14:val="standardContextual"/>
             </w:rPr>
           </w:pPr>
-          <w:hyperlink w:anchor="_Toc242043920" w:history="1">
+          <w:hyperlink w:anchor="_Toc242047431" w:history="1">
             <w:r>
               <w:rPr>
                 <w:rStyle w:val="Hipervnculo"/>
@@ -2576,7 +2576,7 @@
               <w:rPr>
                 <w:noProof/>
               </w:rPr>
-              <w:instrText xml:space="preserve"> PAGEREF _Toc242043920 \h </w:instrText>
+              <w:instrText xml:space="preserve"> PAGEREF _Toc242047431 \h </w:instrText>
             </w:r>
             <w:r>
               <w:rPr>
@@ -2618,7 +2618,7 @@
               <w14:ligatures w14:val="standardContextual"/>
             </w:rPr>
           </w:pPr>
-          <w:hyperlink w:anchor="_Toc242043921" w:history="1">
+          <w:hyperlink w:anchor="_Toc242047432" w:history="1">
             <w:r>
               <w:rPr>
                 <w:rStyle w:val="Hipervnculo"/>
@@ -2642,7 +2642,7 @@
               <w:rPr>
                 <w:noProof/>
               </w:rPr>
-              <w:instrText xml:space="preserve"> PAGEREF _Toc242043921 \h </w:instrText>
+              <w:instrText xml:space="preserve"> PAGEREF _Toc242047432 \h </w:instrText>
             </w:r>
             <w:r>
               <w:rPr>
@@ -2684,7 +2684,7 @@
               <w14:ligatures w14:val="standardContextual"/>
             </w:rPr>
           </w:pPr>
-          <w:hyperlink w:anchor="_Toc242043922" w:history="1">
+          <w:hyperlink w:anchor="_Toc242047433" w:history="1">
             <w:r>
               <w:rPr>
                 <w:rStyle w:val="Hipervnculo"/>
@@ -2708,7 +2708,7 @@
               <w:rPr>
                 <w:noProof/>
               </w:rPr>
-              <w:instrText xml:space="preserve"> PAGEREF _Toc242043922 \h </w:instrText>
+              <w:instrText xml:space="preserve"> PAGEREF _Toc242047433 \h </w:instrText>
             </w:r>
             <w:r>
               <w:rPr>
@@ -2747,7 +2747,7 @@
         <w:pStyle w:val="Ttulo1"/>
         <w:pageBreakBefore/>
       </w:pPr>
-      <w:bookmarkStart w:id="0" w:name="_Toc242043893"/>
+      <w:bookmarkStart w:id="0" w:name="_Toc242047404"/>
       <w:r>
         <w:t>1. Descripción de la solución</w:t>
       </w:r>
@@ -2757,7 +2757,7 @@
       <w:pPr>
         <w:pStyle w:val="Ttulo2"/>
       </w:pPr>
-      <w:bookmarkStart w:id="1" w:name="_Toc242043894"/>
+      <w:bookmarkStart w:id="1" w:name="_Toc242047405"/>
       <w:r>
         <w:t>1.1 Problema que resuelve</w:t>
       </w:r>
@@ -2825,7 +2825,7 @@
       <w:pPr>
         <w:pStyle w:val="Ttulo2"/>
       </w:pPr>
-      <w:bookmarkStart w:id="2" w:name="_Toc242043895"/>
+      <w:bookmarkStart w:id="2" w:name="_Toc242047406"/>
       <w:r>
         <w:t>1.2 Usuarios y roles de negocio</w:t>
       </w:r>
@@ -3277,7 +3277,7 @@
       <w:pPr>
         <w:pStyle w:val="Ttulo2"/>
       </w:pPr>
-      <w:bookmarkStart w:id="3" w:name="_Toc242043896"/>
+      <w:bookmarkStart w:id="3" w:name="_Toc242047407"/>
       <w:r>
         <w:t>1.3 Requerimientos (ingeniería de software — criterio 4.1.1)</w:t>
       </w:r>
@@ -4788,7 +4788,7 @@
       <w:pPr>
         <w:pStyle w:val="Ttulo2"/>
       </w:pPr>
-      <w:bookmarkStart w:id="4" w:name="_Toc242043897"/>
+      <w:bookmarkStart w:id="4" w:name="_Toc242047408"/>
       <w:r>
         <w:t>1.4 Selección de la tecnología cloud (criterio 4.1.2)</w:t>
       </w:r>
@@ -5685,7 +5685,7 @@
       <w:pPr>
         <w:pStyle w:val="Ttulo2"/>
       </w:pPr>
-      <w:bookmarkStart w:id="5" w:name="_Toc242043898"/>
+      <w:bookmarkStart w:id="5" w:name="_Toc242047409"/>
       <w:r>
         <w:t>1.5 Formación de roles del equipo</w:t>
       </w:r>
@@ -6242,7 +6242,7 @@
         <w:pStyle w:val="Ttulo1"/>
         <w:pageBreakBefore/>
       </w:pPr>
-      <w:bookmarkStart w:id="6" w:name="_Toc242043899"/>
+      <w:bookmarkStart w:id="6" w:name="_Toc242047410"/>
       <w:r>
         <w:t>2. Arquitectura</w:t>
       </w:r>
@@ -6277,7 +6277,7 @@
           <w:noProof/>
         </w:rPr>
         <w:drawing>
-          <wp:inline distT="0" distB="0" distL="0" distR="0" wp14:anchorId="4FCB2866" wp14:editId="3FD9A174">
+          <wp:inline distT="0" distB="0" distL="0" distR="0" wp14:anchorId="2A5B6647" wp14:editId="0F6F6EDD">
             <wp:extent cx="5905500" cy="3429000"/>
             <wp:effectExtent l="0" t="0" r="0" b="0"/>
             <wp:docPr id="1" name="Imagen 1"/>
@@ -6336,7 +6336,7 @@
       <w:pPr>
         <w:pStyle w:val="Ttulo2"/>
       </w:pPr>
-      <w:bookmarkStart w:id="7" w:name="_Toc242043900"/>
+      <w:bookmarkStart w:id="7" w:name="_Toc242047411"/>
       <w:r>
         <w:t>2.1 Componentes</w:t>
       </w:r>
@@ -7097,7 +7097,7 @@
       <w:pPr>
         <w:pStyle w:val="Ttulo2"/>
       </w:pPr>
-      <w:bookmarkStart w:id="8" w:name="_Toc242043901"/>
+      <w:bookmarkStart w:id="8" w:name="_Toc242047412"/>
       <w:r>
         <w:t>2.2 Configuración aplicada en Railway</w:t>
       </w:r>
@@ -8268,7 +8268,7 @@
       <w:pPr>
         <w:pStyle w:val="Ttulo2"/>
       </w:pPr>
-      <w:bookmarkStart w:id="9" w:name="_Toc242043902"/>
+      <w:bookmarkStart w:id="9" w:name="_Toc242047413"/>
       <w:r>
         <w:t>2.3 Modelo de responsabilidad compartida</w:t>
       </w:r>
@@ -9515,7 +9515,7 @@
         <w:pStyle w:val="Ttulo1"/>
         <w:pageBreakBefore/>
       </w:pPr>
-      <w:bookmarkStart w:id="10" w:name="_Toc242043903"/>
+      <w:bookmarkStart w:id="10" w:name="_Toc242047414"/>
       <w:r>
         <w:t>3. Matriz de riesgos</w:t>
       </w:r>
@@ -14466,7 +14466,7 @@
         <w:pStyle w:val="Ttulo1"/>
         <w:pageBreakBefore/>
       </w:pPr>
-      <w:bookmarkStart w:id="11" w:name="_Toc242043904"/>
+      <w:bookmarkStart w:id="11" w:name="_Toc242047415"/>
       <w:r>
         <w:t>4. Configuración IAM</w:t>
       </w:r>
@@ -14505,7 +14505,7 @@
       <w:pPr>
         <w:pStyle w:val="Ttulo2"/>
       </w:pPr>
-      <w:bookmarkStart w:id="12" w:name="_Toc242043905"/>
+      <w:bookmarkStart w:id="12" w:name="_Toc242047416"/>
       <w:r>
         <w:t>4.1 Nivel plataforma (Railway y GitHub)</w:t>
       </w:r>
@@ -15134,7 +15134,7 @@
                 <w:sz w:val="18"/>
                 <w:szCs w:val="18"/>
               </w:rPr>
-              <w:t>Docente (revisión)</w:t>
+              <w:t>Freddy Asenjo Pérez (docente, revisión)</w:t>
             </w:r>
           </w:p>
         </w:tc>
@@ -15394,7 +15394,7 @@
       <w:pPr>
         <w:pStyle w:val="Ttulo2"/>
       </w:pPr>
-      <w:bookmarkStart w:id="13" w:name="_Toc242043906"/>
+      <w:bookmarkStart w:id="13" w:name="_Toc242047417"/>
       <w:r>
         <w:t>4.2 Nivel aplicación: RBAC</w:t>
       </w:r>
@@ -16847,7 +16847,7 @@
       <w:pPr>
         <w:pStyle w:val="Ttulo2"/>
       </w:pPr>
-      <w:bookmarkStart w:id="14" w:name="_Toc242043907"/>
+      <w:bookmarkStart w:id="14" w:name="_Toc242047418"/>
       <w:r>
         <w:t>4.3 Políticas de autenticación y sesión</w:t>
       </w:r>
@@ -17914,7 +17914,7 @@
       <w:pPr>
         <w:pStyle w:val="Ttulo2"/>
       </w:pPr>
-      <w:bookmarkStart w:id="15" w:name="_Toc242043908"/>
+      <w:bookmarkStart w:id="15" w:name="_Toc242047419"/>
       <w:r>
         <w:t>4.4 Autenticación de doble factor con Firebase</w:t>
       </w:r>
@@ -18726,7 +18726,7 @@
           <w:noProof/>
         </w:rPr>
         <w:drawing>
-          <wp:inline distT="0" distB="0" distL="0" distR="0" wp14:anchorId="1B13B529" wp14:editId="5E19AD73">
+          <wp:inline distT="0" distB="0" distL="0" distR="0" wp14:anchorId="40FCC92F" wp14:editId="3CBEF30E">
             <wp:extent cx="4953000" cy="2905125"/>
             <wp:effectExtent l="0" t="0" r="0" b="0"/>
             <wp:docPr id="2" name="Imagen 2"/>
@@ -18791,7 +18791,7 @@
           <w:noProof/>
         </w:rPr>
         <w:drawing>
-          <wp:inline distT="0" distB="0" distL="0" distR="0" wp14:anchorId="1A200087" wp14:editId="58C0F629">
+          <wp:inline distT="0" distB="0" distL="0" distR="0" wp14:anchorId="047F37E8" wp14:editId="1F906E43">
             <wp:extent cx="4953000" cy="2905125"/>
             <wp:effectExtent l="0" t="0" r="0" b="0"/>
             <wp:docPr id="3" name="Imagen 3"/>
@@ -18867,7 +18867,7 @@
         <w:pStyle w:val="Ttulo1"/>
         <w:pageBreakBefore/>
       </w:pPr>
-      <w:bookmarkStart w:id="16" w:name="_Toc242043909"/>
+      <w:bookmarkStart w:id="16" w:name="_Toc242047420"/>
       <w:r>
         <w:t>5. Seguridad de red y hardening</w:t>
       </w:r>
@@ -18877,7 +18877,7 @@
       <w:pPr>
         <w:pStyle w:val="Ttulo2"/>
       </w:pPr>
-      <w:bookmarkStart w:id="17" w:name="_Toc242043910"/>
+      <w:bookmarkStart w:id="17" w:name="_Toc242047421"/>
       <w:r>
         <w:t>5.1 Segmentación</w:t>
       </w:r>
@@ -19474,7 +19474,7 @@
       <w:pPr>
         <w:pStyle w:val="Ttulo2"/>
       </w:pPr>
-      <w:bookmarkStart w:id="18" w:name="_Toc242043911"/>
+      <w:bookmarkStart w:id="18" w:name="_Toc242047422"/>
       <w:r>
         <w:t>5.2 Medidas de endurecimiento aplicadas</w:t>
       </w:r>
@@ -20541,7 +20541,7 @@
       <w:pPr>
         <w:pStyle w:val="Ttulo2"/>
       </w:pPr>
-      <w:bookmarkStart w:id="19" w:name="_Toc242043912"/>
+      <w:bookmarkStart w:id="19" w:name="_Toc242047423"/>
       <w:r>
         <w:t>5.3 Registro de eventos (logging)</w:t>
       </w:r>
@@ -20576,7 +20576,7 @@
           <w:noProof/>
         </w:rPr>
         <w:drawing>
-          <wp:inline distT="0" distB="0" distL="0" distR="0" wp14:anchorId="7DB068CB" wp14:editId="73B13525">
+          <wp:inline distT="0" distB="0" distL="0" distR="0" wp14:anchorId="02E2D5E9" wp14:editId="53350FC1">
             <wp:extent cx="5715000" cy="3343275"/>
             <wp:effectExtent l="0" t="0" r="0" b="0"/>
             <wp:docPr id="4" name="Imagen 4"/>
@@ -20636,7 +20636,7 @@
         <w:pStyle w:val="Ttulo1"/>
         <w:pageBreakBefore/>
       </w:pPr>
-      <w:bookmarkStart w:id="20" w:name="_Toc242043913"/>
+      <w:bookmarkStart w:id="20" w:name="_Toc242047424"/>
       <w:r>
         <w:t>6. Pruebas de disponibilidad y validación de seguridad</w:t>
       </w:r>
@@ -20675,7 +20675,7 @@
       <w:pPr>
         <w:pStyle w:val="Ttulo2"/>
       </w:pPr>
-      <w:bookmarkStart w:id="21" w:name="_Toc242043914"/>
+      <w:bookmarkStart w:id="21" w:name="_Toc242047425"/>
       <w:r>
         <w:t>6.1 Resumen de resultados</w:t>
       </w:r>
@@ -22222,7 +22222,7 @@
       <w:pPr>
         <w:pStyle w:val="Ttulo2"/>
       </w:pPr>
-      <w:bookmarkStart w:id="22" w:name="_Toc242043915"/>
+      <w:bookmarkStart w:id="22" w:name="_Toc242047426"/>
       <w:r>
         <w:t>6.2 Pruebas de disponibilidad</w:t>
       </w:r>
@@ -23082,7 +23082,7 @@
       <w:pPr>
         <w:pStyle w:val="Ttulo2"/>
       </w:pPr>
-      <w:bookmarkStart w:id="23" w:name="_Toc242043916"/>
+      <w:bookmarkStart w:id="23" w:name="_Toc242047427"/>
       <w:r>
         <w:t>6.3 Detalle de pruebas de seguridad en producción</w:t>
       </w:r>
@@ -28912,7 +28912,7 @@
       <w:pPr>
         <w:pStyle w:val="Ttulo2"/>
       </w:pPr>
-      <w:bookmarkStart w:id="24" w:name="_Toc242043917"/>
+      <w:bookmarkStart w:id="24" w:name="_Toc242047428"/>
       <w:r>
         <w:t>6.4 Evidencia visual</w:t>
       </w:r>
@@ -28928,7 +28928,7 @@
           <w:noProof/>
         </w:rPr>
         <w:drawing>
-          <wp:inline distT="0" distB="0" distL="0" distR="0" wp14:anchorId="7050C0F4" wp14:editId="65073BDC">
+          <wp:inline distT="0" distB="0" distL="0" distR="0" wp14:anchorId="35AA3D3A" wp14:editId="5EFBA9F1">
             <wp:extent cx="5334000" cy="3124200"/>
             <wp:effectExtent l="0" t="0" r="0" b="0"/>
             <wp:docPr id="5" name="Imagen 5"/>
@@ -28993,7 +28993,7 @@
           <w:noProof/>
         </w:rPr>
         <w:drawing>
-          <wp:inline distT="0" distB="0" distL="0" distR="0" wp14:anchorId="6190646D" wp14:editId="7B698CF3">
+          <wp:inline distT="0" distB="0" distL="0" distR="0" wp14:anchorId="77B37483" wp14:editId="3A89D05C">
             <wp:extent cx="5334000" cy="3124200"/>
             <wp:effectExtent l="0" t="0" r="0" b="0"/>
             <wp:docPr id="6" name="Imagen 6"/>
@@ -29058,7 +29058,7 @@
           <w:noProof/>
         </w:rPr>
         <w:drawing>
-          <wp:inline distT="0" distB="0" distL="0" distR="0" wp14:anchorId="1B5140F0" wp14:editId="1734F801">
+          <wp:inline distT="0" distB="0" distL="0" distR="0" wp14:anchorId="540B1C2F" wp14:editId="49450AD8">
             <wp:extent cx="5334000" cy="3124200"/>
             <wp:effectExtent l="0" t="0" r="0" b="0"/>
             <wp:docPr id="7" name="Imagen 7"/>
@@ -29123,7 +29123,7 @@
           <w:noProof/>
         </w:rPr>
         <w:drawing>
-          <wp:inline distT="0" distB="0" distL="0" distR="0" wp14:anchorId="661AF668" wp14:editId="336BEEE4">
+          <wp:inline distT="0" distB="0" distL="0" distR="0" wp14:anchorId="78BDDD27" wp14:editId="26DA1575">
             <wp:extent cx="5334000" cy="3124200"/>
             <wp:effectExtent l="0" t="0" r="0" b="0"/>
             <wp:docPr id="8" name="Imagen 8"/>
@@ -29188,7 +29188,7 @@
           <w:noProof/>
         </w:rPr>
         <w:drawing>
-          <wp:inline distT="0" distB="0" distL="0" distR="0" wp14:anchorId="4EB86503" wp14:editId="1308092C">
+          <wp:inline distT="0" distB="0" distL="0" distR="0" wp14:anchorId="1775FFC0" wp14:editId="24E11EDA">
             <wp:extent cx="5334000" cy="3124200"/>
             <wp:effectExtent l="0" t="0" r="0" b="0"/>
             <wp:docPr id="9" name="Imagen 9"/>
@@ -29253,7 +29253,7 @@
           <w:noProof/>
         </w:rPr>
         <w:drawing>
-          <wp:inline distT="0" distB="0" distL="0" distR="0" wp14:anchorId="365491BC" wp14:editId="6567AE57">
+          <wp:inline distT="0" distB="0" distL="0" distR="0" wp14:anchorId="6B694A37" wp14:editId="41510296">
             <wp:extent cx="5334000" cy="3124200"/>
             <wp:effectExtent l="0" t="0" r="0" b="0"/>
             <wp:docPr id="10" name="Imagen 10"/>
@@ -29313,7 +29313,7 @@
         <w:pStyle w:val="Ttulo1"/>
         <w:pageBreakBefore/>
       </w:pPr>
-      <w:bookmarkStart w:id="25" w:name="_Toc242043918"/>
+      <w:bookmarkStart w:id="25" w:name="_Toc242047429"/>
       <w:r>
         <w:t>7. Conclusiones</w:t>
       </w:r>
@@ -29323,7 +29323,7 @@
       <w:pPr>
         <w:pStyle w:val="Ttulo2"/>
       </w:pPr>
-      <w:bookmarkStart w:id="26" w:name="_Toc242043919"/>
+      <w:bookmarkStart w:id="26" w:name="_Toc242047430"/>
       <w:r>
         <w:t>7.1 Evaluación de la seguridad de la solución (criterio 4.1.6)</w:t>
       </w:r>
@@ -30312,7 +30312,7 @@
       <w:pPr>
         <w:pStyle w:val="Ttulo2"/>
       </w:pPr>
-      <w:bookmarkStart w:id="27" w:name="_Toc242043920"/>
+      <w:bookmarkStart w:id="27" w:name="_Toc242047431"/>
       <w:r>
         <w:t>7.2 Aprendizajes del equipo</w:t>
       </w:r>
@@ -30422,7 +30422,7 @@
       <w:pPr>
         <w:pStyle w:val="Ttulo2"/>
       </w:pPr>
-      <w:bookmarkStart w:id="28" w:name="_Toc242043921"/>
+      <w:bookmarkStart w:id="28" w:name="_Toc242047432"/>
       <w:r>
         <w:t>7.3 Mejoras futuras</w:t>
       </w:r>
@@ -31490,7 +31490,7 @@
         <w:pStyle w:val="Ttulo1"/>
         <w:pageBreakBefore/>
       </w:pPr>
-      <w:bookmarkStart w:id="29" w:name="_Toc242043922"/>
+      <w:bookmarkStart w:id="29" w:name="_Toc242047433"/>
       <w:r>
         <w:t>Anexo A. Estructura del repositorio y reproducción</w:t>
       </w:r>
@@ -32871,10 +32871,68 @@
 <file path=word/numbering.xml><?xml version="1.0" encoding="utf-8"?>
 <w:numbering xmlns:wpc="http://schemas.microsoft.com/office/word/2010/wordprocessingCanvas" xmlns:cx="http://schemas.microsoft.com/office/drawing/2014/chartex" xmlns:cx1="http://schemas.microsoft.com/office/drawing/2015/9/8/chartex" xmlns:cx2="http://schemas.microsoft.com/office/drawing/2015/10/21/chartex" xmlns:cx3="http://schemas.microsoft.com/office/drawing/2016/5/9/chartex" xmlns:cx4="http://schemas.microsoft.com/office/drawing/2016/5/10/chartex" xmlns:cx5="http://schemas.microsoft.com/office/drawing/2016/5/11/chartex" xmlns:cx6="http://schemas.microsoft.com/office/drawing/2016/5/12/chartex" xmlns:cx7="http://schemas.microsoft.com/office/drawing/2016/5/13/chartex" xmlns:cx8="http://schemas.microsoft.com/office/drawing/2016/5/14/chartex" xmlns:mc="http://schemas.openxmlformats.org/markup-compatibility/2006" xmlns:aink="http://schemas.microsoft.com/office/drawing/2016/ink" xmlns:am3d="http://schemas.microsoft.com/office/drawing/2017/model3d" xmlns:o="urn:schemas-microsoft-com:office:office" xmlns:oel="http://schemas.microsoft.com/office/2019/extlst" xmlns:r="http://schemas.openxmlformats.org/officeDocument/2006/relationships" xmlns:m="http://schemas.openxmlformats.org/officeDocument/2006/math" xmlns:v="urn:schemas-microsoft-com:vml" xmlns:wp14="http://schemas.microsoft.com/office/word/2010/wordprocessingDrawing" xmlns:wp="http://schemas.openxmlformats.org/drawingml/2006/wordprocessingDrawing" xmlns:w10="urn:schemas-microsoft-com:office:word" xmlns:w="http://schemas.openxmlformats.org/wordprocessingml/2006/main" xmlns:w14="http://schemas.microsoft.com/office/word/2010/wordml" xmlns:w15="http://schemas.microsoft.com/office/word/2012/wordml" xmlns:w16cex="http://schemas.microsoft.com/office/word/2018/wordml/cex" xmlns:w16cid="http://schemas.microsoft.com/office/word/2016/wordml/cid" xmlns:w16="http://schemas.microsoft.com/office/word/2018/wordml" xmlns:w16du="http://schemas.microsoft.com/office/word/2023/wordml/word16du" xmlns:w16sdtdh="http://schemas.microsoft.com/office/word/2020/wordml/sdtdatahash" xmlns:w16sdtfl="http://schemas.microsoft.com/office/word/2024/wordml/sdtformatlock" xmlns:w16se="http://schemas.microsoft.com/office/word/2015/wordml/symex" xmlns:wpg="http://schemas.microsoft.com/office/word/2010/wordprocessingGroup" xmlns:wpi="http://schemas.microsoft.com/office/word/2010/wordprocessingInk" xmlns:wne="http://schemas.microsoft.com/office/word/2006/wordml" xmlns:wps="http://schemas.microsoft.com/office/word/2010/wordprocessingShape" mc:Ignorable="w14 w15 w16se w16cid w16 w16cex w16sdtdh w16sdtfl w16du wp14">
   <w:abstractNum w:abstractNumId="0" w15:restartNumberingAfterBreak="0">
-    <w:nsid w:val="1D9F1338"/>
+    <w:nsid w:val="074D4788"/>
     <w:multiLevelType w:val="hybridMultilevel"/>
-    <w:tmpl w:val="87E0417C"/>
-    <w:lvl w:ilvl="0" w:tplc="83361B4E" w:tentative="1">
+    <w:tmpl w:val="FF342442"/>
+    <w:lvl w:ilvl="0" w:tplc="675CCEE0">
+      <w:start w:val="1"/>
+      <w:numFmt w:val="bullet"/>
+      <w:lvlText w:val="•"/>
+      <w:lvlJc w:val="left"/>
+      <w:pPr>
+        <w:ind w:left="540" w:hanging="270"/>
+      </w:pPr>
+    </w:lvl>
+    <w:lvl w:ilvl="1" w:tplc="DF44F792" w:tentative="1">
+      <w:start w:val="1"/>
+      <w:numFmt w:val="bullet"/>
+      <w:lvlText w:val="–"/>
+      <w:lvlJc w:val="left"/>
+      <w:pPr>
+        <w:ind w:left="1080" w:hanging="270"/>
+      </w:pPr>
+    </w:lvl>
+    <w:lvl w:ilvl="2" w:tplc="2402CF38">
+      <w:numFmt w:val="decimal"/>
+      <w:lvlText w:val=""/>
+      <w:lvlJc w:val="left"/>
+    </w:lvl>
+    <w:lvl w:ilvl="3" w:tplc="4B3A76A6">
+      <w:numFmt w:val="decimal"/>
+      <w:lvlText w:val=""/>
+      <w:lvlJc w:val="left"/>
+    </w:lvl>
+    <w:lvl w:ilvl="4" w:tplc="6006463E">
+      <w:numFmt w:val="decimal"/>
+      <w:lvlText w:val=""/>
+      <w:lvlJc w:val="left"/>
+    </w:lvl>
+    <w:lvl w:ilvl="5" w:tplc="4DA4E752">
+      <w:numFmt w:val="decimal"/>
+      <w:lvlText w:val=""/>
+      <w:lvlJc w:val="left"/>
+    </w:lvl>
+    <w:lvl w:ilvl="6" w:tplc="F976B8E8">
+      <w:numFmt w:val="decimal"/>
+      <w:lvlText w:val=""/>
+      <w:lvlJc w:val="left"/>
+    </w:lvl>
+    <w:lvl w:ilvl="7" w:tplc="2BA6F38A">
+      <w:numFmt w:val="decimal"/>
+      <w:lvlText w:val=""/>
+      <w:lvlJc w:val="left"/>
+    </w:lvl>
+    <w:lvl w:ilvl="8" w:tplc="7762552E">
+      <w:numFmt w:val="decimal"/>
+      <w:lvlText w:val=""/>
+      <w:lvlJc w:val="left"/>
+    </w:lvl>
+  </w:abstractNum>
+  <w:abstractNum w:abstractNumId="1" w15:restartNumberingAfterBreak="0">
+    <w:nsid w:val="31F36E22"/>
+    <w:multiLevelType w:val="hybridMultilevel"/>
+    <w:tmpl w:val="AFD03AC2"/>
+    <w:lvl w:ilvl="0" w:tplc="A738C2C6" w:tentative="1">
       <w:start w:val="1"/>
       <w:numFmt w:val="bullet"/>
       <w:lvlText w:val="●"/>
@@ -32883,7 +32941,7 @@
         <w:ind w:left="720" w:hanging="360"/>
       </w:pPr>
     </w:lvl>
-    <w:lvl w:ilvl="1" w:tplc="0500273A" w:tentative="1">
+    <w:lvl w:ilvl="1" w:tplc="BE2E7632" w:tentative="1">
       <w:start w:val="1"/>
       <w:numFmt w:val="bullet"/>
       <w:lvlText w:val="○"/>
@@ -32892,7 +32950,7 @@
         <w:ind w:left="1440" w:hanging="360"/>
       </w:pPr>
     </w:lvl>
-    <w:lvl w:ilvl="2" w:tplc="407EB054" w:tentative="1">
+    <w:lvl w:ilvl="2" w:tplc="F3247460" w:tentative="1">
       <w:start w:val="1"/>
       <w:numFmt w:val="bullet"/>
       <w:lvlText w:val="■"/>
@@ -32901,7 +32959,7 @@
         <w:ind w:left="2160" w:hanging="360"/>
       </w:pPr>
     </w:lvl>
-    <w:lvl w:ilvl="3" w:tplc="1F5209BC" w:tentative="1">
+    <w:lvl w:ilvl="3" w:tplc="0852B414" w:tentative="1">
       <w:start w:val="1"/>
       <w:numFmt w:val="bullet"/>
       <w:lvlText w:val="●"/>
@@ -32910,7 +32968,7 @@
         <w:ind w:left="2880" w:hanging="360"/>
       </w:pPr>
     </w:lvl>
-    <w:lvl w:ilvl="4" w:tplc="DABE37FC" w:tentative="1">
+    <w:lvl w:ilvl="4" w:tplc="DE6A20AC" w:tentative="1">
       <w:start w:val="1"/>
       <w:numFmt w:val="bullet"/>
       <w:lvlText w:val="○"/>
@@ -32919,7 +32977,7 @@
         <w:ind w:left="3600" w:hanging="360"/>
       </w:pPr>
     </w:lvl>
-    <w:lvl w:ilvl="5" w:tplc="44A279AC" w:tentative="1">
+    <w:lvl w:ilvl="5" w:tplc="B462AA4E" w:tentative="1">
       <w:start w:val="1"/>
       <w:numFmt w:val="bullet"/>
       <w:lvlText w:val="■"/>
@@ -32928,7 +32986,7 @@
         <w:ind w:left="4320" w:hanging="360"/>
       </w:pPr>
     </w:lvl>
-    <w:lvl w:ilvl="6" w:tplc="16F07E62" w:tentative="1">
+    <w:lvl w:ilvl="6" w:tplc="F998E3DC" w:tentative="1">
       <w:start w:val="1"/>
       <w:numFmt w:val="bullet"/>
       <w:lvlText w:val="●"/>
@@ -32937,7 +32995,7 @@
         <w:ind w:left="5040" w:hanging="360"/>
       </w:pPr>
     </w:lvl>
-    <w:lvl w:ilvl="7" w:tplc="E600233E" w:tentative="1">
+    <w:lvl w:ilvl="7" w:tplc="FEBAAE84" w:tentative="1">
       <w:start w:val="1"/>
       <w:numFmt w:val="bullet"/>
       <w:lvlText w:val="●"/>
@@ -32946,7 +33004,7 @@
         <w:ind w:left="5760" w:hanging="360"/>
       </w:pPr>
     </w:lvl>
-    <w:lvl w:ilvl="8" w:tplc="787CCB4E" w:tentative="1">
+    <w:lvl w:ilvl="8" w:tplc="9D401324" w:tentative="1">
       <w:start w:val="1"/>
       <w:numFmt w:val="bullet"/>
       <w:lvlText w:val="●"/>
@@ -32956,11 +33014,11 @@
       </w:pPr>
     </w:lvl>
   </w:abstractNum>
-  <w:abstractNum w:abstractNumId="1" w15:restartNumberingAfterBreak="0">
-    <w:nsid w:val="28557CDA"/>
+  <w:abstractNum w:abstractNumId="2" w15:restartNumberingAfterBreak="0">
+    <w:nsid w:val="5F2F48EA"/>
     <w:multiLevelType w:val="hybridMultilevel"/>
-    <w:tmpl w:val="FB50F07C"/>
-    <w:lvl w:ilvl="0" w:tplc="7220908C" w:tentative="1">
+    <w:tmpl w:val="E14257C4"/>
+    <w:lvl w:ilvl="0" w:tplc="765C12A4" w:tentative="1">
       <w:start w:val="1"/>
       <w:numFmt w:val="decimal"/>
       <w:lvlText w:val="%1."/>
@@ -32969,113 +33027,55 @@
         <w:ind w:left="540" w:hanging="300"/>
       </w:pPr>
     </w:lvl>
-    <w:lvl w:ilvl="1" w:tplc="D5826654">
+    <w:lvl w:ilvl="1" w:tplc="6090DCB8">
       <w:numFmt w:val="decimal"/>
       <w:lvlText w:val=""/>
       <w:lvlJc w:val="left"/>
     </w:lvl>
-    <w:lvl w:ilvl="2" w:tplc="0AB63B50">
+    <w:lvl w:ilvl="2" w:tplc="402C54D0">
       <w:numFmt w:val="decimal"/>
       <w:lvlText w:val=""/>
       <w:lvlJc w:val="left"/>
     </w:lvl>
-    <w:lvl w:ilvl="3" w:tplc="F704051A">
+    <w:lvl w:ilvl="3" w:tplc="4A2016EC">
       <w:numFmt w:val="decimal"/>
       <w:lvlText w:val=""/>
       <w:lvlJc w:val="left"/>
     </w:lvl>
-    <w:lvl w:ilvl="4" w:tplc="351E0A92">
+    <w:lvl w:ilvl="4" w:tplc="A5F66182">
       <w:numFmt w:val="decimal"/>
       <w:lvlText w:val=""/>
       <w:lvlJc w:val="left"/>
     </w:lvl>
-    <w:lvl w:ilvl="5" w:tplc="C31470BE">
+    <w:lvl w:ilvl="5" w:tplc="133ADA06">
       <w:numFmt w:val="decimal"/>
       <w:lvlText w:val=""/>
       <w:lvlJc w:val="left"/>
     </w:lvl>
-    <w:lvl w:ilvl="6" w:tplc="ACE451F6">
+    <w:lvl w:ilvl="6" w:tplc="B57CD582">
       <w:numFmt w:val="decimal"/>
       <w:lvlText w:val=""/>
       <w:lvlJc w:val="left"/>
     </w:lvl>
-    <w:lvl w:ilvl="7" w:tplc="E4063A30">
+    <w:lvl w:ilvl="7" w:tplc="6D9EC664">
       <w:numFmt w:val="decimal"/>
       <w:lvlText w:val=""/>
       <w:lvlJc w:val="left"/>
     </w:lvl>
-    <w:lvl w:ilvl="8" w:tplc="D6E4864C">
+    <w:lvl w:ilvl="8" w:tplc="5F5CCDF8">
       <w:numFmt w:val="decimal"/>
       <w:lvlText w:val=""/>
       <w:lvlJc w:val="left"/>
     </w:lvl>
   </w:abstractNum>
-  <w:abstractNum w:abstractNumId="2" w15:restartNumberingAfterBreak="0">
-    <w:nsid w:val="693E44BE"/>
-    <w:multiLevelType w:val="hybridMultilevel"/>
-    <w:tmpl w:val="04104FE6"/>
-    <w:lvl w:ilvl="0" w:tplc="7A0C7BF8">
-      <w:start w:val="1"/>
-      <w:numFmt w:val="bullet"/>
-      <w:lvlText w:val="•"/>
-      <w:lvlJc w:val="left"/>
-      <w:pPr>
-        <w:ind w:left="540" w:hanging="270"/>
-      </w:pPr>
-    </w:lvl>
-    <w:lvl w:ilvl="1" w:tplc="4ECE96F0" w:tentative="1">
-      <w:start w:val="1"/>
-      <w:numFmt w:val="bullet"/>
-      <w:lvlText w:val="–"/>
-      <w:lvlJc w:val="left"/>
-      <w:pPr>
-        <w:ind w:left="1080" w:hanging="270"/>
-      </w:pPr>
-    </w:lvl>
-    <w:lvl w:ilvl="2" w:tplc="F3B643F2">
-      <w:numFmt w:val="decimal"/>
-      <w:lvlText w:val=""/>
-      <w:lvlJc w:val="left"/>
-    </w:lvl>
-    <w:lvl w:ilvl="3" w:tplc="136A0AB4">
-      <w:numFmt w:val="decimal"/>
-      <w:lvlText w:val=""/>
-      <w:lvlJc w:val="left"/>
-    </w:lvl>
-    <w:lvl w:ilvl="4" w:tplc="14EE4F54">
-      <w:numFmt w:val="decimal"/>
-      <w:lvlText w:val=""/>
-      <w:lvlJc w:val="left"/>
-    </w:lvl>
-    <w:lvl w:ilvl="5" w:tplc="9B2C6B4E">
-      <w:numFmt w:val="decimal"/>
-      <w:lvlText w:val=""/>
-      <w:lvlJc w:val="left"/>
-    </w:lvl>
-    <w:lvl w:ilvl="6" w:tplc="ED2894EA">
-      <w:numFmt w:val="decimal"/>
-      <w:lvlText w:val=""/>
-      <w:lvlJc w:val="left"/>
-    </w:lvl>
-    <w:lvl w:ilvl="7" w:tplc="5B982E94">
-      <w:numFmt w:val="decimal"/>
-      <w:lvlText w:val=""/>
-      <w:lvlJc w:val="left"/>
-    </w:lvl>
-    <w:lvl w:ilvl="8" w:tplc="713223C2">
-      <w:numFmt w:val="decimal"/>
-      <w:lvlText w:val=""/>
-      <w:lvlJc w:val="left"/>
-    </w:lvl>
-  </w:abstractNum>
-  <w:num w:numId="1" w16cid:durableId="1869685146">
-    <w:abstractNumId w:val="0"/>
+  <w:num w:numId="1" w16cid:durableId="972637757">
+    <w:abstractNumId w:val="1"/>
     <w:lvlOverride w:ilvl="0">
       <w:startOverride w:val="1"/>
     </w:lvlOverride>
   </w:num>
-  <w:num w:numId="2" w16cid:durableId="1826122432">
-    <w:abstractNumId w:val="2"/>
+  <w:num w:numId="2" w16cid:durableId="1174883854">
+    <w:abstractNumId w:val="0"/>
     <w:lvlOverride w:ilvl="0">
       <w:startOverride w:val="1"/>
     </w:lvlOverride>
@@ -33715,7 +33715,7 @@
     <w:autoRedefine/>
     <w:uiPriority w:val="39"/>
     <w:unhideWhenUsed/>
-    <w:rsid w:val="00BB3020"/>
+    <w:rsid w:val="00922869"/>
     <w:pPr>
       <w:spacing w:after="100"/>
     </w:pPr>
@@ -33727,7 +33727,7 @@
     <w:autoRedefine/>
     <w:uiPriority w:val="39"/>
     <w:unhideWhenUsed/>
-    <w:rsid w:val="00BB3020"/>
+    <w:rsid w:val="00922869"/>
     <w:pPr>
       <w:spacing w:after="100"/>
       <w:ind w:left="220"/>

</xml_diff>

<commit_message>
Informe: correcciones del feedback de revision
- R11 coherente con 4.1 (estado real de accesos; Members al 05-10)
- R09: respaldos diario y semanal activados en Railway + respaldo manual (evidencia)
- Resumen de riesgo residual calculado desde la matriz (incluye R01, R02, R04, R06, R07)
- Nombres reales de permisos de Railway (Can Edit / Can View) en texto y diagrama
- IAM de plataforma: tabla con estado aplicado/pendiente y 7.1 'Parcial'
- Anexo B con salida de describe-service y log de build; capturas de red y backups
- Prueba automatizada de rate limit (pruebas/rate-limit.js) y seccion 6.4
- Sin parrafos vacios; IP difuminada en capturas de auditoria; Figura 4 identifica la cuenta demo

Co-Authored-By: Claude Opus 5.5 (1M context) <noreply@anthropic.com>
</commit_message>
<xml_diff>
--- a/informe/Informe-Final-Proyecto-Integrador-TI3V62.docx
+++ b/informe/Informe-Final-Proyecto-Integrador-TI3V62.docx
@@ -72,7 +72,7 @@
     </w:p>
     <w:p>
       <w:pPr>
-        <w:spacing w:before="120"/>
+        <w:spacing w:before="120" w:after="900"/>
         <w:jc w:val="center"/>
       </w:pPr>
       <w:r>
@@ -85,11 +85,6 @@
         </w:rPr>
         <w:t>Portal de Gestión de Incidentes de Seguridad desplegado en Railway</w:t>
       </w:r>
-    </w:p>
-    <w:p>
-      <w:pPr>
-        <w:spacing w:before="900"/>
-      </w:pPr>
     </w:p>
     <w:tbl>
       <w:tblPr>
@@ -720,12 +715,8 @@
       </w:tr>
     </w:tbl>
     <w:p>
-      <w:r>
-        <w:br w:type="page"/>
-      </w:r>
-    </w:p>
-    <w:p>
       <w:pPr>
+        <w:pageBreakBefore/>
         <w:spacing w:after="200"/>
       </w:pPr>
       <w:r>
@@ -742,7 +733,7 @@
     <w:sdt>
       <w:sdtPr>
         <w:alias w:val="Índice"/>
-        <w:id w:val="-340476047"/>
+        <w:id w:val="742450135"/>
       </w:sdtPr>
       <w:sdtEndPr/>
       <w:sdtContent>
@@ -770,7 +761,7 @@
           <w:r>
             <w:fldChar w:fldCharType="separate"/>
           </w:r>
-          <w:hyperlink w:anchor="_Toc242047404" w:history="1">
+          <w:hyperlink w:anchor="_Toc242055550" w:history="1">
             <w:r>
               <w:rPr>
                 <w:rStyle w:val="Hipervnculo"/>
@@ -794,7 +785,7 @@
               <w:rPr>
                 <w:noProof/>
               </w:rPr>
-              <w:instrText xml:space="preserve"> PAGEREF _Toc242047404 \h </w:instrText>
+              <w:instrText xml:space="preserve"> PAGEREF _Toc242055550 \h </w:instrText>
             </w:r>
             <w:r>
               <w:rPr>
@@ -811,7 +802,7 @@
               <w:rPr>
                 <w:noProof/>
               </w:rPr>
-              <w:t>3</w:t>
+              <w:t>4</w:t>
             </w:r>
             <w:r>
               <w:rPr>
@@ -836,7 +827,7 @@
               <w14:ligatures w14:val="standardContextual"/>
             </w:rPr>
           </w:pPr>
-          <w:hyperlink w:anchor="_Toc242047405" w:history="1">
+          <w:hyperlink w:anchor="_Toc242055551" w:history="1">
             <w:r>
               <w:rPr>
                 <w:rStyle w:val="Hipervnculo"/>
@@ -860,7 +851,7 @@
               <w:rPr>
                 <w:noProof/>
               </w:rPr>
-              <w:instrText xml:space="preserve"> PAGEREF _Toc242047405 \h </w:instrText>
+              <w:instrText xml:space="preserve"> PAGEREF _Toc242055551 \h </w:instrText>
             </w:r>
             <w:r>
               <w:rPr>
@@ -877,7 +868,7 @@
               <w:rPr>
                 <w:noProof/>
               </w:rPr>
-              <w:t>3</w:t>
+              <w:t>4</w:t>
             </w:r>
             <w:r>
               <w:rPr>
@@ -902,7 +893,7 @@
               <w14:ligatures w14:val="standardContextual"/>
             </w:rPr>
           </w:pPr>
-          <w:hyperlink w:anchor="_Toc242047406" w:history="1">
+          <w:hyperlink w:anchor="_Toc242055552" w:history="1">
             <w:r>
               <w:rPr>
                 <w:rStyle w:val="Hipervnculo"/>
@@ -926,7 +917,7 @@
               <w:rPr>
                 <w:noProof/>
               </w:rPr>
-              <w:instrText xml:space="preserve"> PAGEREF _Toc242047406 \h </w:instrText>
+              <w:instrText xml:space="preserve"> PAGEREF _Toc242055552 \h </w:instrText>
             </w:r>
             <w:r>
               <w:rPr>
@@ -943,7 +934,7 @@
               <w:rPr>
                 <w:noProof/>
               </w:rPr>
-              <w:t>3</w:t>
+              <w:t>4</w:t>
             </w:r>
             <w:r>
               <w:rPr>
@@ -968,7 +959,7 @@
               <w14:ligatures w14:val="standardContextual"/>
             </w:rPr>
           </w:pPr>
-          <w:hyperlink w:anchor="_Toc242047407" w:history="1">
+          <w:hyperlink w:anchor="_Toc242055553" w:history="1">
             <w:r>
               <w:rPr>
                 <w:rStyle w:val="Hipervnculo"/>
@@ -992,7 +983,7 @@
               <w:rPr>
                 <w:noProof/>
               </w:rPr>
-              <w:instrText xml:space="preserve"> PAGEREF _Toc242047407 \h </w:instrText>
+              <w:instrText xml:space="preserve"> PAGEREF _Toc242055553 \h </w:instrText>
             </w:r>
             <w:r>
               <w:rPr>
@@ -1009,7 +1000,7 @@
               <w:rPr>
                 <w:noProof/>
               </w:rPr>
-              <w:t>3</w:t>
+              <w:t>4</w:t>
             </w:r>
             <w:r>
               <w:rPr>
@@ -1034,7 +1025,7 @@
               <w14:ligatures w14:val="standardContextual"/>
             </w:rPr>
           </w:pPr>
-          <w:hyperlink w:anchor="_Toc242047408" w:history="1">
+          <w:hyperlink w:anchor="_Toc242055554" w:history="1">
             <w:r>
               <w:rPr>
                 <w:rStyle w:val="Hipervnculo"/>
@@ -1058,7 +1049,7 @@
               <w:rPr>
                 <w:noProof/>
               </w:rPr>
-              <w:instrText xml:space="preserve"> PAGEREF _Toc242047408 \h </w:instrText>
+              <w:instrText xml:space="preserve"> PAGEREF _Toc242055554 \h </w:instrText>
             </w:r>
             <w:r>
               <w:rPr>
@@ -1075,7 +1066,7 @@
               <w:rPr>
                 <w:noProof/>
               </w:rPr>
-              <w:t>3</w:t>
+              <w:t>4</w:t>
             </w:r>
             <w:r>
               <w:rPr>
@@ -1100,7 +1091,7 @@
               <w14:ligatures w14:val="standardContextual"/>
             </w:rPr>
           </w:pPr>
-          <w:hyperlink w:anchor="_Toc242047409" w:history="1">
+          <w:hyperlink w:anchor="_Toc242055555" w:history="1">
             <w:r>
               <w:rPr>
                 <w:rStyle w:val="Hipervnculo"/>
@@ -1124,7 +1115,7 @@
               <w:rPr>
                 <w:noProof/>
               </w:rPr>
-              <w:instrText xml:space="preserve"> PAGEREF _Toc242047409 \h </w:instrText>
+              <w:instrText xml:space="preserve"> PAGEREF _Toc242055555 \h </w:instrText>
             </w:r>
             <w:r>
               <w:rPr>
@@ -1141,7 +1132,7 @@
               <w:rPr>
                 <w:noProof/>
               </w:rPr>
-              <w:t>4</w:t>
+              <w:t>5</w:t>
             </w:r>
             <w:r>
               <w:rPr>
@@ -1166,7 +1157,7 @@
               <w14:ligatures w14:val="standardContextual"/>
             </w:rPr>
           </w:pPr>
-          <w:hyperlink w:anchor="_Toc242047410" w:history="1">
+          <w:hyperlink w:anchor="_Toc242055556" w:history="1">
             <w:r>
               <w:rPr>
                 <w:rStyle w:val="Hipervnculo"/>
@@ -1190,7 +1181,7 @@
               <w:rPr>
                 <w:noProof/>
               </w:rPr>
-              <w:instrText xml:space="preserve"> PAGEREF _Toc242047410 \h </w:instrText>
+              <w:instrText xml:space="preserve"> PAGEREF _Toc242055556 \h </w:instrText>
             </w:r>
             <w:r>
               <w:rPr>
@@ -1207,7 +1198,7 @@
               <w:rPr>
                 <w:noProof/>
               </w:rPr>
-              <w:t>5</w:t>
+              <w:t>6</w:t>
             </w:r>
             <w:r>
               <w:rPr>
@@ -1232,7 +1223,7 @@
               <w14:ligatures w14:val="standardContextual"/>
             </w:rPr>
           </w:pPr>
-          <w:hyperlink w:anchor="_Toc242047411" w:history="1">
+          <w:hyperlink w:anchor="_Toc242055557" w:history="1">
             <w:r>
               <w:rPr>
                 <w:rStyle w:val="Hipervnculo"/>
@@ -1256,7 +1247,7 @@
               <w:rPr>
                 <w:noProof/>
               </w:rPr>
-              <w:instrText xml:space="preserve"> PAGEREF _Toc242047411 \h </w:instrText>
+              <w:instrText xml:space="preserve"> PAGEREF _Toc242055557 \h </w:instrText>
             </w:r>
             <w:r>
               <w:rPr>
@@ -1273,7 +1264,7 @@
               <w:rPr>
                 <w:noProof/>
               </w:rPr>
-              <w:t>5</w:t>
+              <w:t>6</w:t>
             </w:r>
             <w:r>
               <w:rPr>
@@ -1298,7 +1289,7 @@
               <w14:ligatures w14:val="standardContextual"/>
             </w:rPr>
           </w:pPr>
-          <w:hyperlink w:anchor="_Toc242047412" w:history="1">
+          <w:hyperlink w:anchor="_Toc242055558" w:history="1">
             <w:r>
               <w:rPr>
                 <w:rStyle w:val="Hipervnculo"/>
@@ -1322,7 +1313,7 @@
               <w:rPr>
                 <w:noProof/>
               </w:rPr>
-              <w:instrText xml:space="preserve"> PAGEREF _Toc242047412 \h </w:instrText>
+              <w:instrText xml:space="preserve"> PAGEREF _Toc242055558 \h </w:instrText>
             </w:r>
             <w:r>
               <w:rPr>
@@ -1339,7 +1330,7 @@
               <w:rPr>
                 <w:noProof/>
               </w:rPr>
-              <w:t>6</w:t>
+              <w:t>7</w:t>
             </w:r>
             <w:r>
               <w:rPr>
@@ -1364,7 +1355,7 @@
               <w14:ligatures w14:val="standardContextual"/>
             </w:rPr>
           </w:pPr>
-          <w:hyperlink w:anchor="_Toc242047413" w:history="1">
+          <w:hyperlink w:anchor="_Toc242055559" w:history="1">
             <w:r>
               <w:rPr>
                 <w:rStyle w:val="Hipervnculo"/>
@@ -1388,7 +1379,7 @@
               <w:rPr>
                 <w:noProof/>
               </w:rPr>
-              <w:instrText xml:space="preserve"> PAGEREF _Toc242047413 \h </w:instrText>
+              <w:instrText xml:space="preserve"> PAGEREF _Toc242055559 \h </w:instrText>
             </w:r>
             <w:r>
               <w:rPr>
@@ -1405,7 +1396,7 @@
               <w:rPr>
                 <w:noProof/>
               </w:rPr>
-              <w:t>6</w:t>
+              <w:t>7</w:t>
             </w:r>
             <w:r>
               <w:rPr>
@@ -1430,7 +1421,7 @@
               <w14:ligatures w14:val="standardContextual"/>
             </w:rPr>
           </w:pPr>
-          <w:hyperlink w:anchor="_Toc242047414" w:history="1">
+          <w:hyperlink w:anchor="_Toc242055560" w:history="1">
             <w:r>
               <w:rPr>
                 <w:rStyle w:val="Hipervnculo"/>
@@ -1454,7 +1445,7 @@
               <w:rPr>
                 <w:noProof/>
               </w:rPr>
-              <w:instrText xml:space="preserve"> PAGEREF _Toc242047414 \h </w:instrText>
+              <w:instrText xml:space="preserve"> PAGEREF _Toc242055560 \h </w:instrText>
             </w:r>
             <w:r>
               <w:rPr>
@@ -1471,7 +1462,7 @@
               <w:rPr>
                 <w:noProof/>
               </w:rPr>
-              <w:t>8</w:t>
+              <w:t>9</w:t>
             </w:r>
             <w:r>
               <w:rPr>
@@ -1496,7 +1487,7 @@
               <w14:ligatures w14:val="standardContextual"/>
             </w:rPr>
           </w:pPr>
-          <w:hyperlink w:anchor="_Toc242047415" w:history="1">
+          <w:hyperlink w:anchor="_Toc242055561" w:history="1">
             <w:r>
               <w:rPr>
                 <w:rStyle w:val="Hipervnculo"/>
@@ -1520,7 +1511,7 @@
               <w:rPr>
                 <w:noProof/>
               </w:rPr>
-              <w:instrText xml:space="preserve"> PAGEREF _Toc242047415 \h </w:instrText>
+              <w:instrText xml:space="preserve"> PAGEREF _Toc242055561 \h </w:instrText>
             </w:r>
             <w:r>
               <w:rPr>
@@ -1537,7 +1528,7 @@
               <w:rPr>
                 <w:noProof/>
               </w:rPr>
-              <w:t>10</w:t>
+              <w:t>11</w:t>
             </w:r>
             <w:r>
               <w:rPr>
@@ -1562,7 +1553,7 @@
               <w14:ligatures w14:val="standardContextual"/>
             </w:rPr>
           </w:pPr>
-          <w:hyperlink w:anchor="_Toc242047416" w:history="1">
+          <w:hyperlink w:anchor="_Toc242055562" w:history="1">
             <w:r>
               <w:rPr>
                 <w:rStyle w:val="Hipervnculo"/>
@@ -1586,7 +1577,7 @@
               <w:rPr>
                 <w:noProof/>
               </w:rPr>
-              <w:instrText xml:space="preserve"> PAGEREF _Toc242047416 \h </w:instrText>
+              <w:instrText xml:space="preserve"> PAGEREF _Toc242055562 \h </w:instrText>
             </w:r>
             <w:r>
               <w:rPr>
@@ -1603,7 +1594,7 @@
               <w:rPr>
                 <w:noProof/>
               </w:rPr>
-              <w:t>10</w:t>
+              <w:t>11</w:t>
             </w:r>
             <w:r>
               <w:rPr>
@@ -1628,7 +1619,7 @@
               <w14:ligatures w14:val="standardContextual"/>
             </w:rPr>
           </w:pPr>
-          <w:hyperlink w:anchor="_Toc242047417" w:history="1">
+          <w:hyperlink w:anchor="_Toc242055563" w:history="1">
             <w:r>
               <w:rPr>
                 <w:rStyle w:val="Hipervnculo"/>
@@ -1652,7 +1643,7 @@
               <w:rPr>
                 <w:noProof/>
               </w:rPr>
-              <w:instrText xml:space="preserve"> PAGEREF _Toc242047417 \h </w:instrText>
+              <w:instrText xml:space="preserve"> PAGEREF _Toc242055563 \h </w:instrText>
             </w:r>
             <w:r>
               <w:rPr>
@@ -1669,7 +1660,7 @@
               <w:rPr>
                 <w:noProof/>
               </w:rPr>
-              <w:t>10</w:t>
+              <w:t>12</w:t>
             </w:r>
             <w:r>
               <w:rPr>
@@ -1694,7 +1685,7 @@
               <w14:ligatures w14:val="standardContextual"/>
             </w:rPr>
           </w:pPr>
-          <w:hyperlink w:anchor="_Toc242047418" w:history="1">
+          <w:hyperlink w:anchor="_Toc242055564" w:history="1">
             <w:r>
               <w:rPr>
                 <w:rStyle w:val="Hipervnculo"/>
@@ -1718,7 +1709,7 @@
               <w:rPr>
                 <w:noProof/>
               </w:rPr>
-              <w:instrText xml:space="preserve"> PAGEREF _Toc242047418 \h </w:instrText>
+              <w:instrText xml:space="preserve"> PAGEREF _Toc242055564 \h </w:instrText>
             </w:r>
             <w:r>
               <w:rPr>
@@ -1735,7 +1726,7 @@
               <w:rPr>
                 <w:noProof/>
               </w:rPr>
-              <w:t>11</w:t>
+              <w:t>12</w:t>
             </w:r>
             <w:r>
               <w:rPr>
@@ -1760,7 +1751,7 @@
               <w14:ligatures w14:val="standardContextual"/>
             </w:rPr>
           </w:pPr>
-          <w:hyperlink w:anchor="_Toc242047419" w:history="1">
+          <w:hyperlink w:anchor="_Toc242055565" w:history="1">
             <w:r>
               <w:rPr>
                 <w:rStyle w:val="Hipervnculo"/>
@@ -1784,7 +1775,7 @@
               <w:rPr>
                 <w:noProof/>
               </w:rPr>
-              <w:instrText xml:space="preserve"> PAGEREF _Toc242047419 \h </w:instrText>
+              <w:instrText xml:space="preserve"> PAGEREF _Toc242055565 \h </w:instrText>
             </w:r>
             <w:r>
               <w:rPr>
@@ -1801,7 +1792,7 @@
               <w:rPr>
                 <w:noProof/>
               </w:rPr>
-              <w:t>11</w:t>
+              <w:t>13</w:t>
             </w:r>
             <w:r>
               <w:rPr>
@@ -1826,7 +1817,7 @@
               <w14:ligatures w14:val="standardContextual"/>
             </w:rPr>
           </w:pPr>
-          <w:hyperlink w:anchor="_Toc242047420" w:history="1">
+          <w:hyperlink w:anchor="_Toc242055566" w:history="1">
             <w:r>
               <w:rPr>
                 <w:rStyle w:val="Hipervnculo"/>
@@ -1850,7 +1841,7 @@
               <w:rPr>
                 <w:noProof/>
               </w:rPr>
-              <w:instrText xml:space="preserve"> PAGEREF _Toc242047420 \h </w:instrText>
+              <w:instrText xml:space="preserve"> PAGEREF _Toc242055566 \h </w:instrText>
             </w:r>
             <w:r>
               <w:rPr>
@@ -1867,7 +1858,7 @@
               <w:rPr>
                 <w:noProof/>
               </w:rPr>
-              <w:t>14</w:t>
+              <w:t>15</w:t>
             </w:r>
             <w:r>
               <w:rPr>
@@ -1892,7 +1883,7 @@
               <w14:ligatures w14:val="standardContextual"/>
             </w:rPr>
           </w:pPr>
-          <w:hyperlink w:anchor="_Toc242047421" w:history="1">
+          <w:hyperlink w:anchor="_Toc242055567" w:history="1">
             <w:r>
               <w:rPr>
                 <w:rStyle w:val="Hipervnculo"/>
@@ -1916,7 +1907,7 @@
               <w:rPr>
                 <w:noProof/>
               </w:rPr>
-              <w:instrText xml:space="preserve"> PAGEREF _Toc242047421 \h </w:instrText>
+              <w:instrText xml:space="preserve"> PAGEREF _Toc242055567 \h </w:instrText>
             </w:r>
             <w:r>
               <w:rPr>
@@ -1933,7 +1924,7 @@
               <w:rPr>
                 <w:noProof/>
               </w:rPr>
-              <w:t>14</w:t>
+              <w:t>15</w:t>
             </w:r>
             <w:r>
               <w:rPr>
@@ -1958,7 +1949,7 @@
               <w14:ligatures w14:val="standardContextual"/>
             </w:rPr>
           </w:pPr>
-          <w:hyperlink w:anchor="_Toc242047422" w:history="1">
+          <w:hyperlink w:anchor="_Toc242055568" w:history="1">
             <w:r>
               <w:rPr>
                 <w:rStyle w:val="Hipervnculo"/>
@@ -1982,7 +1973,7 @@
               <w:rPr>
                 <w:noProof/>
               </w:rPr>
-              <w:instrText xml:space="preserve"> PAGEREF _Toc242047422 \h </w:instrText>
+              <w:instrText xml:space="preserve"> PAGEREF _Toc242055568 \h </w:instrText>
             </w:r>
             <w:r>
               <w:rPr>
@@ -1999,7 +1990,7 @@
               <w:rPr>
                 <w:noProof/>
               </w:rPr>
-              <w:t>14</w:t>
+              <w:t>15</w:t>
             </w:r>
             <w:r>
               <w:rPr>
@@ -2024,7 +2015,7 @@
               <w14:ligatures w14:val="standardContextual"/>
             </w:rPr>
           </w:pPr>
-          <w:hyperlink w:anchor="_Toc242047423" w:history="1">
+          <w:hyperlink w:anchor="_Toc242055569" w:history="1">
             <w:r>
               <w:rPr>
                 <w:rStyle w:val="Hipervnculo"/>
@@ -2048,7 +2039,7 @@
               <w:rPr>
                 <w:noProof/>
               </w:rPr>
-              <w:instrText xml:space="preserve"> PAGEREF _Toc242047423 \h </w:instrText>
+              <w:instrText xml:space="preserve"> PAGEREF _Toc242055569 \h </w:instrText>
             </w:r>
             <w:r>
               <w:rPr>
@@ -2065,7 +2056,7 @@
               <w:rPr>
                 <w:noProof/>
               </w:rPr>
-              <w:t>14</w:t>
+              <w:t>16</w:t>
             </w:r>
             <w:r>
               <w:rPr>
@@ -2090,7 +2081,7 @@
               <w14:ligatures w14:val="standardContextual"/>
             </w:rPr>
           </w:pPr>
-          <w:hyperlink w:anchor="_Toc242047424" w:history="1">
+          <w:hyperlink w:anchor="_Toc242055570" w:history="1">
             <w:r>
               <w:rPr>
                 <w:rStyle w:val="Hipervnculo"/>
@@ -2114,7 +2105,7 @@
               <w:rPr>
                 <w:noProof/>
               </w:rPr>
-              <w:instrText xml:space="preserve"> PAGEREF _Toc242047424 \h </w:instrText>
+              <w:instrText xml:space="preserve"> PAGEREF _Toc242055570 \h </w:instrText>
             </w:r>
             <w:r>
               <w:rPr>
@@ -2131,7 +2122,7 @@
               <w:rPr>
                 <w:noProof/>
               </w:rPr>
-              <w:t>16</w:t>
+              <w:t>17</w:t>
             </w:r>
             <w:r>
               <w:rPr>
@@ -2156,7 +2147,7 @@
               <w14:ligatures w14:val="standardContextual"/>
             </w:rPr>
           </w:pPr>
-          <w:hyperlink w:anchor="_Toc242047425" w:history="1">
+          <w:hyperlink w:anchor="_Toc242055571" w:history="1">
             <w:r>
               <w:rPr>
                 <w:rStyle w:val="Hipervnculo"/>
@@ -2180,7 +2171,7 @@
               <w:rPr>
                 <w:noProof/>
               </w:rPr>
-              <w:instrText xml:space="preserve"> PAGEREF _Toc242047425 \h </w:instrText>
+              <w:instrText xml:space="preserve"> PAGEREF _Toc242055571 \h </w:instrText>
             </w:r>
             <w:r>
               <w:rPr>
@@ -2197,7 +2188,7 @@
               <w:rPr>
                 <w:noProof/>
               </w:rPr>
-              <w:t>16</w:t>
+              <w:t>17</w:t>
             </w:r>
             <w:r>
               <w:rPr>
@@ -2222,7 +2213,7 @@
               <w14:ligatures w14:val="standardContextual"/>
             </w:rPr>
           </w:pPr>
-          <w:hyperlink w:anchor="_Toc242047426" w:history="1">
+          <w:hyperlink w:anchor="_Toc242055572" w:history="1">
             <w:r>
               <w:rPr>
                 <w:rStyle w:val="Hipervnculo"/>
@@ -2246,7 +2237,7 @@
               <w:rPr>
                 <w:noProof/>
               </w:rPr>
-              <w:instrText xml:space="preserve"> PAGEREF _Toc242047426 \h </w:instrText>
+              <w:instrText xml:space="preserve"> PAGEREF _Toc242055572 \h </w:instrText>
             </w:r>
             <w:r>
               <w:rPr>
@@ -2263,7 +2254,7 @@
               <w:rPr>
                 <w:noProof/>
               </w:rPr>
-              <w:t>16</w:t>
+              <w:t>17</w:t>
             </w:r>
             <w:r>
               <w:rPr>
@@ -2288,7 +2279,7 @@
               <w14:ligatures w14:val="standardContextual"/>
             </w:rPr>
           </w:pPr>
-          <w:hyperlink w:anchor="_Toc242047427" w:history="1">
+          <w:hyperlink w:anchor="_Toc242055573" w:history="1">
             <w:r>
               <w:rPr>
                 <w:rStyle w:val="Hipervnculo"/>
@@ -2312,7 +2303,7 @@
               <w:rPr>
                 <w:noProof/>
               </w:rPr>
-              <w:instrText xml:space="preserve"> PAGEREF _Toc242047427 \h </w:instrText>
+              <w:instrText xml:space="preserve"> PAGEREF _Toc242055573 \h </w:instrText>
             </w:r>
             <w:r>
               <w:rPr>
@@ -2329,7 +2320,7 @@
               <w:rPr>
                 <w:noProof/>
               </w:rPr>
-              <w:t>17</w:t>
+              <w:t>18</w:t>
             </w:r>
             <w:r>
               <w:rPr>
@@ -2354,13 +2345,13 @@
               <w14:ligatures w14:val="standardContextual"/>
             </w:rPr>
           </w:pPr>
-          <w:hyperlink w:anchor="_Toc242047428" w:history="1">
+          <w:hyperlink w:anchor="_Toc242055574" w:history="1">
             <w:r>
               <w:rPr>
                 <w:rStyle w:val="Hipervnculo"/>
                 <w:noProof/>
               </w:rPr>
-              <w:t>6.4 Evidencia visual</w:t>
+              <w:t>6.4 Prueba de limitación de tasa (rate limit)</w:t>
             </w:r>
             <w:r>
               <w:rPr>
@@ -2378,7 +2369,7 @@
               <w:rPr>
                 <w:noProof/>
               </w:rPr>
-              <w:instrText xml:space="preserve"> PAGEREF _Toc242047428 \h </w:instrText>
+              <w:instrText xml:space="preserve"> PAGEREF _Toc242055574 \h </w:instrText>
             </w:r>
             <w:r>
               <w:rPr>
@@ -2395,7 +2386,73 @@
               <w:rPr>
                 <w:noProof/>
               </w:rPr>
-              <w:t>18</w:t>
+              <w:t>19</w:t>
+            </w:r>
+            <w:r>
+              <w:rPr>
+                <w:noProof/>
+              </w:rPr>
+              <w:fldChar w:fldCharType="end"/>
+            </w:r>
+          </w:hyperlink>
+        </w:p>
+        <w:p>
+          <w:pPr>
+            <w:pStyle w:val="TDC2"/>
+            <w:tabs>
+              <w:tab w:val="right" w:leader="dot" w:pos="9350"/>
+            </w:tabs>
+            <w:rPr>
+              <w:rFonts w:asciiTheme="minorHAnsi" w:eastAsiaTheme="minorEastAsia" w:hAnsiTheme="minorHAnsi" w:cstheme="minorBidi"/>
+              <w:noProof/>
+              <w:kern w:val="2"/>
+              <w:sz w:val="24"/>
+              <w:szCs w:val="24"/>
+              <w14:ligatures w14:val="standardContextual"/>
+            </w:rPr>
+          </w:pPr>
+          <w:hyperlink w:anchor="_Toc242055575" w:history="1">
+            <w:r>
+              <w:rPr>
+                <w:rStyle w:val="Hipervnculo"/>
+                <w:noProof/>
+              </w:rPr>
+              <w:t>6.5 Evidencia visual</w:t>
+            </w:r>
+            <w:r>
+              <w:rPr>
+                <w:noProof/>
+              </w:rPr>
+              <w:tab/>
+            </w:r>
+            <w:r>
+              <w:rPr>
+                <w:noProof/>
+              </w:rPr>
+              <w:fldChar w:fldCharType="begin"/>
+            </w:r>
+            <w:r>
+              <w:rPr>
+                <w:noProof/>
+              </w:rPr>
+              <w:instrText xml:space="preserve"> PAGEREF _Toc242055575 \h </w:instrText>
+            </w:r>
+            <w:r>
+              <w:rPr>
+                <w:noProof/>
+              </w:rPr>
+            </w:r>
+            <w:r>
+              <w:rPr>
+                <w:noProof/>
+              </w:rPr>
+              <w:fldChar w:fldCharType="separate"/>
+            </w:r>
+            <w:r>
+              <w:rPr>
+                <w:noProof/>
+              </w:rPr>
+              <w:t>20</w:t>
             </w:r>
             <w:r>
               <w:rPr>
@@ -2420,7 +2477,7 @@
               <w14:ligatures w14:val="standardContextual"/>
             </w:rPr>
           </w:pPr>
-          <w:hyperlink w:anchor="_Toc242047429" w:history="1">
+          <w:hyperlink w:anchor="_Toc242055576" w:history="1">
             <w:r>
               <w:rPr>
                 <w:rStyle w:val="Hipervnculo"/>
@@ -2444,7 +2501,7 @@
               <w:rPr>
                 <w:noProof/>
               </w:rPr>
-              <w:instrText xml:space="preserve"> PAGEREF _Toc242047429 \h </w:instrText>
+              <w:instrText xml:space="preserve"> PAGEREF _Toc242055576 \h </w:instrText>
             </w:r>
             <w:r>
               <w:rPr>
@@ -2461,7 +2518,7 @@
               <w:rPr>
                 <w:noProof/>
               </w:rPr>
-              <w:t>22</w:t>
+              <w:t>24</w:t>
             </w:r>
             <w:r>
               <w:rPr>
@@ -2486,7 +2543,7 @@
               <w14:ligatures w14:val="standardContextual"/>
             </w:rPr>
           </w:pPr>
-          <w:hyperlink w:anchor="_Toc242047430" w:history="1">
+          <w:hyperlink w:anchor="_Toc242055577" w:history="1">
             <w:r>
               <w:rPr>
                 <w:rStyle w:val="Hipervnculo"/>
@@ -2510,7 +2567,7 @@
               <w:rPr>
                 <w:noProof/>
               </w:rPr>
-              <w:instrText xml:space="preserve"> PAGEREF _Toc242047430 \h </w:instrText>
+              <w:instrText xml:space="preserve"> PAGEREF _Toc242055577 \h </w:instrText>
             </w:r>
             <w:r>
               <w:rPr>
@@ -2527,7 +2584,7 @@
               <w:rPr>
                 <w:noProof/>
               </w:rPr>
-              <w:t>22</w:t>
+              <w:t>24</w:t>
             </w:r>
             <w:r>
               <w:rPr>
@@ -2552,7 +2609,7 @@
               <w14:ligatures w14:val="standardContextual"/>
             </w:rPr>
           </w:pPr>
-          <w:hyperlink w:anchor="_Toc242047431" w:history="1">
+          <w:hyperlink w:anchor="_Toc242055578" w:history="1">
             <w:r>
               <w:rPr>
                 <w:rStyle w:val="Hipervnculo"/>
@@ -2576,7 +2633,7 @@
               <w:rPr>
                 <w:noProof/>
               </w:rPr>
-              <w:instrText xml:space="preserve"> PAGEREF _Toc242047431 \h </w:instrText>
+              <w:instrText xml:space="preserve"> PAGEREF _Toc242055578 \h </w:instrText>
             </w:r>
             <w:r>
               <w:rPr>
@@ -2593,7 +2650,7 @@
               <w:rPr>
                 <w:noProof/>
               </w:rPr>
-              <w:t>22</w:t>
+              <w:t>24</w:t>
             </w:r>
             <w:r>
               <w:rPr>
@@ -2618,7 +2675,7 @@
               <w14:ligatures w14:val="standardContextual"/>
             </w:rPr>
           </w:pPr>
-          <w:hyperlink w:anchor="_Toc242047432" w:history="1">
+          <w:hyperlink w:anchor="_Toc242055579" w:history="1">
             <w:r>
               <w:rPr>
                 <w:rStyle w:val="Hipervnculo"/>
@@ -2642,7 +2699,7 @@
               <w:rPr>
                 <w:noProof/>
               </w:rPr>
-              <w:instrText xml:space="preserve"> PAGEREF _Toc242047432 \h </w:instrText>
+              <w:instrText xml:space="preserve"> PAGEREF _Toc242055579 \h </w:instrText>
             </w:r>
             <w:r>
               <w:rPr>
@@ -2659,7 +2716,7 @@
               <w:rPr>
                 <w:noProof/>
               </w:rPr>
-              <w:t>22</w:t>
+              <w:t>24</w:t>
             </w:r>
             <w:r>
               <w:rPr>
@@ -2684,7 +2741,7 @@
               <w14:ligatures w14:val="standardContextual"/>
             </w:rPr>
           </w:pPr>
-          <w:hyperlink w:anchor="_Toc242047433" w:history="1">
+          <w:hyperlink w:anchor="_Toc242055580" w:history="1">
             <w:r>
               <w:rPr>
                 <w:rStyle w:val="Hipervnculo"/>
@@ -2708,7 +2765,7 @@
               <w:rPr>
                 <w:noProof/>
               </w:rPr>
-              <w:instrText xml:space="preserve"> PAGEREF _Toc242047433 \h </w:instrText>
+              <w:instrText xml:space="preserve"> PAGEREF _Toc242055580 \h </w:instrText>
             </w:r>
             <w:r>
               <w:rPr>
@@ -2725,7 +2782,271 @@
               <w:rPr>
                 <w:noProof/>
               </w:rPr>
-              <w:t>24</w:t>
+              <w:t>26</w:t>
+            </w:r>
+            <w:r>
+              <w:rPr>
+                <w:noProof/>
+              </w:rPr>
+              <w:fldChar w:fldCharType="end"/>
+            </w:r>
+          </w:hyperlink>
+        </w:p>
+        <w:p>
+          <w:pPr>
+            <w:pStyle w:val="TDC1"/>
+            <w:tabs>
+              <w:tab w:val="right" w:leader="dot" w:pos="9350"/>
+            </w:tabs>
+            <w:rPr>
+              <w:rFonts w:asciiTheme="minorHAnsi" w:eastAsiaTheme="minorEastAsia" w:hAnsiTheme="minorHAnsi" w:cstheme="minorBidi"/>
+              <w:noProof/>
+              <w:kern w:val="2"/>
+              <w:sz w:val="24"/>
+              <w:szCs w:val="24"/>
+              <w14:ligatures w14:val="standardContextual"/>
+            </w:rPr>
+          </w:pPr>
+          <w:hyperlink w:anchor="_Toc242055581" w:history="1">
+            <w:r>
+              <w:rPr>
+                <w:rStyle w:val="Hipervnculo"/>
+                <w:noProof/>
+              </w:rPr>
+              <w:t>Anexo B. Evidencia de configuración en Railway</w:t>
+            </w:r>
+            <w:r>
+              <w:rPr>
+                <w:noProof/>
+              </w:rPr>
+              <w:tab/>
+            </w:r>
+            <w:r>
+              <w:rPr>
+                <w:noProof/>
+              </w:rPr>
+              <w:fldChar w:fldCharType="begin"/>
+            </w:r>
+            <w:r>
+              <w:rPr>
+                <w:noProof/>
+              </w:rPr>
+              <w:instrText xml:space="preserve"> PAGEREF _Toc242055581 \h </w:instrText>
+            </w:r>
+            <w:r>
+              <w:rPr>
+                <w:noProof/>
+              </w:rPr>
+            </w:r>
+            <w:r>
+              <w:rPr>
+                <w:noProof/>
+              </w:rPr>
+              <w:fldChar w:fldCharType="separate"/>
+            </w:r>
+            <w:r>
+              <w:rPr>
+                <w:noProof/>
+              </w:rPr>
+              <w:t>27</w:t>
+            </w:r>
+            <w:r>
+              <w:rPr>
+                <w:noProof/>
+              </w:rPr>
+              <w:fldChar w:fldCharType="end"/>
+            </w:r>
+          </w:hyperlink>
+        </w:p>
+        <w:p>
+          <w:pPr>
+            <w:pStyle w:val="TDC2"/>
+            <w:tabs>
+              <w:tab w:val="right" w:leader="dot" w:pos="9350"/>
+            </w:tabs>
+            <w:rPr>
+              <w:rFonts w:asciiTheme="minorHAnsi" w:eastAsiaTheme="minorEastAsia" w:hAnsiTheme="minorHAnsi" w:cstheme="minorBidi"/>
+              <w:noProof/>
+              <w:kern w:val="2"/>
+              <w:sz w:val="24"/>
+              <w:szCs w:val="24"/>
+              <w14:ligatures w14:val="standardContextual"/>
+            </w:rPr>
+          </w:pPr>
+          <w:hyperlink w:anchor="_Toc242055582" w:history="1">
+            <w:r>
+              <w:rPr>
+                <w:rStyle w:val="Hipervnculo"/>
+                <w:noProof/>
+              </w:rPr>
+              <w:t>B.1 Servicio Postgres (capa de datos)</w:t>
+            </w:r>
+            <w:r>
+              <w:rPr>
+                <w:noProof/>
+              </w:rPr>
+              <w:tab/>
+            </w:r>
+            <w:r>
+              <w:rPr>
+                <w:noProof/>
+              </w:rPr>
+              <w:fldChar w:fldCharType="begin"/>
+            </w:r>
+            <w:r>
+              <w:rPr>
+                <w:noProof/>
+              </w:rPr>
+              <w:instrText xml:space="preserve"> PAGEREF _Toc242055582 \h </w:instrText>
+            </w:r>
+            <w:r>
+              <w:rPr>
+                <w:noProof/>
+              </w:rPr>
+            </w:r>
+            <w:r>
+              <w:rPr>
+                <w:noProof/>
+              </w:rPr>
+              <w:fldChar w:fldCharType="separate"/>
+            </w:r>
+            <w:r>
+              <w:rPr>
+                <w:noProof/>
+              </w:rPr>
+              <w:t>27</w:t>
+            </w:r>
+            <w:r>
+              <w:rPr>
+                <w:noProof/>
+              </w:rPr>
+              <w:fldChar w:fldCharType="end"/>
+            </w:r>
+          </w:hyperlink>
+        </w:p>
+        <w:p>
+          <w:pPr>
+            <w:pStyle w:val="TDC2"/>
+            <w:tabs>
+              <w:tab w:val="right" w:leader="dot" w:pos="9350"/>
+            </w:tabs>
+            <w:rPr>
+              <w:rFonts w:asciiTheme="minorHAnsi" w:eastAsiaTheme="minorEastAsia" w:hAnsiTheme="minorHAnsi" w:cstheme="minorBidi"/>
+              <w:noProof/>
+              <w:kern w:val="2"/>
+              <w:sz w:val="24"/>
+              <w:szCs w:val="24"/>
+              <w14:ligatures w14:val="standardContextual"/>
+            </w:rPr>
+          </w:pPr>
+          <w:hyperlink w:anchor="_Toc242055583" w:history="1">
+            <w:r>
+              <w:rPr>
+                <w:rStyle w:val="Hipervnculo"/>
+                <w:noProof/>
+              </w:rPr>
+              <w:t>B.2 Servicio portal-app (capa de aplicación)</w:t>
+            </w:r>
+            <w:r>
+              <w:rPr>
+                <w:noProof/>
+              </w:rPr>
+              <w:tab/>
+            </w:r>
+            <w:r>
+              <w:rPr>
+                <w:noProof/>
+              </w:rPr>
+              <w:fldChar w:fldCharType="begin"/>
+            </w:r>
+            <w:r>
+              <w:rPr>
+                <w:noProof/>
+              </w:rPr>
+              <w:instrText xml:space="preserve"> PAGEREF _Toc242055583 \h </w:instrText>
+            </w:r>
+            <w:r>
+              <w:rPr>
+                <w:noProof/>
+              </w:rPr>
+            </w:r>
+            <w:r>
+              <w:rPr>
+                <w:noProof/>
+              </w:rPr>
+              <w:fldChar w:fldCharType="separate"/>
+            </w:r>
+            <w:r>
+              <w:rPr>
+                <w:noProof/>
+              </w:rPr>
+              <w:t>27</w:t>
+            </w:r>
+            <w:r>
+              <w:rPr>
+                <w:noProof/>
+              </w:rPr>
+              <w:fldChar w:fldCharType="end"/>
+            </w:r>
+          </w:hyperlink>
+        </w:p>
+        <w:p>
+          <w:pPr>
+            <w:pStyle w:val="TDC2"/>
+            <w:tabs>
+              <w:tab w:val="right" w:leader="dot" w:pos="9350"/>
+            </w:tabs>
+            <w:rPr>
+              <w:rFonts w:asciiTheme="minorHAnsi" w:eastAsiaTheme="minorEastAsia" w:hAnsiTheme="minorHAnsi" w:cstheme="minorBidi"/>
+              <w:noProof/>
+              <w:kern w:val="2"/>
+              <w:sz w:val="24"/>
+              <w:szCs w:val="24"/>
+              <w14:ligatures w14:val="standardContextual"/>
+            </w:rPr>
+          </w:pPr>
+          <w:hyperlink w:anchor="_Toc242055584" w:history="1">
+            <w:r>
+              <w:rPr>
+                <w:rStyle w:val="Hipervnculo"/>
+                <w:noProof/>
+              </w:rPr>
+              <w:t>B.3 Log de build (extracto)</w:t>
+            </w:r>
+            <w:r>
+              <w:rPr>
+                <w:noProof/>
+              </w:rPr>
+              <w:tab/>
+            </w:r>
+            <w:r>
+              <w:rPr>
+                <w:noProof/>
+              </w:rPr>
+              <w:fldChar w:fldCharType="begin"/>
+            </w:r>
+            <w:r>
+              <w:rPr>
+                <w:noProof/>
+              </w:rPr>
+              <w:instrText xml:space="preserve"> PAGEREF _Toc242055584 \h </w:instrText>
+            </w:r>
+            <w:r>
+              <w:rPr>
+                <w:noProof/>
+              </w:rPr>
+            </w:r>
+            <w:r>
+              <w:rPr>
+                <w:noProof/>
+              </w:rPr>
+              <w:fldChar w:fldCharType="separate"/>
+            </w:r>
+            <w:r>
+              <w:rPr>
+                <w:noProof/>
+              </w:rPr>
+              <w:t>27</w:t>
             </w:r>
             <w:r>
               <w:rPr>
@@ -2747,7 +3068,7 @@
         <w:pStyle w:val="Ttulo1"/>
         <w:pageBreakBefore/>
       </w:pPr>
-      <w:bookmarkStart w:id="0" w:name="_Toc242047404"/>
+      <w:bookmarkStart w:id="0" w:name="_Toc242055550"/>
       <w:r>
         <w:t>1. Descripción de la solución</w:t>
       </w:r>
@@ -2757,7 +3078,7 @@
       <w:pPr>
         <w:pStyle w:val="Ttulo2"/>
       </w:pPr>
-      <w:bookmarkStart w:id="1" w:name="_Toc242047405"/>
+      <w:bookmarkStart w:id="1" w:name="_Toc242055551"/>
       <w:r>
         <w:t>1.1 Problema que resuelve</w:t>
       </w:r>
@@ -2825,7 +3146,7 @@
       <w:pPr>
         <w:pStyle w:val="Ttulo2"/>
       </w:pPr>
-      <w:bookmarkStart w:id="2" w:name="_Toc242047406"/>
+      <w:bookmarkStart w:id="2" w:name="_Toc242055552"/>
       <w:r>
         <w:t>1.2 Usuarios y roles de negocio</w:t>
       </w:r>
@@ -3277,7 +3598,7 @@
       <w:pPr>
         <w:pStyle w:val="Ttulo2"/>
       </w:pPr>
-      <w:bookmarkStart w:id="3" w:name="_Toc242047407"/>
+      <w:bookmarkStart w:id="3" w:name="_Toc242055553"/>
       <w:r>
         <w:t>1.3 Requerimientos (ingeniería de software — criterio 4.1.1)</w:t>
       </w:r>
@@ -4788,7 +5109,7 @@
       <w:pPr>
         <w:pStyle w:val="Ttulo2"/>
       </w:pPr>
-      <w:bookmarkStart w:id="4" w:name="_Toc242047408"/>
+      <w:bookmarkStart w:id="4" w:name="_Toc242055554"/>
       <w:r>
         <w:t>1.4 Selección de la tecnología cloud (criterio 4.1.2)</w:t>
       </w:r>
@@ -5424,7 +5745,7 @@
                 <w:sz w:val="18"/>
                 <w:szCs w:val="18"/>
               </w:rPr>
-              <w:t>Roles de workspace y de proyecto (Owner/Editor/Viewer), tokens por entorno</w:t>
+              <w:t>Titular del workspace y permisos de proyecto (Can Edit / Can View), tokens por entorno</w:t>
             </w:r>
           </w:p>
         </w:tc>
@@ -5685,7 +6006,7 @@
       <w:pPr>
         <w:pStyle w:val="Ttulo2"/>
       </w:pPr>
-      <w:bookmarkStart w:id="5" w:name="_Toc242047409"/>
+      <w:bookmarkStart w:id="5" w:name="_Toc242055555"/>
       <w:r>
         <w:t>1.5 Formación de roles del equipo</w:t>
       </w:r>
@@ -6242,7 +6563,7 @@
         <w:pStyle w:val="Ttulo1"/>
         <w:pageBreakBefore/>
       </w:pPr>
-      <w:bookmarkStart w:id="6" w:name="_Toc242047410"/>
+      <w:bookmarkStart w:id="6" w:name="_Toc242055556"/>
       <w:r>
         <w:t>2. Arquitectura</w:t>
       </w:r>
@@ -6277,7 +6598,7 @@
           <w:noProof/>
         </w:rPr>
         <w:drawing>
-          <wp:inline distT="0" distB="0" distL="0" distR="0" wp14:anchorId="2A5B6647" wp14:editId="0F6F6EDD">
+          <wp:inline distT="0" distB="0" distL="0" distR="0" wp14:anchorId="5B96B94A" wp14:editId="404F2D71">
             <wp:extent cx="5905500" cy="3429000"/>
             <wp:effectExtent l="0" t="0" r="0" b="0"/>
             <wp:docPr id="1" name="Imagen 1"/>
@@ -6336,7 +6657,7 @@
       <w:pPr>
         <w:pStyle w:val="Ttulo2"/>
       </w:pPr>
-      <w:bookmarkStart w:id="7" w:name="_Toc242047411"/>
+      <w:bookmarkStart w:id="7" w:name="_Toc242055557"/>
       <w:r>
         <w:t>2.1 Componentes</w:t>
       </w:r>
@@ -7097,7 +7418,7 @@
       <w:pPr>
         <w:pStyle w:val="Ttulo2"/>
       </w:pPr>
-      <w:bookmarkStart w:id="8" w:name="_Toc242047412"/>
+      <w:bookmarkStart w:id="8" w:name="_Toc242055558"/>
       <w:r>
         <w:t>2.2 Configuración aplicada en Railway</w:t>
       </w:r>
@@ -7714,7 +8035,7 @@
                 <w:sz w:val="18"/>
                 <w:szCs w:val="18"/>
               </w:rPr>
-              <w:t>ON_FAILURE, máx. 10 reintentos</w:t>
+              <w:t>On Failure, máx. 10 reintentos (valor por defecto de Railway, docs.railway.com/deployments/restart-policy)</w:t>
             </w:r>
           </w:p>
         </w:tc>
@@ -7889,7 +8210,7 @@
                 <w:sz w:val="18"/>
                 <w:szCs w:val="18"/>
               </w:rPr>
-              <w:t>Root directory / builder</w:t>
+              <w:t>Root directory / build</w:t>
             </w:r>
           </w:p>
         </w:tc>
@@ -7919,7 +8240,7 @@
                 <w:sz w:val="18"/>
                 <w:szCs w:val="18"/>
               </w:rPr>
-              <w:t>/app — Dockerfile</w:t>
+              <w:t>/app — Dockerfile detectado automáticamente (log de build en Anexo B)</w:t>
             </w:r>
           </w:p>
         </w:tc>
@@ -8268,7 +8589,7 @@
       <w:pPr>
         <w:pStyle w:val="Ttulo2"/>
       </w:pPr>
-      <w:bookmarkStart w:id="9" w:name="_Toc242047413"/>
+      <w:bookmarkStart w:id="9" w:name="_Toc242055559"/>
       <w:r>
         <w:t>2.3 Modelo de responsabilidad compartida</w:t>
       </w:r>
@@ -9515,7 +9836,7 @@
         <w:pStyle w:val="Ttulo1"/>
         <w:pageBreakBefore/>
       </w:pPr>
-      <w:bookmarkStart w:id="10" w:name="_Toc242047414"/>
+      <w:bookmarkStart w:id="10" w:name="_Toc242055560"/>
       <w:r>
         <w:t>3. Matriz de riesgos</w:t>
       </w:r>
@@ -10130,8 +10451,19 @@
     </w:tbl>
     <w:p>
       <w:pPr>
-        <w:spacing w:after="80"/>
+        <w:spacing w:after="240"/>
+        <w:jc w:val="center"/>
       </w:pPr>
+      <w:r>
+        <w:rPr>
+          <w:i/>
+          <w:iCs/>
+          <w:color w:val="5B6676"/>
+          <w:sz w:val="18"/>
+          <w:szCs w:val="18"/>
+        </w:rPr>
+        <w:t>Tabla 2. Escala de nivel de riesgo (probabilidad × impacto).</w:t>
+      </w:r>
     </w:p>
     <w:tbl>
       <w:tblPr>
@@ -13038,7 +13370,7 @@
                 <w:sz w:val="15"/>
                 <w:szCs w:val="15"/>
               </w:rPr>
-              <w:t>Volumen persistente; eliminación solo por admin y auditada; respaldos programados del volumen (acción pendiente: activar)</w:t>
+              <w:t>Volumen persistente; eliminación solo por admin y auditada; respaldos programados del volumen diario (retención 6 días) y semanal (27 días) + respaldo manual del 05-10-2026 (Figura 7)</w:t>
             </w:r>
           </w:p>
         </w:tc>
@@ -13648,7 +13980,7 @@
                 <w:sz w:val="15"/>
                 <w:szCs w:val="15"/>
               </w:rPr>
-              <w:t>Roles de proyecto mínimos (Viewer/Editor); Owner reservado; solo el titular puede escribir en el repositorio (público para evaluación). Pendiente: activar 2FA en cuentas Railway/GitHub/Google del equipo</w:t>
+              <w:t>Hoy solo el titular tiene acceso al proyecto Railway y escribe en el repositorio (Figura 2); permisos mínimos planificados para el equipo (Can Edit / Can View). Pendiente: invitaciones y 2FA en cuentas Railway/GitHub/Google</w:t>
             </w:r>
           </w:p>
         </w:tc>
@@ -14458,7 +14790,37 @@
         <w:t>5.5</w:t>
       </w:r>
       <w:r>
-        <w:t xml:space="preserve"> después de aplicar los controles. El principal riesgo de acceso no autorizado a la aplicación (R01) se mitiga con autenticación de doble factor. Queda un riesgo residual alto, R11 (compromiso de cuentas de la plataforma), que baja a medio cuando el equipo active 2FA en sus cuentas de Railway, GitHub y Google. Los riesgos residuales medios (R09, R10, R12, R13) se tratan como mejoras en la sección 7.</w:t>
+        <w:t xml:space="preserve"> después de aplicar los controles. El principal riesgo de acceso no autorizado a la aplicación (R01) se mitiga con autenticación de doble factor. Riesgo residual por nivel: </w:t>
+      </w:r>
+      <w:r>
+        <w:rPr>
+          <w:b/>
+          <w:bCs/>
+        </w:rPr>
+        <w:t>alto</w:t>
+      </w:r>
+      <w:r>
+        <w:t xml:space="preserve"> R11; </w:t>
+      </w:r>
+      <w:r>
+        <w:rPr>
+          <w:b/>
+          <w:bCs/>
+        </w:rPr>
+        <w:t>medio</w:t>
+      </w:r>
+      <w:r>
+        <w:t xml:space="preserve"> R01, R02, R04, R06, R07, R09, R10, R12, R13; </w:t>
+      </w:r>
+      <w:r>
+        <w:rPr>
+          <w:b/>
+          <w:bCs/>
+        </w:rPr>
+        <w:t>bajo</w:t>
+      </w:r>
+      <w:r>
+        <w:t xml:space="preserve"> R03, R05, R08. El riesgo alto (R11, compromiso de cuentas de la plataforma) baja a medio cuando el equipo active 2FA en sus cuentas de Railway, GitHub y Google. Los riesgos medios de valor 5 (impacto alto con probabilidad mínima) se aceptan con monitoreo; los de valor 6 a 8 se tratan como mejoras en la sección 7.</w:t>
       </w:r>
     </w:p>
     <w:p>
@@ -14466,7 +14828,7 @@
         <w:pStyle w:val="Ttulo1"/>
         <w:pageBreakBefore/>
       </w:pPr>
-      <w:bookmarkStart w:id="11" w:name="_Toc242047415"/>
+      <w:bookmarkStart w:id="11" w:name="_Toc242055561"/>
       <w:r>
         <w:t>4. Configuración IAM</w:t>
       </w:r>
@@ -14505,7 +14867,7 @@
       <w:pPr>
         <w:pStyle w:val="Ttulo2"/>
       </w:pPr>
-      <w:bookmarkStart w:id="12" w:name="_Toc242047416"/>
+      <w:bookmarkStart w:id="12" w:name="_Toc242055562"/>
       <w:r>
         <w:t>4.1 Nivel plataforma (Railway y GitHub)</w:t>
       </w:r>
@@ -14517,17 +14879,37 @@
         <w:jc w:val="both"/>
       </w:pPr>
       <w:r>
-        <w:t xml:space="preserve">Railway no tiene “cuenta raíz” como AWS. Su equivalente es el rol </w:t>
+        <w:t xml:space="preserve">Railway no tiene “cuenta raíz” como AWS. Su equivalente es el </w:t>
       </w:r>
       <w:r>
         <w:rPr>
           <w:b/>
           <w:bCs/>
         </w:rPr>
-        <w:t>Owner</w:t>
+        <w:t>titular del workspace</w:t>
       </w:r>
       <w:r>
-        <w:t xml:space="preserve"> del proyecto, que se reserva para la administración y la facturación y no se usa en la operación diaria. Los roles de proyecto disponibles son Owner (administración completa), Editor (despliega y configura, sin acciones destructivas) y Viewer (solo lectura, sin acceso a variables).</w:t>
+        <w:t xml:space="preserve">, que tiene acceso total y se reserva para la administración y la facturación. A los demás se les invita al proyecto con uno de los dos permisos que ofrece la interfaz: </w:t>
+      </w:r>
+      <w:r>
+        <w:rPr>
+          <w:b/>
+          <w:bCs/>
+        </w:rPr>
+        <w:t>Can Edit</w:t>
+      </w:r>
+      <w:r>
+        <w:t xml:space="preserve"> (en la documentación, «Editor»: despliega y cambia la configuración, pero no puede borrar servicios ni el proyecto) y </w:t>
+      </w:r>
+      <w:r>
+        <w:rPr>
+          <w:b/>
+          <w:bCs/>
+        </w:rPr>
+        <w:t>Can View</w:t>
+      </w:r>
+      <w:r>
+        <w:t xml:space="preserve"> («Viewer»: solo lectura, no puede desplegar ni ver variables de entorno). Fuente: docs.railway.com/guides/lock-down-production-project.</w:t>
       </w:r>
     </w:p>
     <w:tbl>
@@ -14548,10 +14930,10 @@
         <w:tblLook w:val="04A0" w:firstRow="1" w:lastRow="0" w:firstColumn="1" w:lastColumn="0" w:noHBand="0" w:noVBand="1"/>
       </w:tblPr>
       <w:tblGrid>
-        <w:gridCol w:w="2500"/>
+        <w:gridCol w:w="2800"/>
         <w:gridCol w:w="1900"/>
-        <w:gridCol w:w="1700"/>
-        <w:gridCol w:w="3260"/>
+        <w:gridCol w:w="2200"/>
+        <w:gridCol w:w="2460"/>
       </w:tblGrid>
       <w:tr>
         <w:tblPrEx>
@@ -14565,7 +14947,7 @@
         </w:trPr>
         <w:tc>
           <w:tcPr>
-            <w:tcW w:w="2500" w:type="dxa"/>
+            <w:tcW w:w="2800" w:type="dxa"/>
             <w:tcBorders>
               <w:top w:val="single" w:sz="4" w:space="0" w:color="C9D1DC"/>
               <w:left w:val="single" w:sz="4" w:space="0" w:color="C9D1DC"/>
@@ -14633,7 +15015,7 @@
         </w:tc>
         <w:tc>
           <w:tcPr>
-            <w:tcW w:w="1700" w:type="dxa"/>
+            <w:tcW w:w="2200" w:type="dxa"/>
             <w:tcBorders>
               <w:top w:val="single" w:sz="4" w:space="0" w:color="C9D1DC"/>
               <w:left w:val="single" w:sz="4" w:space="0" w:color="C9D1DC"/>
@@ -14667,7 +15049,7 @@
         </w:tc>
         <w:tc>
           <w:tcPr>
-            <w:tcW w:w="3260" w:type="dxa"/>
+            <w:tcW w:w="2460" w:type="dxa"/>
             <w:tcBorders>
               <w:top w:val="single" w:sz="4" w:space="0" w:color="C9D1DC"/>
               <w:left w:val="single" w:sz="4" w:space="0" w:color="C9D1DC"/>
@@ -14712,31 +15094,31 @@
         </w:trPr>
         <w:tc>
           <w:tcPr>
-            <w:tcW w:w="2500" w:type="dxa"/>
-            <w:tcBorders>
-              <w:top w:val="single" w:sz="4" w:space="0" w:color="C9D1DC"/>
-              <w:left w:val="single" w:sz="4" w:space="0" w:color="C9D1DC"/>
-              <w:bottom w:val="single" w:sz="4" w:space="0" w:color="C9D1DC"/>
-              <w:right w:val="single" w:sz="4" w:space="0" w:color="C9D1DC"/>
-            </w:tcBorders>
-            <w:tcMar>
-              <w:top w:w="60" w:type="dxa"/>
-              <w:left w:w="90" w:type="dxa"/>
-              <w:bottom w:w="60" w:type="dxa"/>
-              <w:right w:w="90" w:type="dxa"/>
-            </w:tcMar>
-            <w:vAlign w:val="center"/>
-          </w:tcPr>
-          <w:p>
-            <w:pPr>
-              <w:spacing w:after="20"/>
-            </w:pPr>
-            <w:r>
-              <w:rPr>
-                <w:sz w:val="18"/>
-                <w:szCs w:val="18"/>
-              </w:rPr>
-              <w:t>Javier Muñoz (arquitecto, titular de la cuenta)</w:t>
+            <w:tcW w:w="2800" w:type="dxa"/>
+            <w:tcBorders>
+              <w:top w:val="single" w:sz="4" w:space="0" w:color="C9D1DC"/>
+              <w:left w:val="single" w:sz="4" w:space="0" w:color="C9D1DC"/>
+              <w:bottom w:val="single" w:sz="4" w:space="0" w:color="C9D1DC"/>
+              <w:right w:val="single" w:sz="4" w:space="0" w:color="C9D1DC"/>
+            </w:tcBorders>
+            <w:tcMar>
+              <w:top w:w="60" w:type="dxa"/>
+              <w:left w:w="90" w:type="dxa"/>
+              <w:bottom w:w="60" w:type="dxa"/>
+              <w:right w:w="90" w:type="dxa"/>
+            </w:tcMar>
+            <w:vAlign w:val="center"/>
+          </w:tcPr>
+          <w:p>
+            <w:pPr>
+              <w:spacing w:after="20"/>
+            </w:pPr>
+            <w:r>
+              <w:rPr>
+                <w:sz w:val="18"/>
+                <w:szCs w:val="18"/>
+              </w:rPr>
+              <w:t>Javier Muñoz (arquitecto)</w:t>
             </w:r>
           </w:p>
         </w:tc>
@@ -14766,67 +15148,68 @@
                 <w:sz w:val="18"/>
                 <w:szCs w:val="18"/>
               </w:rPr>
-              <w:t>Owner (activar 2FA)</w:t>
-            </w:r>
-          </w:p>
-        </w:tc>
-        <w:tc>
-          <w:tcPr>
-            <w:tcW w:w="1700" w:type="dxa"/>
-            <w:tcBorders>
-              <w:top w:val="single" w:sz="4" w:space="0" w:color="C9D1DC"/>
-              <w:left w:val="single" w:sz="4" w:space="0" w:color="C9D1DC"/>
-              <w:bottom w:val="single" w:sz="4" w:space="0" w:color="C9D1DC"/>
-              <w:right w:val="single" w:sz="4" w:space="0" w:color="C9D1DC"/>
-            </w:tcBorders>
-            <w:tcMar>
-              <w:top w:w="60" w:type="dxa"/>
-              <w:left w:w="90" w:type="dxa"/>
-              <w:bottom w:w="60" w:type="dxa"/>
-              <w:right w:w="90" w:type="dxa"/>
-            </w:tcMar>
-            <w:vAlign w:val="center"/>
-          </w:tcPr>
-          <w:p>
-            <w:pPr>
-              <w:spacing w:after="20"/>
-            </w:pPr>
-            <w:r>
-              <w:rPr>
-                <w:sz w:val="18"/>
-                <w:szCs w:val="18"/>
-              </w:rPr>
-              <w:t>Admin del repositorio</w:t>
-            </w:r>
-          </w:p>
-        </w:tc>
-        <w:tc>
-          <w:tcPr>
-            <w:tcW w:w="3260" w:type="dxa"/>
-            <w:tcBorders>
-              <w:top w:val="single" w:sz="4" w:space="0" w:color="C9D1DC"/>
-              <w:left w:val="single" w:sz="4" w:space="0" w:color="C9D1DC"/>
-              <w:bottom w:val="single" w:sz="4" w:space="0" w:color="C9D1DC"/>
-              <w:right w:val="single" w:sz="4" w:space="0" w:color="C9D1DC"/>
-            </w:tcBorders>
-            <w:tcMar>
-              <w:top w:w="60" w:type="dxa"/>
-              <w:left w:w="90" w:type="dxa"/>
-              <w:bottom w:w="60" w:type="dxa"/>
-              <w:right w:w="90" w:type="dxa"/>
-            </w:tcMar>
-            <w:vAlign w:val="center"/>
-          </w:tcPr>
-          <w:p>
-            <w:pPr>
-              <w:spacing w:after="20"/>
-            </w:pPr>
-            <w:r>
-              <w:rPr>
-                <w:sz w:val="18"/>
-                <w:szCs w:val="18"/>
-              </w:rPr>
-              <w:t>Administración y facturación; uso excepcional</w:t>
+              <w:t>Titular del workspace</w:t>
+            </w:r>
+          </w:p>
+        </w:tc>
+        <w:tc>
+          <w:tcPr>
+            <w:tcW w:w="2200" w:type="dxa"/>
+            <w:tcBorders>
+              <w:top w:val="single" w:sz="4" w:space="0" w:color="C9D1DC"/>
+              <w:left w:val="single" w:sz="4" w:space="0" w:color="C9D1DC"/>
+              <w:bottom w:val="single" w:sz="4" w:space="0" w:color="C9D1DC"/>
+              <w:right w:val="single" w:sz="4" w:space="0" w:color="C9D1DC"/>
+            </w:tcBorders>
+            <w:tcMar>
+              <w:top w:w="60" w:type="dxa"/>
+              <w:left w:w="90" w:type="dxa"/>
+              <w:bottom w:w="60" w:type="dxa"/>
+              <w:right w:w="90" w:type="dxa"/>
+            </w:tcMar>
+            <w:vAlign w:val="center"/>
+          </w:tcPr>
+          <w:p>
+            <w:pPr>
+              <w:spacing w:after="20"/>
+            </w:pPr>
+            <w:r>
+              <w:rPr>
+                <w:sz w:val="18"/>
+                <w:szCs w:val="18"/>
+              </w:rPr>
+              <w:t>Dueño del repositorio</w:t>
+            </w:r>
+          </w:p>
+        </w:tc>
+        <w:tc>
+          <w:tcPr>
+            <w:tcW w:w="2460" w:type="dxa"/>
+            <w:tcBorders>
+              <w:top w:val="single" w:sz="4" w:space="0" w:color="C9D1DC"/>
+              <w:left w:val="single" w:sz="4" w:space="0" w:color="C9D1DC"/>
+              <w:bottom w:val="single" w:sz="4" w:space="0" w:color="C9D1DC"/>
+              <w:right w:val="single" w:sz="4" w:space="0" w:color="C9D1DC"/>
+            </w:tcBorders>
+            <w:shd w:val="clear" w:color="auto" w:fill="E2EFDA"/>
+            <w:tcMar>
+              <w:top w:w="60" w:type="dxa"/>
+              <w:left w:w="90" w:type="dxa"/>
+              <w:bottom w:w="60" w:type="dxa"/>
+              <w:right w:w="90" w:type="dxa"/>
+            </w:tcMar>
+            <w:vAlign w:val="center"/>
+          </w:tcPr>
+          <w:p>
+            <w:pPr>
+              <w:spacing w:after="20"/>
+            </w:pPr>
+            <w:r>
+              <w:rPr>
+                <w:sz w:val="18"/>
+                <w:szCs w:val="18"/>
+              </w:rPr>
+              <w:t>Aplicado</w:t>
             </w:r>
           </w:p>
         </w:tc>
@@ -14843,7 +15226,7 @@
         </w:trPr>
         <w:tc>
           <w:tcPr>
-            <w:tcW w:w="2500" w:type="dxa"/>
+            <w:tcW w:w="2800" w:type="dxa"/>
             <w:tcBorders>
               <w:top w:val="single" w:sz="4" w:space="0" w:color="C9D1DC"/>
               <w:left w:val="single" w:sz="4" w:space="0" w:color="C9D1DC"/>
@@ -14899,13 +15282,13 @@
                 <w:sz w:val="18"/>
                 <w:szCs w:val="18"/>
               </w:rPr>
-              <w:t>Editor</w:t>
-            </w:r>
-          </w:p>
-        </w:tc>
-        <w:tc>
-          <w:tcPr>
-            <w:tcW w:w="1700" w:type="dxa"/>
+              <w:t>Can Edit</w:t>
+            </w:r>
+          </w:p>
+        </w:tc>
+        <w:tc>
+          <w:tcPr>
+            <w:tcW w:w="2200" w:type="dxa"/>
             <w:tcBorders>
               <w:top w:val="single" w:sz="4" w:space="0" w:color="C9D1DC"/>
               <w:left w:val="single" w:sz="4" w:space="0" w:color="C9D1DC"/>
@@ -14936,32 +15319,32 @@
         </w:tc>
         <w:tc>
           <w:tcPr>
-            <w:tcW w:w="3260" w:type="dxa"/>
-            <w:tcBorders>
-              <w:top w:val="single" w:sz="4" w:space="0" w:color="C9D1DC"/>
-              <w:left w:val="single" w:sz="4" w:space="0" w:color="C9D1DC"/>
-              <w:bottom w:val="single" w:sz="4" w:space="0" w:color="C9D1DC"/>
-              <w:right w:val="single" w:sz="4" w:space="0" w:color="C9D1DC"/>
-            </w:tcBorders>
-            <w:shd w:val="clear" w:color="auto" w:fill="F6F8FB"/>
-            <w:tcMar>
-              <w:top w:w="60" w:type="dxa"/>
-              <w:left w:w="90" w:type="dxa"/>
-              <w:bottom w:w="60" w:type="dxa"/>
-              <w:right w:w="90" w:type="dxa"/>
-            </w:tcMar>
-            <w:vAlign w:val="center"/>
-          </w:tcPr>
-          <w:p>
-            <w:pPr>
-              <w:spacing w:after="20"/>
-            </w:pPr>
-            <w:r>
-              <w:rPr>
-                <w:sz w:val="18"/>
-                <w:szCs w:val="18"/>
-              </w:rPr>
-              <w:t>Despliega cambios; no puede borrar servicios</w:t>
+            <w:tcW w:w="2460" w:type="dxa"/>
+            <w:tcBorders>
+              <w:top w:val="single" w:sz="4" w:space="0" w:color="C9D1DC"/>
+              <w:left w:val="single" w:sz="4" w:space="0" w:color="C9D1DC"/>
+              <w:bottom w:val="single" w:sz="4" w:space="0" w:color="C9D1DC"/>
+              <w:right w:val="single" w:sz="4" w:space="0" w:color="C9D1DC"/>
+            </w:tcBorders>
+            <w:shd w:val="clear" w:color="auto" w:fill="FFF2CC"/>
+            <w:tcMar>
+              <w:top w:w="60" w:type="dxa"/>
+              <w:left w:w="90" w:type="dxa"/>
+              <w:bottom w:w="60" w:type="dxa"/>
+              <w:right w:w="90" w:type="dxa"/>
+            </w:tcMar>
+            <w:vAlign w:val="center"/>
+          </w:tcPr>
+          <w:p>
+            <w:pPr>
+              <w:spacing w:after="20"/>
+            </w:pPr>
+            <w:r>
+              <w:rPr>
+                <w:sz w:val="18"/>
+                <w:szCs w:val="18"/>
+              </w:rPr>
+              <w:t>Pendiente: invitación</w:t>
             </w:r>
           </w:p>
         </w:tc>
@@ -14978,7 +15361,7 @@
         </w:trPr>
         <w:tc>
           <w:tcPr>
-            <w:tcW w:w="2500" w:type="dxa"/>
+            <w:tcW w:w="2800" w:type="dxa"/>
             <w:tcBorders>
               <w:top w:val="single" w:sz="4" w:space="0" w:color="C9D1DC"/>
               <w:left w:val="single" w:sz="4" w:space="0" w:color="C9D1DC"/>
@@ -15032,13 +15415,13 @@
                 <w:sz w:val="18"/>
                 <w:szCs w:val="18"/>
               </w:rPr>
-              <w:t>Editor</w:t>
-            </w:r>
-          </w:p>
-        </w:tc>
-        <w:tc>
-          <w:tcPr>
-            <w:tcW w:w="1700" w:type="dxa"/>
+              <w:t>Can Edit</w:t>
+            </w:r>
+          </w:p>
+        </w:tc>
+        <w:tc>
+          <w:tcPr>
+            <w:tcW w:w="2200" w:type="dxa"/>
             <w:tcBorders>
               <w:top w:val="single" w:sz="4" w:space="0" w:color="C9D1DC"/>
               <w:left w:val="single" w:sz="4" w:space="0" w:color="C9D1DC"/>
@@ -15068,31 +15451,32 @@
         </w:tc>
         <w:tc>
           <w:tcPr>
-            <w:tcW w:w="3260" w:type="dxa"/>
-            <w:tcBorders>
-              <w:top w:val="single" w:sz="4" w:space="0" w:color="C9D1DC"/>
-              <w:left w:val="single" w:sz="4" w:space="0" w:color="C9D1DC"/>
-              <w:bottom w:val="single" w:sz="4" w:space="0" w:color="C9D1DC"/>
-              <w:right w:val="single" w:sz="4" w:space="0" w:color="C9D1DC"/>
-            </w:tcBorders>
-            <w:tcMar>
-              <w:top w:w="60" w:type="dxa"/>
-              <w:left w:w="90" w:type="dxa"/>
-              <w:bottom w:w="60" w:type="dxa"/>
-              <w:right w:w="90" w:type="dxa"/>
-            </w:tcMar>
-            <w:vAlign w:val="center"/>
-          </w:tcPr>
-          <w:p>
-            <w:pPr>
-              <w:spacing w:after="20"/>
-            </w:pPr>
-            <w:r>
-              <w:rPr>
-                <w:sz w:val="18"/>
-                <w:szCs w:val="18"/>
-              </w:rPr>
-              <w:t>Configura red, variables y réplicas</w:t>
+            <w:tcW w:w="2460" w:type="dxa"/>
+            <w:tcBorders>
+              <w:top w:val="single" w:sz="4" w:space="0" w:color="C9D1DC"/>
+              <w:left w:val="single" w:sz="4" w:space="0" w:color="C9D1DC"/>
+              <w:bottom w:val="single" w:sz="4" w:space="0" w:color="C9D1DC"/>
+              <w:right w:val="single" w:sz="4" w:space="0" w:color="C9D1DC"/>
+            </w:tcBorders>
+            <w:shd w:val="clear" w:color="auto" w:fill="FFF2CC"/>
+            <w:tcMar>
+              <w:top w:w="60" w:type="dxa"/>
+              <w:left w:w="90" w:type="dxa"/>
+              <w:bottom w:w="60" w:type="dxa"/>
+              <w:right w:w="90" w:type="dxa"/>
+            </w:tcMar>
+            <w:vAlign w:val="center"/>
+          </w:tcPr>
+          <w:p>
+            <w:pPr>
+              <w:spacing w:after="20"/>
+            </w:pPr>
+            <w:r>
+              <w:rPr>
+                <w:sz w:val="18"/>
+                <w:szCs w:val="18"/>
+              </w:rPr>
+              <w:t>Pendiente: invitación</w:t>
             </w:r>
           </w:p>
         </w:tc>
@@ -15109,7 +15493,7 @@
         </w:trPr>
         <w:tc>
           <w:tcPr>
-            <w:tcW w:w="2500" w:type="dxa"/>
+            <w:tcW w:w="2800" w:type="dxa"/>
             <w:tcBorders>
               <w:top w:val="single" w:sz="4" w:space="0" w:color="C9D1DC"/>
               <w:left w:val="single" w:sz="4" w:space="0" w:color="C9D1DC"/>
@@ -15134,7 +15518,7 @@
                 <w:sz w:val="18"/>
                 <w:szCs w:val="18"/>
               </w:rPr>
-              <w:t>Freddy Asenjo Pérez (docente, revisión)</w:t>
+              <w:t>Freddy Asenjo Pérez (docente)</w:t>
             </w:r>
           </w:p>
         </w:tc>
@@ -15165,13 +15549,13 @@
                 <w:sz w:val="18"/>
                 <w:szCs w:val="18"/>
               </w:rPr>
-              <w:t>Viewer</w:t>
-            </w:r>
-          </w:p>
-        </w:tc>
-        <w:tc>
-          <w:tcPr>
-            <w:tcW w:w="1700" w:type="dxa"/>
+              <w:t>Can View</w:t>
+            </w:r>
+          </w:p>
+        </w:tc>
+        <w:tc>
+          <w:tcPr>
+            <w:tcW w:w="2200" w:type="dxa"/>
             <w:tcBorders>
               <w:top w:val="single" w:sz="4" w:space="0" w:color="C9D1DC"/>
               <w:left w:val="single" w:sz="4" w:space="0" w:color="C9D1DC"/>
@@ -15196,13 +15580,13 @@
                 <w:sz w:val="18"/>
                 <w:szCs w:val="18"/>
               </w:rPr>
-              <w:t>Read (opcional)</w:t>
-            </w:r>
-          </w:p>
-        </w:tc>
-        <w:tc>
-          <w:tcPr>
-            <w:tcW w:w="3260" w:type="dxa"/>
+              <w:t>Lectura (repositorio público)</w:t>
+            </w:r>
+          </w:p>
+        </w:tc>
+        <w:tc>
+          <w:tcPr>
+            <w:tcW w:w="2460" w:type="dxa"/>
             <w:tcBorders>
               <w:top w:val="single" w:sz="4" w:space="0" w:color="C9D1DC"/>
               <w:left w:val="single" w:sz="4" w:space="0" w:color="C9D1DC"/>
@@ -15227,7 +15611,7 @@
                 <w:sz w:val="18"/>
                 <w:szCs w:val="18"/>
               </w:rPr>
-              <w:t>Evaluación sin capacidad de cambio</w:t>
+              <w:t>Repo: aplicado · Railway: opcional</w:t>
             </w:r>
           </w:p>
         </w:tc>
@@ -15244,7 +15628,7 @@
         </w:trPr>
         <w:tc>
           <w:tcPr>
-            <w:tcW w:w="2500" w:type="dxa"/>
+            <w:tcW w:w="2800" w:type="dxa"/>
             <w:tcBorders>
               <w:top w:val="single" w:sz="4" w:space="0" w:color="C9D1DC"/>
               <w:left w:val="single" w:sz="4" w:space="0" w:color="C9D1DC"/>
@@ -15304,7 +15688,7 @@
         </w:tc>
         <w:tc>
           <w:tcPr>
-            <w:tcW w:w="1700" w:type="dxa"/>
+            <w:tcW w:w="2200" w:type="dxa"/>
             <w:tcBorders>
               <w:top w:val="single" w:sz="4" w:space="0" w:color="C9D1DC"/>
               <w:left w:val="single" w:sz="4" w:space="0" w:color="C9D1DC"/>
@@ -15334,36 +15718,102 @@
         </w:tc>
         <w:tc>
           <w:tcPr>
-            <w:tcW w:w="3260" w:type="dxa"/>
-            <w:tcBorders>
-              <w:top w:val="single" w:sz="4" w:space="0" w:color="C9D1DC"/>
-              <w:left w:val="single" w:sz="4" w:space="0" w:color="C9D1DC"/>
-              <w:bottom w:val="single" w:sz="4" w:space="0" w:color="C9D1DC"/>
-              <w:right w:val="single" w:sz="4" w:space="0" w:color="C9D1DC"/>
-            </w:tcBorders>
-            <w:tcMar>
-              <w:top w:w="60" w:type="dxa"/>
-              <w:left w:w="90" w:type="dxa"/>
-              <w:bottom w:w="60" w:type="dxa"/>
-              <w:right w:w="90" w:type="dxa"/>
-            </w:tcMar>
-            <w:vAlign w:val="center"/>
-          </w:tcPr>
-          <w:p>
-            <w:pPr>
-              <w:spacing w:after="20"/>
-            </w:pPr>
-            <w:r>
-              <w:rPr>
-                <w:sz w:val="18"/>
-                <w:szCs w:val="18"/>
-              </w:rPr>
-              <w:t>Despliegue automático sin credenciales personales</w:t>
+            <w:tcW w:w="2460" w:type="dxa"/>
+            <w:tcBorders>
+              <w:top w:val="single" w:sz="4" w:space="0" w:color="C9D1DC"/>
+              <w:left w:val="single" w:sz="4" w:space="0" w:color="C9D1DC"/>
+              <w:bottom w:val="single" w:sz="4" w:space="0" w:color="C9D1DC"/>
+              <w:right w:val="single" w:sz="4" w:space="0" w:color="C9D1DC"/>
+            </w:tcBorders>
+            <w:shd w:val="clear" w:color="auto" w:fill="E2EFDA"/>
+            <w:tcMar>
+              <w:top w:w="60" w:type="dxa"/>
+              <w:left w:w="90" w:type="dxa"/>
+              <w:bottom w:w="60" w:type="dxa"/>
+              <w:right w:w="90" w:type="dxa"/>
+            </w:tcMar>
+            <w:vAlign w:val="center"/>
+          </w:tcPr>
+          <w:p>
+            <w:pPr>
+              <w:spacing w:after="20"/>
+            </w:pPr>
+            <w:r>
+              <w:rPr>
+                <w:sz w:val="18"/>
+                <w:szCs w:val="18"/>
+              </w:rPr>
+              <w:t>Aplicado</w:t>
             </w:r>
           </w:p>
         </w:tc>
       </w:tr>
     </w:tbl>
+    <w:p>
+      <w:pPr>
+        <w:spacing w:before="120" w:after="60"/>
+        <w:jc w:val="center"/>
+      </w:pPr>
+      <w:r>
+        <w:rPr>
+          <w:noProof/>
+        </w:rPr>
+        <w:drawing>
+          <wp:inline distT="0" distB="0" distL="0" distR="0" wp14:anchorId="388F0E8F" wp14:editId="632E5ADD">
+            <wp:extent cx="5334000" cy="2333625"/>
+            <wp:effectExtent l="0" t="0" r="0" b="0"/>
+            <wp:docPr id="2" name="Imagen 2"/>
+            <wp:cNvGraphicFramePr>
+              <a:graphicFrameLocks xmlns:a="http://schemas.openxmlformats.org/drawingml/2006/main" noChangeAspect="1"/>
+            </wp:cNvGraphicFramePr>
+            <a:graphic xmlns:a="http://schemas.openxmlformats.org/drawingml/2006/main">
+              <a:graphicData uri="http://schemas.openxmlformats.org/drawingml/2006/picture">
+                <pic:pic xmlns:pic="http://schemas.openxmlformats.org/drawingml/2006/picture">
+                  <pic:nvPicPr>
+                    <pic:cNvPr id="0" name=""/>
+                    <pic:cNvPicPr>
+                      <a:picLocks noChangeAspect="1" noChangeArrowheads="1"/>
+                    </pic:cNvPicPr>
+                  </pic:nvPicPr>
+                  <pic:blipFill>
+                    <a:blip r:embed="rId8"/>
+                    <a:srcRect/>
+                    <a:stretch>
+                      <a:fillRect/>
+                    </a:stretch>
+                  </pic:blipFill>
+                  <pic:spPr bwMode="auto">
+                    <a:xfrm>
+                      <a:off x="0" y="0"/>
+                      <a:ext cx="5334000" cy="2333625"/>
+                    </a:xfrm>
+                    <a:prstGeom prst="rect">
+                      <a:avLst/>
+                    </a:prstGeom>
+                  </pic:spPr>
+                </pic:pic>
+              </a:graphicData>
+            </a:graphic>
+          </wp:inline>
+        </w:drawing>
+      </w:r>
+    </w:p>
+    <w:p>
+      <w:pPr>
+        <w:spacing w:after="240"/>
+        <w:jc w:val="center"/>
+      </w:pPr>
+      <w:r>
+        <w:rPr>
+          <w:i/>
+          <w:iCs/>
+          <w:color w:val="5B6676"/>
+          <w:sz w:val="18"/>
+          <w:szCs w:val="18"/>
+        </w:rPr>
+        <w:t>Figura 2. Members del proyecto en Railway al 05-10-2026: solo el titular tiene acceso; las invitaciones del equipo están pendientes.</w:t>
+      </w:r>
+    </w:p>
     <w:p>
       <w:pPr>
         <w:spacing w:after="120" w:line="276" w:lineRule="auto"/>
@@ -15374,10 +15824,10 @@
           <w:b/>
           <w:bCs/>
         </w:rPr>
-        <w:t>Procedimiento:</w:t>
+        <w:t>Procedimiento pendiente:</w:t>
       </w:r>
       <w:r>
-        <w:t xml:space="preserve"> en Railway → Project Settings → Members, invitar a cada integrante con su rol; en Account → Security, activar 2FA. Para automatizaciones se usan </w:t>
+        <w:t xml:space="preserve"> en Railway → Project Settings → Members → Invite, invitar a cada integrante con su permiso; en Account → Security, activar 2FA. Para automatizaciones se usan </w:t>
       </w:r>
       <w:r>
         <w:rPr>
@@ -15394,7 +15844,7 @@
       <w:pPr>
         <w:pStyle w:val="Ttulo2"/>
       </w:pPr>
-      <w:bookmarkStart w:id="13" w:name="_Toc242047417"/>
+      <w:bookmarkStart w:id="13" w:name="_Toc242055563"/>
       <w:r>
         <w:t>4.2 Nivel aplicación: RBAC</w:t>
       </w:r>
@@ -16847,7 +17297,7 @@
       <w:pPr>
         <w:pStyle w:val="Ttulo2"/>
       </w:pPr>
-      <w:bookmarkStart w:id="14" w:name="_Toc242047418"/>
+      <w:bookmarkStart w:id="14" w:name="_Toc242055564"/>
       <w:r>
         <w:t>4.3 Políticas de autenticación y sesión</w:t>
       </w:r>
@@ -17464,7 +17914,7 @@
                 <w:sz w:val="18"/>
                 <w:szCs w:val="18"/>
               </w:rPr>
-              <w:t>10 intentos de login por minuto por IP (HTTP 429)</w:t>
+              <w:t>10 intentos de login por minuto por IP en cada réplica (contador en memoria) → HTTP 429. Verificado en producción: primer 429 en el intento 12 de 30 (sección 6.4)</w:t>
             </w:r>
           </w:p>
         </w:tc>
@@ -17914,7 +18364,7 @@
       <w:pPr>
         <w:pStyle w:val="Ttulo2"/>
       </w:pPr>
-      <w:bookmarkStart w:id="15" w:name="_Toc242047419"/>
+      <w:bookmarkStart w:id="15" w:name="_Toc242055565"/>
       <w:r>
         <w:t>4.4 Autenticación de doble factor con Firebase</w:t>
       </w:r>
@@ -18726,72 +19176,7 @@
           <w:noProof/>
         </w:rPr>
         <w:drawing>
-          <wp:inline distT="0" distB="0" distL="0" distR="0" wp14:anchorId="40FCC92F" wp14:editId="3CBEF30E">
-            <wp:extent cx="4953000" cy="2905125"/>
-            <wp:effectExtent l="0" t="0" r="0" b="0"/>
-            <wp:docPr id="2" name="Imagen 2"/>
-            <wp:cNvGraphicFramePr>
-              <a:graphicFrameLocks xmlns:a="http://schemas.openxmlformats.org/drawingml/2006/main" noChangeAspect="1"/>
-            </wp:cNvGraphicFramePr>
-            <a:graphic xmlns:a="http://schemas.openxmlformats.org/drawingml/2006/main">
-              <a:graphicData uri="http://schemas.openxmlformats.org/drawingml/2006/picture">
-                <pic:pic xmlns:pic="http://schemas.openxmlformats.org/drawingml/2006/picture">
-                  <pic:nvPicPr>
-                    <pic:cNvPr id="0" name=""/>
-                    <pic:cNvPicPr>
-                      <a:picLocks noChangeAspect="1" noChangeArrowheads="1"/>
-                    </pic:cNvPicPr>
-                  </pic:nvPicPr>
-                  <pic:blipFill>
-                    <a:blip r:embed="rId8"/>
-                    <a:srcRect/>
-                    <a:stretch>
-                      <a:fillRect/>
-                    </a:stretch>
-                  </pic:blipFill>
-                  <pic:spPr bwMode="auto">
-                    <a:xfrm>
-                      <a:off x="0" y="0"/>
-                      <a:ext cx="4953000" cy="2905125"/>
-                    </a:xfrm>
-                    <a:prstGeom prst="rect">
-                      <a:avLst/>
-                    </a:prstGeom>
-                  </pic:spPr>
-                </pic:pic>
-              </a:graphicData>
-            </a:graphic>
-          </wp:inline>
-        </w:drawing>
-      </w:r>
-    </w:p>
-    <w:p>
-      <w:pPr>
-        <w:spacing w:after="240"/>
-        <w:jc w:val="center"/>
-      </w:pPr>
-      <w:r>
-        <w:rPr>
-          <w:i/>
-          <w:iCs/>
-          <w:color w:val="5B6676"/>
-          <w:sz w:val="18"/>
-          <w:szCs w:val="18"/>
-        </w:rPr>
-        <w:t>Figura 2. Segundo paso del inicio de sesión: código de la app autenticadora.</w:t>
-      </w:r>
-    </w:p>
-    <w:p>
-      <w:pPr>
-        <w:spacing w:before="120" w:after="60"/>
-        <w:jc w:val="center"/>
-      </w:pPr>
-      <w:r>
-        <w:rPr>
-          <w:noProof/>
-        </w:rPr>
-        <w:drawing>
-          <wp:inline distT="0" distB="0" distL="0" distR="0" wp14:anchorId="047F37E8" wp14:editId="1F906E43">
+          <wp:inline distT="0" distB="0" distL="0" distR="0" wp14:anchorId="0460C51A" wp14:editId="0F7630BE">
             <wp:extent cx="4953000" cy="2905125"/>
             <wp:effectExtent l="0" t="0" r="0" b="0"/>
             <wp:docPr id="3" name="Imagen 3"/>
@@ -18843,7 +19228,72 @@
           <w:sz w:val="18"/>
           <w:szCs w:val="18"/>
         </w:rPr>
-        <w:t>Figura 3. Enrolamiento del segundo factor en el primer ingreso (cuenta de demostración, luego desactivada).</w:t>
+        <w:t>Figura 3. Segundo paso del inicio de sesión: código de la app autenticadora.</w:t>
+      </w:r>
+    </w:p>
+    <w:p>
+      <w:pPr>
+        <w:spacing w:before="120" w:after="60"/>
+        <w:jc w:val="center"/>
+      </w:pPr>
+      <w:r>
+        <w:rPr>
+          <w:noProof/>
+        </w:rPr>
+        <w:drawing>
+          <wp:inline distT="0" distB="0" distL="0" distR="0" wp14:anchorId="4438A8A3" wp14:editId="4CAA5738">
+            <wp:extent cx="4953000" cy="2905125"/>
+            <wp:effectExtent l="0" t="0" r="0" b="0"/>
+            <wp:docPr id="4" name="Imagen 4"/>
+            <wp:cNvGraphicFramePr>
+              <a:graphicFrameLocks xmlns:a="http://schemas.openxmlformats.org/drawingml/2006/main" noChangeAspect="1"/>
+            </wp:cNvGraphicFramePr>
+            <a:graphic xmlns:a="http://schemas.openxmlformats.org/drawingml/2006/main">
+              <a:graphicData uri="http://schemas.openxmlformats.org/drawingml/2006/picture">
+                <pic:pic xmlns:pic="http://schemas.openxmlformats.org/drawingml/2006/picture">
+                  <pic:nvPicPr>
+                    <pic:cNvPr id="0" name=""/>
+                    <pic:cNvPicPr>
+                      <a:picLocks noChangeAspect="1" noChangeArrowheads="1"/>
+                    </pic:cNvPicPr>
+                  </pic:nvPicPr>
+                  <pic:blipFill>
+                    <a:blip r:embed="rId10"/>
+                    <a:srcRect/>
+                    <a:stretch>
+                      <a:fillRect/>
+                    </a:stretch>
+                  </pic:blipFill>
+                  <pic:spPr bwMode="auto">
+                    <a:xfrm>
+                      <a:off x="0" y="0"/>
+                      <a:ext cx="4953000" cy="2905125"/>
+                    </a:xfrm>
+                    <a:prstGeom prst="rect">
+                      <a:avLst/>
+                    </a:prstGeom>
+                  </pic:spPr>
+                </pic:pic>
+              </a:graphicData>
+            </a:graphic>
+          </wp:inline>
+        </w:drawing>
+      </w:r>
+    </w:p>
+    <w:p>
+      <w:pPr>
+        <w:spacing w:after="240"/>
+        <w:jc w:val="center"/>
+      </w:pPr>
+      <w:r>
+        <w:rPr>
+          <w:i/>
+          <w:iCs/>
+          <w:color w:val="5B6676"/>
+          <w:sz w:val="18"/>
+          <w:szCs w:val="18"/>
+        </w:rPr>
+        <w:t>Figura 4. Enrolamiento del segundo factor en el primer ingreso. Cuenta de demostración demo.2fa.11177@portal.cl, deshabilitada en Firebase: la clave mostrada no permite acceder.</w:t>
       </w:r>
     </w:p>
     <w:p>
@@ -18867,7 +19317,7 @@
         <w:pStyle w:val="Ttulo1"/>
         <w:pageBreakBefore/>
       </w:pPr>
-      <w:bookmarkStart w:id="16" w:name="_Toc242047420"/>
+      <w:bookmarkStart w:id="16" w:name="_Toc242055566"/>
       <w:r>
         <w:t>5. Seguridad de red y hardening</w:t>
       </w:r>
@@ -18877,7 +19327,7 @@
       <w:pPr>
         <w:pStyle w:val="Ttulo2"/>
       </w:pPr>
-      <w:bookmarkStart w:id="17" w:name="_Toc242047421"/>
+      <w:bookmarkStart w:id="17" w:name="_Toc242055567"/>
       <w:r>
         <w:t>5.1 Segmentación</w:t>
       </w:r>
@@ -19314,7 +19764,7 @@
                 <w:sz w:val="18"/>
                 <w:szCs w:val="18"/>
               </w:rPr>
-              <w:t>describe-service: 1 dominio, 0 proxies TCP</w:t>
+              <w:t>Anexo B: 1 dominio, 0 proxies TCP</w:t>
             </w:r>
           </w:p>
         </w:tc>
@@ -19445,12 +19895,77 @@
                 <w:sz w:val="18"/>
                 <w:szCs w:val="18"/>
               </w:rPr>
-              <w:t>describe-service: 0 dominios, 0 proxies TCP</w:t>
+              <w:t>Anexo B: 0 dominios, 0 proxies TCP; Figura 5</w:t>
             </w:r>
           </w:p>
         </w:tc>
       </w:tr>
     </w:tbl>
+    <w:p>
+      <w:pPr>
+        <w:spacing w:before="120" w:after="60"/>
+        <w:jc w:val="center"/>
+      </w:pPr>
+      <w:r>
+        <w:rPr>
+          <w:noProof/>
+        </w:rPr>
+        <w:drawing>
+          <wp:inline distT="0" distB="0" distL="0" distR="0" wp14:anchorId="3DE0EFA9" wp14:editId="79570AF2">
+            <wp:extent cx="5334000" cy="2333625"/>
+            <wp:effectExtent l="0" t="0" r="0" b="0"/>
+            <wp:docPr id="5" name="Imagen 5"/>
+            <wp:cNvGraphicFramePr>
+              <a:graphicFrameLocks xmlns:a="http://schemas.openxmlformats.org/drawingml/2006/main" noChangeAspect="1"/>
+            </wp:cNvGraphicFramePr>
+            <a:graphic xmlns:a="http://schemas.openxmlformats.org/drawingml/2006/main">
+              <a:graphicData uri="http://schemas.openxmlformats.org/drawingml/2006/picture">
+                <pic:pic xmlns:pic="http://schemas.openxmlformats.org/drawingml/2006/picture">
+                  <pic:nvPicPr>
+                    <pic:cNvPr id="0" name=""/>
+                    <pic:cNvPicPr>
+                      <a:picLocks noChangeAspect="1" noChangeArrowheads="1"/>
+                    </pic:cNvPicPr>
+                  </pic:nvPicPr>
+                  <pic:blipFill>
+                    <a:blip r:embed="rId11"/>
+                    <a:srcRect/>
+                    <a:stretch>
+                      <a:fillRect/>
+                    </a:stretch>
+                  </pic:blipFill>
+                  <pic:spPr bwMode="auto">
+                    <a:xfrm>
+                      <a:off x="0" y="0"/>
+                      <a:ext cx="5334000" cy="2333625"/>
+                    </a:xfrm>
+                    <a:prstGeom prst="rect">
+                      <a:avLst/>
+                    </a:prstGeom>
+                  </pic:spPr>
+                </pic:pic>
+              </a:graphicData>
+            </a:graphic>
+          </wp:inline>
+        </w:drawing>
+      </w:r>
+    </w:p>
+    <w:p>
+      <w:pPr>
+        <w:spacing w:after="240"/>
+        <w:jc w:val="center"/>
+      </w:pPr>
+      <w:r>
+        <w:rPr>
+          <w:i/>
+          <w:iCs/>
+          <w:color w:val="5B6676"/>
+          <w:sz w:val="18"/>
+          <w:szCs w:val="18"/>
+        </w:rPr>
+        <w:t>Figura 5. Networking de Postgres en Railway: sin acceso público (solo se ofrece “Add Public Access”) y único endpoint privado postgres.railway.internal.</w:t>
+      </w:r>
+    </w:p>
     <w:p>
       <w:pPr>
         <w:spacing w:after="120" w:line="276" w:lineRule="auto"/>
@@ -19474,7 +19989,7 @@
       <w:pPr>
         <w:pStyle w:val="Ttulo2"/>
       </w:pPr>
-      <w:bookmarkStart w:id="18" w:name="_Toc242047422"/>
+      <w:bookmarkStart w:id="18" w:name="_Toc242055568"/>
       <w:r>
         <w:t>5.2 Medidas de endurecimiento aplicadas</w:t>
       </w:r>
@@ -20541,7 +21056,7 @@
       <w:pPr>
         <w:pStyle w:val="Ttulo2"/>
       </w:pPr>
-      <w:bookmarkStart w:id="19" w:name="_Toc242047423"/>
+      <w:bookmarkStart w:id="19" w:name="_Toc242055569"/>
       <w:r>
         <w:t>5.3 Registro de eventos (logging)</w:t>
       </w:r>
@@ -20576,10 +21091,10 @@
           <w:noProof/>
         </w:rPr>
         <w:drawing>
-          <wp:inline distT="0" distB="0" distL="0" distR="0" wp14:anchorId="02E2D5E9" wp14:editId="53350FC1">
+          <wp:inline distT="0" distB="0" distL="0" distR="0" wp14:anchorId="1B4BDCFA" wp14:editId="48692E6C">
             <wp:extent cx="5715000" cy="3343275"/>
             <wp:effectExtent l="0" t="0" r="0" b="0"/>
-            <wp:docPr id="4" name="Imagen 4"/>
+            <wp:docPr id="6" name="Imagen 6"/>
             <wp:cNvGraphicFramePr>
               <a:graphicFrameLocks xmlns:a="http://schemas.openxmlformats.org/drawingml/2006/main" noChangeAspect="1"/>
             </wp:cNvGraphicFramePr>
@@ -20593,7 +21108,7 @@
                     </pic:cNvPicPr>
                   </pic:nvPicPr>
                   <pic:blipFill>
-                    <a:blip r:embed="rId10"/>
+                    <a:blip r:embed="rId12"/>
                     <a:srcRect/>
                     <a:stretch>
                       <a:fillRect/>
@@ -20628,7 +21143,7 @@
           <w:sz w:val="18"/>
           <w:szCs w:val="18"/>
         </w:rPr>
-        <w:t>Figura 4. Bitácora de auditoría: ingresos con factor=password+totp, intentos sin segundo factor (login_sin_mfa) y la réplica que atendió cada evento.</w:t>
+        <w:t>Figura 6. Bitácora de auditoría: ingresos con factor=password+totp, intentos sin segundo factor (login_sin_mfa) y la réplica que atendió cada evento. Columna IP difuminada por privacidad.</w:t>
       </w:r>
     </w:p>
     <w:p>
@@ -20636,7 +21151,7 @@
         <w:pStyle w:val="Ttulo1"/>
         <w:pageBreakBefore/>
       </w:pPr>
-      <w:bookmarkStart w:id="20" w:name="_Toc242047424"/>
+      <w:bookmarkStart w:id="20" w:name="_Toc242055570"/>
       <w:r>
         <w:t>6. Pruebas de disponibilidad y validación de seguridad</w:t>
       </w:r>
@@ -20675,7 +21190,7 @@
       <w:pPr>
         <w:pStyle w:val="Ttulo2"/>
       </w:pPr>
-      <w:bookmarkStart w:id="21" w:name="_Toc242047425"/>
+      <w:bookmarkStart w:id="21" w:name="_Toc242055571"/>
       <w:r>
         <w:t>6.1 Resumen de resultados</w:t>
       </w:r>
@@ -22222,7 +22737,7 @@
       <w:pPr>
         <w:pStyle w:val="Ttulo2"/>
       </w:pPr>
-      <w:bookmarkStart w:id="22" w:name="_Toc242047426"/>
+      <w:bookmarkStart w:id="22" w:name="_Toc242055572"/>
       <w:r>
         <w:t>6.2 Pruebas de disponibilidad</w:t>
       </w:r>
@@ -23061,6 +23576,141 @@
           </w:p>
         </w:tc>
       </w:tr>
+      <w:tr>
+        <w:tblPrEx>
+          <w:tblCellMar>
+            <w:top w:w="0" w:type="dxa"/>
+            <w:bottom w:w="0" w:type="dxa"/>
+          </w:tblCellMar>
+        </w:tblPrEx>
+        <w:trPr>
+          <w:cantSplit/>
+        </w:trPr>
+        <w:tc>
+          <w:tcPr>
+            <w:tcW w:w="2000" w:type="dxa"/>
+            <w:tcBorders>
+              <w:top w:val="single" w:sz="4" w:space="0" w:color="C9D1DC"/>
+              <w:left w:val="single" w:sz="4" w:space="0" w:color="C9D1DC"/>
+              <w:bottom w:val="single" w:sz="4" w:space="0" w:color="C9D1DC"/>
+              <w:right w:val="single" w:sz="4" w:space="0" w:color="C9D1DC"/>
+            </w:tcBorders>
+            <w:shd w:val="clear" w:color="auto" w:fill="F6F8FB"/>
+            <w:tcMar>
+              <w:top w:w="60" w:type="dxa"/>
+              <w:left w:w="90" w:type="dxa"/>
+              <w:bottom w:w="60" w:type="dxa"/>
+              <w:right w:w="90" w:type="dxa"/>
+            </w:tcMar>
+            <w:vAlign w:val="center"/>
+          </w:tcPr>
+          <w:p>
+            <w:pPr>
+              <w:spacing w:after="20"/>
+            </w:pPr>
+            <w:r>
+              <w:rPr>
+                <w:sz w:val="18"/>
+                <w:szCs w:val="18"/>
+              </w:rPr>
+              <w:t>D6. Respaldos del volumen (Railway)</w:t>
+            </w:r>
+          </w:p>
+        </w:tc>
+        <w:tc>
+          <w:tcPr>
+            <w:tcW w:w="2860" w:type="dxa"/>
+            <w:tcBorders>
+              <w:top w:val="single" w:sz="4" w:space="0" w:color="C9D1DC"/>
+              <w:left w:val="single" w:sz="4" w:space="0" w:color="C9D1DC"/>
+              <w:bottom w:val="single" w:sz="4" w:space="0" w:color="C9D1DC"/>
+              <w:right w:val="single" w:sz="4" w:space="0" w:color="C9D1DC"/>
+            </w:tcBorders>
+            <w:shd w:val="clear" w:color="auto" w:fill="F6F8FB"/>
+            <w:tcMar>
+              <w:top w:w="60" w:type="dxa"/>
+              <w:left w:w="90" w:type="dxa"/>
+              <w:bottom w:w="60" w:type="dxa"/>
+              <w:right w:w="90" w:type="dxa"/>
+            </w:tcMar>
+            <w:vAlign w:val="center"/>
+          </w:tcPr>
+          <w:p>
+            <w:pPr>
+              <w:spacing w:after="20"/>
+            </w:pPr>
+            <w:r>
+              <w:rPr>
+                <w:sz w:val="18"/>
+                <w:szCs w:val="18"/>
+              </w:rPr>
+              <w:t>Programación diaria (6 días) y semanal (27 días) + respaldo manual</w:t>
+            </w:r>
+          </w:p>
+        </w:tc>
+        <w:tc>
+          <w:tcPr>
+            <w:tcW w:w="1800" w:type="dxa"/>
+            <w:tcBorders>
+              <w:top w:val="single" w:sz="4" w:space="0" w:color="C9D1DC"/>
+              <w:left w:val="single" w:sz="4" w:space="0" w:color="C9D1DC"/>
+              <w:bottom w:val="single" w:sz="4" w:space="0" w:color="C9D1DC"/>
+              <w:right w:val="single" w:sz="4" w:space="0" w:color="C9D1DC"/>
+            </w:tcBorders>
+            <w:shd w:val="clear" w:color="auto" w:fill="F6F8FB"/>
+            <w:tcMar>
+              <w:top w:w="60" w:type="dxa"/>
+              <w:left w:w="90" w:type="dxa"/>
+              <w:bottom w:w="60" w:type="dxa"/>
+              <w:right w:w="90" w:type="dxa"/>
+            </w:tcMar>
+            <w:vAlign w:val="center"/>
+          </w:tcPr>
+          <w:p>
+            <w:pPr>
+              <w:spacing w:after="20"/>
+            </w:pPr>
+            <w:r>
+              <w:rPr>
+                <w:sz w:val="18"/>
+                <w:szCs w:val="18"/>
+              </w:rPr>
+              <w:t>Respaldo disponible para restaurar</w:t>
+            </w:r>
+          </w:p>
+        </w:tc>
+        <w:tc>
+          <w:tcPr>
+            <w:tcW w:w="2700" w:type="dxa"/>
+            <w:tcBorders>
+              <w:top w:val="single" w:sz="4" w:space="0" w:color="C9D1DC"/>
+              <w:left w:val="single" w:sz="4" w:space="0" w:color="C9D1DC"/>
+              <w:bottom w:val="single" w:sz="4" w:space="0" w:color="C9D1DC"/>
+              <w:right w:val="single" w:sz="4" w:space="0" w:color="C9D1DC"/>
+            </w:tcBorders>
+            <w:shd w:val="clear" w:color="auto" w:fill="F6F8FB"/>
+            <w:tcMar>
+              <w:top w:w="60" w:type="dxa"/>
+              <w:left w:w="90" w:type="dxa"/>
+              <w:bottom w:w="60" w:type="dxa"/>
+              <w:right w:w="90" w:type="dxa"/>
+            </w:tcMar>
+            <w:vAlign w:val="center"/>
+          </w:tcPr>
+          <w:p>
+            <w:pPr>
+              <w:spacing w:after="20"/>
+            </w:pPr>
+            <w:r>
+              <w:rPr>
+                <w:sz w:val="18"/>
+                <w:szCs w:val="18"/>
+              </w:rPr>
+              <w:t>Respaldo 2026-10-05 01:10 (1,1 GB) y próximo automático programado (Figura 7)</w:t>
+            </w:r>
+          </w:p>
+        </w:tc>
+      </w:tr>
     </w:tbl>
     <w:p>
       <w:pPr>
@@ -23080,9 +23730,74 @@
     </w:p>
     <w:p>
       <w:pPr>
+        <w:spacing w:before="120" w:after="60"/>
+        <w:jc w:val="center"/>
+      </w:pPr>
+      <w:r>
+        <w:rPr>
+          <w:noProof/>
+        </w:rPr>
+        <w:drawing>
+          <wp:inline distT="0" distB="0" distL="0" distR="0" wp14:anchorId="0626C9A4" wp14:editId="19125B58">
+            <wp:extent cx="5334000" cy="2333625"/>
+            <wp:effectExtent l="0" t="0" r="0" b="0"/>
+            <wp:docPr id="7" name="Imagen 7"/>
+            <wp:cNvGraphicFramePr>
+              <a:graphicFrameLocks xmlns:a="http://schemas.openxmlformats.org/drawingml/2006/main" noChangeAspect="1"/>
+            </wp:cNvGraphicFramePr>
+            <a:graphic xmlns:a="http://schemas.openxmlformats.org/drawingml/2006/main">
+              <a:graphicData uri="http://schemas.openxmlformats.org/drawingml/2006/picture">
+                <pic:pic xmlns:pic="http://schemas.openxmlformats.org/drawingml/2006/picture">
+                  <pic:nvPicPr>
+                    <pic:cNvPr id="0" name=""/>
+                    <pic:cNvPicPr>
+                      <a:picLocks noChangeAspect="1" noChangeArrowheads="1"/>
+                    </pic:cNvPicPr>
+                  </pic:nvPicPr>
+                  <pic:blipFill>
+                    <a:blip r:embed="rId13"/>
+                    <a:srcRect/>
+                    <a:stretch>
+                      <a:fillRect/>
+                    </a:stretch>
+                  </pic:blipFill>
+                  <pic:spPr bwMode="auto">
+                    <a:xfrm>
+                      <a:off x="0" y="0"/>
+                      <a:ext cx="5334000" cy="2333625"/>
+                    </a:xfrm>
+                    <a:prstGeom prst="rect">
+                      <a:avLst/>
+                    </a:prstGeom>
+                  </pic:spPr>
+                </pic:pic>
+              </a:graphicData>
+            </a:graphic>
+          </wp:inline>
+        </w:drawing>
+      </w:r>
+    </w:p>
+    <w:p>
+      <w:pPr>
+        <w:spacing w:after="240"/>
+        <w:jc w:val="center"/>
+      </w:pPr>
+      <w:r>
+        <w:rPr>
+          <w:i/>
+          <w:iCs/>
+          <w:color w:val="5B6676"/>
+          <w:sz w:val="18"/>
+          <w:szCs w:val="18"/>
+        </w:rPr>
+        <w:t>Figura 7. Respaldos del volumen de Postgres en Railway: programación activa (próximo respaldo automático) y respaldo manual del 05-10-2026.</w:t>
+      </w:r>
+    </w:p>
+    <w:p>
+      <w:pPr>
         <w:pStyle w:val="Ttulo2"/>
       </w:pPr>
-      <w:bookmarkStart w:id="23" w:name="_Toc242047427"/>
+      <w:bookmarkStart w:id="23" w:name="_Toc242055573"/>
       <w:r>
         <w:t>6.3 Detalle de pruebas de seguridad en producción</w:t>
       </w:r>
@@ -28912,11 +29627,397 @@
       <w:pPr>
         <w:pStyle w:val="Ttulo2"/>
       </w:pPr>
-      <w:bookmarkStart w:id="24" w:name="_Toc242047428"/>
+      <w:bookmarkStart w:id="24" w:name="_Toc242055574"/>
       <w:r>
-        <w:t>6.4 Evidencia visual</w:t>
+        <w:t>6.4 Prueba de limitación de tasa (rate limit)</w:t>
       </w:r>
       <w:bookmarkEnd w:id="24"/>
+    </w:p>
+    <w:p>
+      <w:pPr>
+        <w:spacing w:after="120" w:line="276" w:lineRule="auto"/>
+        <w:jc w:val="both"/>
+      </w:pPr>
+      <w:r>
+        <w:t xml:space="preserve">Script pruebas/rate-limit.js: 30 intentos de login seguidos desde la misma IP contra producción (05-10-2026, 1:13:40 a. m.). El contador es por réplica (en memoria), por lo que el bloqueo HTTP 429 aparece cuando la réplica que atiende supera 10 intentos en un minuto. </w:t>
+      </w:r>
+      <w:r>
+        <w:rPr>
+          <w:b/>
+          <w:bCs/>
+        </w:rPr>
+        <w:t>Resultado:</w:t>
+      </w:r>
+      <w:r>
+        <w:t xml:space="preserve"> primer 429 en el intento 12; ninguna réplica aceptó más de 10 intentos.</w:t>
+      </w:r>
+    </w:p>
+    <w:tbl>
+      <w:tblPr>
+        <w:tblW w:w="9360" w:type="dxa"/>
+        <w:tblBorders>
+          <w:top w:val="single" w:sz="4" w:space="0" w:color="auto"/>
+          <w:left w:val="single" w:sz="4" w:space="0" w:color="auto"/>
+          <w:bottom w:val="single" w:sz="4" w:space="0" w:color="auto"/>
+          <w:right w:val="single" w:sz="4" w:space="0" w:color="auto"/>
+          <w:insideH w:val="single" w:sz="4" w:space="0" w:color="auto"/>
+          <w:insideV w:val="single" w:sz="4" w:space="0" w:color="auto"/>
+        </w:tblBorders>
+        <w:tblCellMar>
+          <w:left w:w="10" w:type="dxa"/>
+          <w:right w:w="10" w:type="dxa"/>
+        </w:tblCellMar>
+        <w:tblLook w:val="04A0" w:firstRow="1" w:lastRow="0" w:firstColumn="1" w:lastColumn="0" w:noHBand="0" w:noVBand="1"/>
+      </w:tblPr>
+      <w:tblGrid>
+        <w:gridCol w:w="3600"/>
+        <w:gridCol w:w="2880"/>
+        <w:gridCol w:w="2880"/>
+      </w:tblGrid>
+      <w:tr>
+        <w:tblPrEx>
+          <w:tblCellMar>
+            <w:top w:w="0" w:type="dxa"/>
+            <w:bottom w:w="0" w:type="dxa"/>
+          </w:tblCellMar>
+        </w:tblPrEx>
+        <w:trPr>
+          <w:tblHeader/>
+        </w:trPr>
+        <w:tc>
+          <w:tcPr>
+            <w:tcW w:w="3600" w:type="dxa"/>
+            <w:tcBorders>
+              <w:top w:val="single" w:sz="4" w:space="0" w:color="C9D1DC"/>
+              <w:left w:val="single" w:sz="4" w:space="0" w:color="C9D1DC"/>
+              <w:bottom w:val="single" w:sz="4" w:space="0" w:color="C9D1DC"/>
+              <w:right w:val="single" w:sz="4" w:space="0" w:color="C9D1DC"/>
+            </w:tcBorders>
+            <w:shd w:val="clear" w:color="auto" w:fill="1F4E79"/>
+            <w:tcMar>
+              <w:top w:w="60" w:type="dxa"/>
+              <w:left w:w="90" w:type="dxa"/>
+              <w:bottom w:w="60" w:type="dxa"/>
+              <w:right w:w="90" w:type="dxa"/>
+            </w:tcMar>
+            <w:vAlign w:val="center"/>
+          </w:tcPr>
+          <w:p>
+            <w:pPr>
+              <w:spacing w:after="20"/>
+            </w:pPr>
+            <w:r>
+              <w:rPr>
+                <w:b/>
+                <w:bCs/>
+                <w:color w:val="FFFFFF"/>
+                <w:sz w:val="18"/>
+                <w:szCs w:val="18"/>
+              </w:rPr>
+              <w:t>Réplica</w:t>
+            </w:r>
+          </w:p>
+        </w:tc>
+        <w:tc>
+          <w:tcPr>
+            <w:tcW w:w="2880" w:type="dxa"/>
+            <w:tcBorders>
+              <w:top w:val="single" w:sz="4" w:space="0" w:color="C9D1DC"/>
+              <w:left w:val="single" w:sz="4" w:space="0" w:color="C9D1DC"/>
+              <w:bottom w:val="single" w:sz="4" w:space="0" w:color="C9D1DC"/>
+              <w:right w:val="single" w:sz="4" w:space="0" w:color="C9D1DC"/>
+            </w:tcBorders>
+            <w:shd w:val="clear" w:color="auto" w:fill="1F4E79"/>
+            <w:tcMar>
+              <w:top w:w="60" w:type="dxa"/>
+              <w:left w:w="90" w:type="dxa"/>
+              <w:bottom w:w="60" w:type="dxa"/>
+              <w:right w:w="90" w:type="dxa"/>
+            </w:tcMar>
+            <w:vAlign w:val="center"/>
+          </w:tcPr>
+          <w:p>
+            <w:pPr>
+              <w:spacing w:after="20"/>
+            </w:pPr>
+            <w:r>
+              <w:rPr>
+                <w:b/>
+                <w:bCs/>
+                <w:color w:val="FFFFFF"/>
+                <w:sz w:val="18"/>
+                <w:szCs w:val="18"/>
+              </w:rPr>
+              <w:t>Intentos aceptados (≤ 10)</w:t>
+            </w:r>
+          </w:p>
+        </w:tc>
+        <w:tc>
+          <w:tcPr>
+            <w:tcW w:w="2880" w:type="dxa"/>
+            <w:tcBorders>
+              <w:top w:val="single" w:sz="4" w:space="0" w:color="C9D1DC"/>
+              <w:left w:val="single" w:sz="4" w:space="0" w:color="C9D1DC"/>
+              <w:bottom w:val="single" w:sz="4" w:space="0" w:color="C9D1DC"/>
+              <w:right w:val="single" w:sz="4" w:space="0" w:color="C9D1DC"/>
+            </w:tcBorders>
+            <w:shd w:val="clear" w:color="auto" w:fill="1F4E79"/>
+            <w:tcMar>
+              <w:top w:w="60" w:type="dxa"/>
+              <w:left w:w="90" w:type="dxa"/>
+              <w:bottom w:w="60" w:type="dxa"/>
+              <w:right w:w="90" w:type="dxa"/>
+            </w:tcMar>
+            <w:vAlign w:val="center"/>
+          </w:tcPr>
+          <w:p>
+            <w:pPr>
+              <w:spacing w:after="20"/>
+            </w:pPr>
+            <w:r>
+              <w:rPr>
+                <w:b/>
+                <w:bCs/>
+                <w:color w:val="FFFFFF"/>
+                <w:sz w:val="18"/>
+                <w:szCs w:val="18"/>
+              </w:rPr>
+              <w:t>Intentos bloqueados (HTTP 429)</w:t>
+            </w:r>
+          </w:p>
+        </w:tc>
+      </w:tr>
+      <w:tr>
+        <w:tblPrEx>
+          <w:tblCellMar>
+            <w:top w:w="0" w:type="dxa"/>
+            <w:bottom w:w="0" w:type="dxa"/>
+          </w:tblCellMar>
+        </w:tblPrEx>
+        <w:trPr>
+          <w:cantSplit/>
+        </w:trPr>
+        <w:tc>
+          <w:tcPr>
+            <w:tcW w:w="3600" w:type="dxa"/>
+            <w:tcBorders>
+              <w:top w:val="single" w:sz="4" w:space="0" w:color="C9D1DC"/>
+              <w:left w:val="single" w:sz="4" w:space="0" w:color="C9D1DC"/>
+              <w:bottom w:val="single" w:sz="4" w:space="0" w:color="C9D1DC"/>
+              <w:right w:val="single" w:sz="4" w:space="0" w:color="C9D1DC"/>
+            </w:tcBorders>
+            <w:tcMar>
+              <w:top w:w="60" w:type="dxa"/>
+              <w:left w:w="90" w:type="dxa"/>
+              <w:bottom w:w="60" w:type="dxa"/>
+              <w:right w:w="90" w:type="dxa"/>
+            </w:tcMar>
+            <w:vAlign w:val="center"/>
+          </w:tcPr>
+          <w:p>
+            <w:pPr>
+              <w:spacing w:after="20"/>
+            </w:pPr>
+            <w:r>
+              <w:rPr>
+                <w:sz w:val="18"/>
+                <w:szCs w:val="18"/>
+              </w:rPr>
+              <w:t>replica-f0c27978</w:t>
+            </w:r>
+          </w:p>
+        </w:tc>
+        <w:tc>
+          <w:tcPr>
+            <w:tcW w:w="2880" w:type="dxa"/>
+            <w:tcBorders>
+              <w:top w:val="single" w:sz="4" w:space="0" w:color="C9D1DC"/>
+              <w:left w:val="single" w:sz="4" w:space="0" w:color="C9D1DC"/>
+              <w:bottom w:val="single" w:sz="4" w:space="0" w:color="C9D1DC"/>
+              <w:right w:val="single" w:sz="4" w:space="0" w:color="C9D1DC"/>
+            </w:tcBorders>
+            <w:tcMar>
+              <w:top w:w="60" w:type="dxa"/>
+              <w:left w:w="90" w:type="dxa"/>
+              <w:bottom w:w="60" w:type="dxa"/>
+              <w:right w:w="90" w:type="dxa"/>
+            </w:tcMar>
+            <w:vAlign w:val="center"/>
+          </w:tcPr>
+          <w:p>
+            <w:pPr>
+              <w:spacing w:after="20"/>
+            </w:pPr>
+            <w:r>
+              <w:rPr>
+                <w:sz w:val="18"/>
+                <w:szCs w:val="18"/>
+              </w:rPr>
+              <w:t>7</w:t>
+            </w:r>
+          </w:p>
+        </w:tc>
+        <w:tc>
+          <w:tcPr>
+            <w:tcW w:w="2880" w:type="dxa"/>
+            <w:tcBorders>
+              <w:top w:val="single" w:sz="4" w:space="0" w:color="C9D1DC"/>
+              <w:left w:val="single" w:sz="4" w:space="0" w:color="C9D1DC"/>
+              <w:bottom w:val="single" w:sz="4" w:space="0" w:color="C9D1DC"/>
+              <w:right w:val="single" w:sz="4" w:space="0" w:color="C9D1DC"/>
+            </w:tcBorders>
+            <w:tcMar>
+              <w:top w:w="60" w:type="dxa"/>
+              <w:left w:w="90" w:type="dxa"/>
+              <w:bottom w:w="60" w:type="dxa"/>
+              <w:right w:w="90" w:type="dxa"/>
+            </w:tcMar>
+            <w:vAlign w:val="center"/>
+          </w:tcPr>
+          <w:p>
+            <w:pPr>
+              <w:spacing w:after="20"/>
+            </w:pPr>
+            <w:r>
+              <w:rPr>
+                <w:sz w:val="18"/>
+                <w:szCs w:val="18"/>
+              </w:rPr>
+              <w:t>0</w:t>
+            </w:r>
+          </w:p>
+        </w:tc>
+      </w:tr>
+      <w:tr>
+        <w:tblPrEx>
+          <w:tblCellMar>
+            <w:top w:w="0" w:type="dxa"/>
+            <w:bottom w:w="0" w:type="dxa"/>
+          </w:tblCellMar>
+        </w:tblPrEx>
+        <w:trPr>
+          <w:cantSplit/>
+        </w:trPr>
+        <w:tc>
+          <w:tcPr>
+            <w:tcW w:w="3600" w:type="dxa"/>
+            <w:tcBorders>
+              <w:top w:val="single" w:sz="4" w:space="0" w:color="C9D1DC"/>
+              <w:left w:val="single" w:sz="4" w:space="0" w:color="C9D1DC"/>
+              <w:bottom w:val="single" w:sz="4" w:space="0" w:color="C9D1DC"/>
+              <w:right w:val="single" w:sz="4" w:space="0" w:color="C9D1DC"/>
+            </w:tcBorders>
+            <w:shd w:val="clear" w:color="auto" w:fill="F6F8FB"/>
+            <w:tcMar>
+              <w:top w:w="60" w:type="dxa"/>
+              <w:left w:w="90" w:type="dxa"/>
+              <w:bottom w:w="60" w:type="dxa"/>
+              <w:right w:w="90" w:type="dxa"/>
+            </w:tcMar>
+            <w:vAlign w:val="center"/>
+          </w:tcPr>
+          <w:p>
+            <w:pPr>
+              <w:spacing w:after="20"/>
+            </w:pPr>
+            <w:r>
+              <w:rPr>
+                <w:sz w:val="18"/>
+                <w:szCs w:val="18"/>
+              </w:rPr>
+              <w:t>replica-07d81281</w:t>
+            </w:r>
+          </w:p>
+        </w:tc>
+        <w:tc>
+          <w:tcPr>
+            <w:tcW w:w="2880" w:type="dxa"/>
+            <w:tcBorders>
+              <w:top w:val="single" w:sz="4" w:space="0" w:color="C9D1DC"/>
+              <w:left w:val="single" w:sz="4" w:space="0" w:color="C9D1DC"/>
+              <w:bottom w:val="single" w:sz="4" w:space="0" w:color="C9D1DC"/>
+              <w:right w:val="single" w:sz="4" w:space="0" w:color="C9D1DC"/>
+            </w:tcBorders>
+            <w:shd w:val="clear" w:color="auto" w:fill="F6F8FB"/>
+            <w:tcMar>
+              <w:top w:w="60" w:type="dxa"/>
+              <w:left w:w="90" w:type="dxa"/>
+              <w:bottom w:w="60" w:type="dxa"/>
+              <w:right w:w="90" w:type="dxa"/>
+            </w:tcMar>
+            <w:vAlign w:val="center"/>
+          </w:tcPr>
+          <w:p>
+            <w:pPr>
+              <w:spacing w:after="20"/>
+            </w:pPr>
+            <w:r>
+              <w:rPr>
+                <w:sz w:val="18"/>
+                <w:szCs w:val="18"/>
+              </w:rPr>
+              <w:t>10</w:t>
+            </w:r>
+          </w:p>
+        </w:tc>
+        <w:tc>
+          <w:tcPr>
+            <w:tcW w:w="2880" w:type="dxa"/>
+            <w:tcBorders>
+              <w:top w:val="single" w:sz="4" w:space="0" w:color="C9D1DC"/>
+              <w:left w:val="single" w:sz="4" w:space="0" w:color="C9D1DC"/>
+              <w:bottom w:val="single" w:sz="4" w:space="0" w:color="C9D1DC"/>
+              <w:right w:val="single" w:sz="4" w:space="0" w:color="C9D1DC"/>
+            </w:tcBorders>
+            <w:shd w:val="clear" w:color="auto" w:fill="F6F8FB"/>
+            <w:tcMar>
+              <w:top w:w="60" w:type="dxa"/>
+              <w:left w:w="90" w:type="dxa"/>
+              <w:bottom w:w="60" w:type="dxa"/>
+              <w:right w:w="90" w:type="dxa"/>
+            </w:tcMar>
+            <w:vAlign w:val="center"/>
+          </w:tcPr>
+          <w:p>
+            <w:pPr>
+              <w:spacing w:after="20"/>
+            </w:pPr>
+            <w:r>
+              <w:rPr>
+                <w:sz w:val="18"/>
+                <w:szCs w:val="18"/>
+              </w:rPr>
+              <w:t>13</w:t>
+            </w:r>
+          </w:p>
+        </w:tc>
+      </w:tr>
+    </w:tbl>
+    <w:p>
+      <w:pPr>
+        <w:spacing w:after="120" w:line="276" w:lineRule="auto"/>
+        <w:jc w:val="both"/>
+      </w:pPr>
+      <w:r>
+        <w:rPr>
+          <w:b/>
+          <w:bCs/>
+        </w:rPr>
+        <w:t>Limitación conocida:</w:t>
+      </w:r>
+      <w:r>
+        <w:t xml:space="preserve"> al ser un contador por réplica, un atacante podría hacer hasta ~20 intentos por minuto con 2 réplicas; la protección principal contra fuerza bruta es la de Firebase y el segundo factor. Un contador compartido (por ejemplo, en la base de datos) queda como mejora (sección 7.3).</w:t>
+      </w:r>
+    </w:p>
+    <w:p>
+      <w:pPr>
+        <w:pStyle w:val="Ttulo2"/>
+      </w:pPr>
+      <w:bookmarkStart w:id="25" w:name="_Toc242055575"/>
+      <w:r>
+        <w:t>6.5 Evidencia visual</w:t>
+      </w:r>
+      <w:bookmarkEnd w:id="25"/>
     </w:p>
     <w:p>
       <w:pPr>
@@ -28928,202 +30029,7 @@
           <w:noProof/>
         </w:rPr>
         <w:drawing>
-          <wp:inline distT="0" distB="0" distL="0" distR="0" wp14:anchorId="35AA3D3A" wp14:editId="5EFBA9F1">
-            <wp:extent cx="5334000" cy="3124200"/>
-            <wp:effectExtent l="0" t="0" r="0" b="0"/>
-            <wp:docPr id="5" name="Imagen 5"/>
-            <wp:cNvGraphicFramePr>
-              <a:graphicFrameLocks xmlns:a="http://schemas.openxmlformats.org/drawingml/2006/main" noChangeAspect="1"/>
-            </wp:cNvGraphicFramePr>
-            <a:graphic xmlns:a="http://schemas.openxmlformats.org/drawingml/2006/main">
-              <a:graphicData uri="http://schemas.openxmlformats.org/drawingml/2006/picture">
-                <pic:pic xmlns:pic="http://schemas.openxmlformats.org/drawingml/2006/picture">
-                  <pic:nvPicPr>
-                    <pic:cNvPr id="0" name=""/>
-                    <pic:cNvPicPr>
-                      <a:picLocks noChangeAspect="1" noChangeArrowheads="1"/>
-                    </pic:cNvPicPr>
-                  </pic:nvPicPr>
-                  <pic:blipFill>
-                    <a:blip r:embed="rId11"/>
-                    <a:srcRect/>
-                    <a:stretch>
-                      <a:fillRect/>
-                    </a:stretch>
-                  </pic:blipFill>
-                  <pic:spPr bwMode="auto">
-                    <a:xfrm>
-                      <a:off x="0" y="0"/>
-                      <a:ext cx="5334000" cy="3124200"/>
-                    </a:xfrm>
-                    <a:prstGeom prst="rect">
-                      <a:avLst/>
-                    </a:prstGeom>
-                  </pic:spPr>
-                </pic:pic>
-              </a:graphicData>
-            </a:graphic>
-          </wp:inline>
-        </w:drawing>
-      </w:r>
-    </w:p>
-    <w:p>
-      <w:pPr>
-        <w:spacing w:after="240"/>
-        <w:jc w:val="center"/>
-      </w:pPr>
-      <w:r>
-        <w:rPr>
-          <w:i/>
-          <w:iCs/>
-          <w:color w:val="5B6676"/>
-          <w:sz w:val="18"/>
-          <w:szCs w:val="18"/>
-        </w:rPr>
-        <w:t>Figura 5. Inicio de sesión en producción, protegido con verificación en dos pasos.</w:t>
-      </w:r>
-    </w:p>
-    <w:p>
-      <w:pPr>
-        <w:spacing w:before="120" w:after="60"/>
-        <w:jc w:val="center"/>
-      </w:pPr>
-      <w:r>
-        <w:rPr>
-          <w:noProof/>
-        </w:rPr>
-        <w:drawing>
-          <wp:inline distT="0" distB="0" distL="0" distR="0" wp14:anchorId="77B37483" wp14:editId="3A89D05C">
-            <wp:extent cx="5334000" cy="3124200"/>
-            <wp:effectExtent l="0" t="0" r="0" b="0"/>
-            <wp:docPr id="6" name="Imagen 6"/>
-            <wp:cNvGraphicFramePr>
-              <a:graphicFrameLocks xmlns:a="http://schemas.openxmlformats.org/drawingml/2006/main" noChangeAspect="1"/>
-            </wp:cNvGraphicFramePr>
-            <a:graphic xmlns:a="http://schemas.openxmlformats.org/drawingml/2006/main">
-              <a:graphicData uri="http://schemas.openxmlformats.org/drawingml/2006/picture">
-                <pic:pic xmlns:pic="http://schemas.openxmlformats.org/drawingml/2006/picture">
-                  <pic:nvPicPr>
-                    <pic:cNvPr id="0" name=""/>
-                    <pic:cNvPicPr>
-                      <a:picLocks noChangeAspect="1" noChangeArrowheads="1"/>
-                    </pic:cNvPicPr>
-                  </pic:nvPicPr>
-                  <pic:blipFill>
-                    <a:blip r:embed="rId12"/>
-                    <a:srcRect/>
-                    <a:stretch>
-                      <a:fillRect/>
-                    </a:stretch>
-                  </pic:blipFill>
-                  <pic:spPr bwMode="auto">
-                    <a:xfrm>
-                      <a:off x="0" y="0"/>
-                      <a:ext cx="5334000" cy="3124200"/>
-                    </a:xfrm>
-                    <a:prstGeom prst="rect">
-                      <a:avLst/>
-                    </a:prstGeom>
-                  </pic:spPr>
-                </pic:pic>
-              </a:graphicData>
-            </a:graphic>
-          </wp:inline>
-        </w:drawing>
-      </w:r>
-    </w:p>
-    <w:p>
-      <w:pPr>
-        <w:spacing w:after="240"/>
-        <w:jc w:val="center"/>
-      </w:pPr>
-      <w:r>
-        <w:rPr>
-          <w:i/>
-          <w:iCs/>
-          <w:color w:val="5B6676"/>
-          <w:sz w:val="18"/>
-          <w:szCs w:val="18"/>
-        </w:rPr>
-        <w:t>Figura 6. Segundo factor activado: el usuario debe volver a ingresar usando su código.</w:t>
-      </w:r>
-    </w:p>
-    <w:p>
-      <w:pPr>
-        <w:spacing w:before="120" w:after="60"/>
-        <w:jc w:val="center"/>
-      </w:pPr>
-      <w:r>
-        <w:rPr>
-          <w:noProof/>
-        </w:rPr>
-        <w:drawing>
-          <wp:inline distT="0" distB="0" distL="0" distR="0" wp14:anchorId="540B1C2F" wp14:editId="49450AD8">
-            <wp:extent cx="5334000" cy="3124200"/>
-            <wp:effectExtent l="0" t="0" r="0" b="0"/>
-            <wp:docPr id="7" name="Imagen 7"/>
-            <wp:cNvGraphicFramePr>
-              <a:graphicFrameLocks xmlns:a="http://schemas.openxmlformats.org/drawingml/2006/main" noChangeAspect="1"/>
-            </wp:cNvGraphicFramePr>
-            <a:graphic xmlns:a="http://schemas.openxmlformats.org/drawingml/2006/main">
-              <a:graphicData uri="http://schemas.openxmlformats.org/drawingml/2006/picture">
-                <pic:pic xmlns:pic="http://schemas.openxmlformats.org/drawingml/2006/picture">
-                  <pic:nvPicPr>
-                    <pic:cNvPr id="0" name=""/>
-                    <pic:cNvPicPr>
-                      <a:picLocks noChangeAspect="1" noChangeArrowheads="1"/>
-                    </pic:cNvPicPr>
-                  </pic:nvPicPr>
-                  <pic:blipFill>
-                    <a:blip r:embed="rId13"/>
-                    <a:srcRect/>
-                    <a:stretch>
-                      <a:fillRect/>
-                    </a:stretch>
-                  </pic:blipFill>
-                  <pic:spPr bwMode="auto">
-                    <a:xfrm>
-                      <a:off x="0" y="0"/>
-                      <a:ext cx="5334000" cy="3124200"/>
-                    </a:xfrm>
-                    <a:prstGeom prst="rect">
-                      <a:avLst/>
-                    </a:prstGeom>
-                  </pic:spPr>
-                </pic:pic>
-              </a:graphicData>
-            </a:graphic>
-          </wp:inline>
-        </w:drawing>
-      </w:r>
-    </w:p>
-    <w:p>
-      <w:pPr>
-        <w:spacing w:after="240"/>
-        <w:jc w:val="center"/>
-      </w:pPr>
-      <w:r>
-        <w:rPr>
-          <w:i/>
-          <w:iCs/>
-          <w:color w:val="5B6676"/>
-          <w:sz w:val="18"/>
-          <w:szCs w:val="18"/>
-        </w:rPr>
-        <w:t>Figura 7. Rol admin (tras contraseña + TOTP): ve todos los incidentes, cambia su estado y puede eliminarlos.</w:t>
-      </w:r>
-    </w:p>
-    <w:p>
-      <w:pPr>
-        <w:spacing w:before="120" w:after="60"/>
-        <w:jc w:val="center"/>
-      </w:pPr>
-      <w:r>
-        <w:rPr>
-          <w:noProof/>
-        </w:rPr>
-        <w:drawing>
-          <wp:inline distT="0" distB="0" distL="0" distR="0" wp14:anchorId="78BDDD27" wp14:editId="26DA1575">
+          <wp:inline distT="0" distB="0" distL="0" distR="0" wp14:anchorId="7046EC5F" wp14:editId="6BE6FB8F">
             <wp:extent cx="5334000" cy="3124200"/>
             <wp:effectExtent l="0" t="0" r="0" b="0"/>
             <wp:docPr id="8" name="Imagen 8"/>
@@ -29175,7 +30081,7 @@
           <w:sz w:val="18"/>
           <w:szCs w:val="18"/>
         </w:rPr>
-        <w:t>Figura 8. Rol admin: gestión de usuarios con "Restablecer 2FA"; las cuentas de prueba quedaron desactivadas.</w:t>
+        <w:t>Figura 8. Inicio de sesión en producción, protegido con verificación en dos pasos.</w:t>
       </w:r>
     </w:p>
     <w:p>
@@ -29188,7 +30094,7 @@
           <w:noProof/>
         </w:rPr>
         <w:drawing>
-          <wp:inline distT="0" distB="0" distL="0" distR="0" wp14:anchorId="1775FFC0" wp14:editId="24E11EDA">
+          <wp:inline distT="0" distB="0" distL="0" distR="0" wp14:anchorId="174D9151" wp14:editId="15CC875A">
             <wp:extent cx="5334000" cy="3124200"/>
             <wp:effectExtent l="0" t="0" r="0" b="0"/>
             <wp:docPr id="9" name="Imagen 9"/>
@@ -29240,7 +30146,7 @@
           <w:sz w:val="18"/>
           <w:szCs w:val="18"/>
         </w:rPr>
-        <w:t>Figura 9. Rol analista: solo ve la pestaña Incidentes y únicamente sus propios registros.</w:t>
+        <w:t>Figura 9. Segundo factor activado: el usuario debe volver a ingresar usando su código.</w:t>
       </w:r>
     </w:p>
     <w:p>
@@ -29253,7 +30159,7 @@
           <w:noProof/>
         </w:rPr>
         <w:drawing>
-          <wp:inline distT="0" distB="0" distL="0" distR="0" wp14:anchorId="6B694A37" wp14:editId="41510296">
+          <wp:inline distT="0" distB="0" distL="0" distR="0" wp14:anchorId="627140A4" wp14:editId="2DC9AF38">
             <wp:extent cx="5334000" cy="3124200"/>
             <wp:effectExtent l="0" t="0" r="0" b="0"/>
             <wp:docPr id="10" name="Imagen 10"/>
@@ -29305,7 +30211,202 @@
           <w:sz w:val="18"/>
           <w:szCs w:val="18"/>
         </w:rPr>
-        <w:t>Figura 10. Rol auditor: lectura de todos los incidentes, sin formularios de creación ni acciones.</w:t>
+        <w:t>Figura 10. Rol admin (tras contraseña + TOTP): ve todos los incidentes, cambia su estado y puede eliminarlos.</w:t>
+      </w:r>
+    </w:p>
+    <w:p>
+      <w:pPr>
+        <w:spacing w:before="120" w:after="60"/>
+        <w:jc w:val="center"/>
+      </w:pPr>
+      <w:r>
+        <w:rPr>
+          <w:noProof/>
+        </w:rPr>
+        <w:drawing>
+          <wp:inline distT="0" distB="0" distL="0" distR="0" wp14:anchorId="2D53B071" wp14:editId="7EA4A242">
+            <wp:extent cx="5334000" cy="3124200"/>
+            <wp:effectExtent l="0" t="0" r="0" b="0"/>
+            <wp:docPr id="11" name="Imagen 11"/>
+            <wp:cNvGraphicFramePr>
+              <a:graphicFrameLocks xmlns:a="http://schemas.openxmlformats.org/drawingml/2006/main" noChangeAspect="1"/>
+            </wp:cNvGraphicFramePr>
+            <a:graphic xmlns:a="http://schemas.openxmlformats.org/drawingml/2006/main">
+              <a:graphicData uri="http://schemas.openxmlformats.org/drawingml/2006/picture">
+                <pic:pic xmlns:pic="http://schemas.openxmlformats.org/drawingml/2006/picture">
+                  <pic:nvPicPr>
+                    <pic:cNvPr id="0" name=""/>
+                    <pic:cNvPicPr>
+                      <a:picLocks noChangeAspect="1" noChangeArrowheads="1"/>
+                    </pic:cNvPicPr>
+                  </pic:nvPicPr>
+                  <pic:blipFill>
+                    <a:blip r:embed="rId17"/>
+                    <a:srcRect/>
+                    <a:stretch>
+                      <a:fillRect/>
+                    </a:stretch>
+                  </pic:blipFill>
+                  <pic:spPr bwMode="auto">
+                    <a:xfrm>
+                      <a:off x="0" y="0"/>
+                      <a:ext cx="5334000" cy="3124200"/>
+                    </a:xfrm>
+                    <a:prstGeom prst="rect">
+                      <a:avLst/>
+                    </a:prstGeom>
+                  </pic:spPr>
+                </pic:pic>
+              </a:graphicData>
+            </a:graphic>
+          </wp:inline>
+        </w:drawing>
+      </w:r>
+    </w:p>
+    <w:p>
+      <w:pPr>
+        <w:spacing w:after="240"/>
+        <w:jc w:val="center"/>
+      </w:pPr>
+      <w:r>
+        <w:rPr>
+          <w:i/>
+          <w:iCs/>
+          <w:color w:val="5B6676"/>
+          <w:sz w:val="18"/>
+          <w:szCs w:val="18"/>
+        </w:rPr>
+        <w:t>Figura 11. Rol admin: gestión de usuarios con "Restablecer 2FA"; las cuentas de prueba quedaron desactivadas.</w:t>
+      </w:r>
+    </w:p>
+    <w:p>
+      <w:pPr>
+        <w:spacing w:before="120" w:after="60"/>
+        <w:jc w:val="center"/>
+      </w:pPr>
+      <w:r>
+        <w:rPr>
+          <w:noProof/>
+        </w:rPr>
+        <w:drawing>
+          <wp:inline distT="0" distB="0" distL="0" distR="0" wp14:anchorId="0CF1BB8F" wp14:editId="30B520E9">
+            <wp:extent cx="5334000" cy="3124200"/>
+            <wp:effectExtent l="0" t="0" r="0" b="0"/>
+            <wp:docPr id="12" name="Imagen 12"/>
+            <wp:cNvGraphicFramePr>
+              <a:graphicFrameLocks xmlns:a="http://schemas.openxmlformats.org/drawingml/2006/main" noChangeAspect="1"/>
+            </wp:cNvGraphicFramePr>
+            <a:graphic xmlns:a="http://schemas.openxmlformats.org/drawingml/2006/main">
+              <a:graphicData uri="http://schemas.openxmlformats.org/drawingml/2006/picture">
+                <pic:pic xmlns:pic="http://schemas.openxmlformats.org/drawingml/2006/picture">
+                  <pic:nvPicPr>
+                    <pic:cNvPr id="0" name=""/>
+                    <pic:cNvPicPr>
+                      <a:picLocks noChangeAspect="1" noChangeArrowheads="1"/>
+                    </pic:cNvPicPr>
+                  </pic:nvPicPr>
+                  <pic:blipFill>
+                    <a:blip r:embed="rId18"/>
+                    <a:srcRect/>
+                    <a:stretch>
+                      <a:fillRect/>
+                    </a:stretch>
+                  </pic:blipFill>
+                  <pic:spPr bwMode="auto">
+                    <a:xfrm>
+                      <a:off x="0" y="0"/>
+                      <a:ext cx="5334000" cy="3124200"/>
+                    </a:xfrm>
+                    <a:prstGeom prst="rect">
+                      <a:avLst/>
+                    </a:prstGeom>
+                  </pic:spPr>
+                </pic:pic>
+              </a:graphicData>
+            </a:graphic>
+          </wp:inline>
+        </w:drawing>
+      </w:r>
+    </w:p>
+    <w:p>
+      <w:pPr>
+        <w:spacing w:after="240"/>
+        <w:jc w:val="center"/>
+      </w:pPr>
+      <w:r>
+        <w:rPr>
+          <w:i/>
+          <w:iCs/>
+          <w:color w:val="5B6676"/>
+          <w:sz w:val="18"/>
+          <w:szCs w:val="18"/>
+        </w:rPr>
+        <w:t>Figura 12. Rol analista: solo ve la pestaña Incidentes y únicamente sus propios registros.</w:t>
+      </w:r>
+    </w:p>
+    <w:p>
+      <w:pPr>
+        <w:spacing w:before="120" w:after="60"/>
+        <w:jc w:val="center"/>
+      </w:pPr>
+      <w:r>
+        <w:rPr>
+          <w:noProof/>
+        </w:rPr>
+        <w:drawing>
+          <wp:inline distT="0" distB="0" distL="0" distR="0" wp14:anchorId="2FBC5AD2" wp14:editId="67F4EB66">
+            <wp:extent cx="5334000" cy="3124200"/>
+            <wp:effectExtent l="0" t="0" r="0" b="0"/>
+            <wp:docPr id="13" name="Imagen 13"/>
+            <wp:cNvGraphicFramePr>
+              <a:graphicFrameLocks xmlns:a="http://schemas.openxmlformats.org/drawingml/2006/main" noChangeAspect="1"/>
+            </wp:cNvGraphicFramePr>
+            <a:graphic xmlns:a="http://schemas.openxmlformats.org/drawingml/2006/main">
+              <a:graphicData uri="http://schemas.openxmlformats.org/drawingml/2006/picture">
+                <pic:pic xmlns:pic="http://schemas.openxmlformats.org/drawingml/2006/picture">
+                  <pic:nvPicPr>
+                    <pic:cNvPr id="0" name=""/>
+                    <pic:cNvPicPr>
+                      <a:picLocks noChangeAspect="1" noChangeArrowheads="1"/>
+                    </pic:cNvPicPr>
+                  </pic:nvPicPr>
+                  <pic:blipFill>
+                    <a:blip r:embed="rId19"/>
+                    <a:srcRect/>
+                    <a:stretch>
+                      <a:fillRect/>
+                    </a:stretch>
+                  </pic:blipFill>
+                  <pic:spPr bwMode="auto">
+                    <a:xfrm>
+                      <a:off x="0" y="0"/>
+                      <a:ext cx="5334000" cy="3124200"/>
+                    </a:xfrm>
+                    <a:prstGeom prst="rect">
+                      <a:avLst/>
+                    </a:prstGeom>
+                  </pic:spPr>
+                </pic:pic>
+              </a:graphicData>
+            </a:graphic>
+          </wp:inline>
+        </w:drawing>
+      </w:r>
+    </w:p>
+    <w:p>
+      <w:pPr>
+        <w:spacing w:after="240"/>
+        <w:jc w:val="center"/>
+      </w:pPr>
+      <w:r>
+        <w:rPr>
+          <w:i/>
+          <w:iCs/>
+          <w:color w:val="5B6676"/>
+          <w:sz w:val="18"/>
+          <w:szCs w:val="18"/>
+        </w:rPr>
+        <w:t>Figura 13. Rol auditor: lectura de todos los incidentes, sin formularios de creación ni acciones.</w:t>
       </w:r>
     </w:p>
     <w:p>
@@ -29313,21 +30414,21 @@
         <w:pStyle w:val="Ttulo1"/>
         <w:pageBreakBefore/>
       </w:pPr>
-      <w:bookmarkStart w:id="25" w:name="_Toc242047429"/>
+      <w:bookmarkStart w:id="26" w:name="_Toc242055576"/>
       <w:r>
         <w:t>7. Conclusiones</w:t>
       </w:r>
-      <w:bookmarkEnd w:id="25"/>
+      <w:bookmarkEnd w:id="26"/>
     </w:p>
     <w:p>
       <w:pPr>
         <w:pStyle w:val="Ttulo2"/>
       </w:pPr>
-      <w:bookmarkStart w:id="26" w:name="_Toc242047430"/>
+      <w:bookmarkStart w:id="27" w:name="_Toc242055577"/>
       <w:r>
         <w:t>7.1 Evaluación de la seguridad de la solución (criterio 4.1.6)</w:t>
       </w:r>
-      <w:bookmarkEnd w:id="26"/>
+      <w:bookmarkEnd w:id="27"/>
     </w:p>
     <w:tbl>
       <w:tblPr>
@@ -29737,7 +30838,7 @@
                 <w:sz w:val="18"/>
                 <w:szCs w:val="18"/>
               </w:rPr>
-              <w:t>Cumple*</w:t>
+              <w:t>Parcial</w:t>
             </w:r>
           </w:p>
         </w:tc>
@@ -29767,7 +30868,7 @@
                 <w:sz w:val="18"/>
                 <w:szCs w:val="18"/>
               </w:rPr>
-              <w:t>Roles Owner/Editor/Viewer (sección 4.1). *Requiere invitar a los integrantes</w:t>
+              <w:t>Aplicación: RBAC + 2FA (cumple). Plataforma: permisos definidos (Can Edit / Can View), pero al 05-10 solo el titular está en Members (Figura 2)</w:t>
             </w:r>
           </w:p>
         </w:tc>
@@ -30312,11 +31413,11 @@
       <w:pPr>
         <w:pStyle w:val="Ttulo2"/>
       </w:pPr>
-      <w:bookmarkStart w:id="27" w:name="_Toc242047431"/>
+      <w:bookmarkStart w:id="28" w:name="_Toc242055578"/>
       <w:r>
         <w:t>7.2 Aprendizajes del equipo</w:t>
       </w:r>
-      <w:bookmarkEnd w:id="27"/>
+      <w:bookmarkEnd w:id="28"/>
     </w:p>
     <w:p>
       <w:pPr>
@@ -30422,11 +31523,11 @@
       <w:pPr>
         <w:pStyle w:val="Ttulo2"/>
       </w:pPr>
-      <w:bookmarkStart w:id="28" w:name="_Toc242047432"/>
+      <w:bookmarkStart w:id="29" w:name="_Toc242055579"/>
       <w:r>
         <w:t>7.3 Mejoras futuras</w:t>
       </w:r>
-      <w:bookmarkEnd w:id="28"/>
+      <w:bookmarkEnd w:id="29"/>
     </w:p>
     <w:tbl>
       <w:tblPr>
@@ -30599,7 +31700,7 @@
                 <w:sz w:val="18"/>
                 <w:szCs w:val="18"/>
               </w:rPr>
-              <w:t>Activar respaldos programados diarios del volumen de Postgres y probar una restauración</w:t>
+              <w:t>Probar una restauración del respaldo del volumen (los respaldos diario y semanal ya están activos)</w:t>
             </w:r>
           </w:p>
         </w:tc>
@@ -30659,7 +31760,7 @@
                 <w:sz w:val="18"/>
                 <w:szCs w:val="18"/>
               </w:rPr>
-              <w:t>Alta</w:t>
+              <w:t>Media</w:t>
             </w:r>
           </w:p>
         </w:tc>
@@ -30804,7 +31905,7 @@
                 <w:sz w:val="18"/>
                 <w:szCs w:val="18"/>
               </w:rPr>
-              <w:t>Activar 2FA en las cuentas Railway, GitHub y Google de todos los integrantes</w:t>
+              <w:t>Invitar a Kevin y Diego (Can Edit) y activar 2FA en las cuentas Railway, GitHub y Google de todos</w:t>
             </w:r>
           </w:p>
         </w:tc>
@@ -31490,11 +32591,11 @@
         <w:pStyle w:val="Ttulo1"/>
         <w:pageBreakBefore/>
       </w:pPr>
-      <w:bookmarkStart w:id="29" w:name="_Toc242047433"/>
+      <w:bookmarkStart w:id="30" w:name="_Toc242055580"/>
       <w:r>
         <w:t>Anexo A. Estructura del repositorio y reproducción</w:t>
       </w:r>
-      <w:bookmarkEnd w:id="29"/>
+      <w:bookmarkEnd w:id="30"/>
     </w:p>
     <w:tbl>
       <w:tblPr>
@@ -32605,11 +33706,6 @@
         </w:tc>
       </w:tr>
     </w:tbl>
-    <w:p>
-      <w:pPr>
-        <w:spacing w:after="80"/>
-      </w:pPr>
-    </w:p>
     <w:p>
       <w:pPr>
         <w:spacing w:after="120" w:line="276" w:lineRule="auto"/>
@@ -32674,11 +33770,480 @@
         <w:t xml:space="preserve"> las contraseñas y los códigos QR de TOTP se entregan al docente por un canal separado y no se incluyen en este documento ni en el repositorio (ISO 27001 A.5.17).</w:t>
       </w:r>
     </w:p>
+    <w:p>
+      <w:pPr>
+        <w:pStyle w:val="Ttulo1"/>
+        <w:pageBreakBefore/>
+      </w:pPr>
+      <w:bookmarkStart w:id="31" w:name="_Toc242055581"/>
+      <w:r>
+        <w:t>Anexo B. Evidencia de configuración en Railway</w:t>
+      </w:r>
+      <w:bookmarkEnd w:id="31"/>
+    </w:p>
+    <w:p>
+      <w:pPr>
+        <w:spacing w:after="120" w:line="276" w:lineRule="auto"/>
+        <w:jc w:val="both"/>
+      </w:pPr>
+      <w:r>
+        <w:t>Salida de la API de Railway (describe-service y get-logs) obtenida el 05-10-2026, recortada a los campos relevantes. Los valores de las variables de entorno no se muestran: la API solo entrega sus nombres.</w:t>
+      </w:r>
+    </w:p>
+    <w:p>
+      <w:pPr>
+        <w:pStyle w:val="Ttulo2"/>
+      </w:pPr>
+      <w:bookmarkStart w:id="32" w:name="_Toc242055582"/>
+      <w:r>
+        <w:t>B.1 Servicio Postgres (capa de datos)</w:t>
+      </w:r>
+      <w:bookmarkEnd w:id="32"/>
+    </w:p>
+    <w:tbl>
+      <w:tblPr>
+        <w:tblW w:w="9360" w:type="dxa"/>
+        <w:tblBorders>
+          <w:top w:val="single" w:sz="4" w:space="0" w:color="auto"/>
+          <w:left w:val="single" w:sz="4" w:space="0" w:color="auto"/>
+          <w:bottom w:val="single" w:sz="4" w:space="0" w:color="auto"/>
+          <w:right w:val="single" w:sz="4" w:space="0" w:color="auto"/>
+          <w:insideH w:val="single" w:sz="4" w:space="0" w:color="auto"/>
+          <w:insideV w:val="single" w:sz="4" w:space="0" w:color="auto"/>
+        </w:tblBorders>
+        <w:tblCellMar>
+          <w:left w:w="10" w:type="dxa"/>
+          <w:right w:w="10" w:type="dxa"/>
+        </w:tblCellMar>
+        <w:tblLook w:val="04A0" w:firstRow="1" w:lastRow="0" w:firstColumn="1" w:lastColumn="0" w:noHBand="0" w:noVBand="1"/>
+      </w:tblPr>
+      <w:tblGrid>
+        <w:gridCol w:w="9360"/>
+      </w:tblGrid>
+      <w:tr>
+        <w:tblPrEx>
+          <w:tblCellMar>
+            <w:top w:w="0" w:type="dxa"/>
+            <w:bottom w:w="0" w:type="dxa"/>
+          </w:tblCellMar>
+        </w:tblPrEx>
+        <w:tc>
+          <w:tcPr>
+            <w:tcW w:w="9360" w:type="dxa"/>
+            <w:tcBorders>
+              <w:top w:val="single" w:sz="4" w:space="0" w:color="C9D1DC"/>
+              <w:left w:val="single" w:sz="4" w:space="0" w:color="C9D1DC"/>
+              <w:bottom w:val="single" w:sz="4" w:space="0" w:color="C9D1DC"/>
+              <w:right w:val="single" w:sz="4" w:space="0" w:color="C9D1DC"/>
+            </w:tcBorders>
+            <w:shd w:val="clear" w:color="auto" w:fill="F4F6F9"/>
+            <w:tcMar>
+              <w:top w:w="80" w:type="dxa"/>
+              <w:left w:w="120" w:type="dxa"/>
+              <w:bottom w:w="80" w:type="dxa"/>
+              <w:right w:w="120" w:type="dxa"/>
+            </w:tcMar>
+          </w:tcPr>
+          <w:p>
+            <w:r>
+              <w:rPr>
+                <w:rFonts w:ascii="Consolas" w:eastAsia="Consolas" w:hAnsi="Consolas" w:cs="Consolas"/>
+                <w:sz w:val="16"/>
+                <w:szCs w:val="16"/>
+              </w:rPr>
+              <w:t>"service": { "name": "Postgres", "state": "live" }</w:t>
+            </w:r>
+          </w:p>
+          <w:p>
+            <w:r>
+              <w:rPr>
+                <w:rFonts w:ascii="Consolas" w:eastAsia="Consolas" w:hAnsi="Consolas" w:cs="Consolas"/>
+                <w:sz w:val="16"/>
+                <w:szCs w:val="16"/>
+              </w:rPr>
+              <w:t>"source": { "image": "ghcr.io/railwayapp-templates/postgres-ssl:18" }</w:t>
+            </w:r>
+          </w:p>
+          <w:p>
+            <w:r>
+              <w:rPr>
+                <w:rFonts w:ascii="Consolas" w:eastAsia="Consolas" w:hAnsi="Consolas" w:cs="Consolas"/>
+                <w:sz w:val="16"/>
+                <w:szCs w:val="16"/>
+              </w:rPr>
+              <w:t>"networking": { "privateNetworkEndpoint": "postgres" }</w:t>
+            </w:r>
+          </w:p>
+          <w:p>
+            <w:r>
+              <w:rPr>
+                <w:rFonts w:ascii="Consolas" w:eastAsia="Consolas" w:hAnsi="Consolas" w:cs="Consolas"/>
+                <w:sz w:val="16"/>
+                <w:szCs w:val="16"/>
+              </w:rPr>
+              <w:t>"domains": { "serviceDomains": [], "customDomains": [] }</w:t>
+            </w:r>
+          </w:p>
+          <w:p>
+            <w:r>
+              <w:rPr>
+                <w:rFonts w:ascii="Consolas" w:eastAsia="Consolas" w:hAnsi="Consolas" w:cs="Consolas"/>
+                <w:sz w:val="16"/>
+                <w:szCs w:val="16"/>
+              </w:rPr>
+              <w:t>"tcpProxies": []</w:t>
+            </w:r>
+          </w:p>
+          <w:p>
+            <w:r>
+              <w:rPr>
+                <w:rFonts w:ascii="Consolas" w:eastAsia="Consolas" w:hAnsi="Consolas" w:cs="Consolas"/>
+                <w:sz w:val="16"/>
+                <w:szCs w:val="16"/>
+              </w:rPr>
+              <w:t>"volumes": [{ "name": "postgres-volume", "mountPath": "/var/lib/postgresql/data", "sizeMB": 50000 }]</w:t>
+            </w:r>
+          </w:p>
+        </w:tc>
+      </w:tr>
+    </w:tbl>
+    <w:p>
+      <w:pPr>
+        <w:spacing w:after="120" w:line="276" w:lineRule="auto"/>
+        <w:jc w:val="both"/>
+      </w:pPr>
+      <w:r>
+        <w:rPr>
+          <w:b/>
+          <w:bCs/>
+        </w:rPr>
+        <w:t>Lectura:</w:t>
+      </w:r>
+      <w:r>
+        <w:t xml:space="preserve"> sin dominios ni proxies TCP, la base de datos no tiene ninguna ruta de entrada desde Internet; solo es alcanzable como postgres.railway.internal dentro del proyecto.</w:t>
+      </w:r>
+    </w:p>
+    <w:p>
+      <w:pPr>
+        <w:pStyle w:val="Ttulo2"/>
+      </w:pPr>
+      <w:bookmarkStart w:id="33" w:name="_Toc242055583"/>
+      <w:r>
+        <w:t>B.2 Servicio portal-app (capa de aplicación)</w:t>
+      </w:r>
+      <w:bookmarkEnd w:id="33"/>
+    </w:p>
+    <w:tbl>
+      <w:tblPr>
+        <w:tblW w:w="9360" w:type="dxa"/>
+        <w:tblBorders>
+          <w:top w:val="single" w:sz="4" w:space="0" w:color="auto"/>
+          <w:left w:val="single" w:sz="4" w:space="0" w:color="auto"/>
+          <w:bottom w:val="single" w:sz="4" w:space="0" w:color="auto"/>
+          <w:right w:val="single" w:sz="4" w:space="0" w:color="auto"/>
+          <w:insideH w:val="single" w:sz="4" w:space="0" w:color="auto"/>
+          <w:insideV w:val="single" w:sz="4" w:space="0" w:color="auto"/>
+        </w:tblBorders>
+        <w:tblCellMar>
+          <w:left w:w="10" w:type="dxa"/>
+          <w:right w:w="10" w:type="dxa"/>
+        </w:tblCellMar>
+        <w:tblLook w:val="04A0" w:firstRow="1" w:lastRow="0" w:firstColumn="1" w:lastColumn="0" w:noHBand="0" w:noVBand="1"/>
+      </w:tblPr>
+      <w:tblGrid>
+        <w:gridCol w:w="9360"/>
+      </w:tblGrid>
+      <w:tr>
+        <w:tblPrEx>
+          <w:tblCellMar>
+            <w:top w:w="0" w:type="dxa"/>
+            <w:bottom w:w="0" w:type="dxa"/>
+          </w:tblCellMar>
+        </w:tblPrEx>
+        <w:tc>
+          <w:tcPr>
+            <w:tcW w:w="9360" w:type="dxa"/>
+            <w:tcBorders>
+              <w:top w:val="single" w:sz="4" w:space="0" w:color="C9D1DC"/>
+              <w:left w:val="single" w:sz="4" w:space="0" w:color="C9D1DC"/>
+              <w:bottom w:val="single" w:sz="4" w:space="0" w:color="C9D1DC"/>
+              <w:right w:val="single" w:sz="4" w:space="0" w:color="C9D1DC"/>
+            </w:tcBorders>
+            <w:shd w:val="clear" w:color="auto" w:fill="F4F6F9"/>
+            <w:tcMar>
+              <w:top w:w="80" w:type="dxa"/>
+              <w:left w:w="120" w:type="dxa"/>
+              <w:bottom w:w="80" w:type="dxa"/>
+              <w:right w:w="120" w:type="dxa"/>
+            </w:tcMar>
+          </w:tcPr>
+          <w:p>
+            <w:r>
+              <w:rPr>
+                <w:rFonts w:ascii="Consolas" w:eastAsia="Consolas" w:hAnsi="Consolas" w:cs="Consolas"/>
+                <w:sz w:val="16"/>
+                <w:szCs w:val="16"/>
+              </w:rPr>
+              <w:t>"source": { "repo": "javiermunoznavarrete/portal-incidentes-ti3v62", "branch": "main", "rootDirectory": "/app" }</w:t>
+            </w:r>
+          </w:p>
+          <w:p>
+            <w:r>
+              <w:rPr>
+                <w:rFonts w:ascii="Consolas" w:eastAsia="Consolas" w:hAnsi="Consolas" w:cs="Consolas"/>
+                <w:sz w:val="16"/>
+                <w:szCs w:val="16"/>
+              </w:rPr>
+              <w:t>"networking": { "serviceDomains": { "portal-app-production-1269.up.railway.app": { "port": 3000 } } }</w:t>
+            </w:r>
+          </w:p>
+          <w:p>
+            <w:r>
+              <w:rPr>
+                <w:rFonts w:ascii="Consolas" w:eastAsia="Consolas" w:hAnsi="Consolas" w:cs="Consolas"/>
+                <w:sz w:val="16"/>
+                <w:szCs w:val="16"/>
+              </w:rPr>
+              <w:t>"tcpProxies": []</w:t>
+            </w:r>
+          </w:p>
+          <w:p>
+            <w:r>
+              <w:rPr>
+                <w:rFonts w:ascii="Consolas" w:eastAsia="Consolas" w:hAnsi="Consolas" w:cs="Consolas"/>
+                <w:sz w:val="16"/>
+                <w:szCs w:val="16"/>
+              </w:rPr>
+              <w:t>"build": { "watchPatterns": ["/app/**"] }</w:t>
+            </w:r>
+          </w:p>
+          <w:p>
+            <w:r>
+              <w:rPr>
+                <w:rFonts w:ascii="Consolas" w:eastAsia="Consolas" w:hAnsi="Consolas" w:cs="Consolas"/>
+                <w:sz w:val="16"/>
+                <w:szCs w:val="16"/>
+              </w:rPr>
+              <w:t>"deploy": { "healthcheckPath": "/health", "healthcheckTimeout": 60,</w:t>
+            </w:r>
+          </w:p>
+          <w:p>
+            <w:r>
+              <w:rPr>
+                <w:rFonts w:ascii="Consolas" w:eastAsia="Consolas" w:hAnsi="Consolas" w:cs="Consolas"/>
+                <w:sz w:val="16"/>
+                <w:szCs w:val="16"/>
+              </w:rPr>
+              <w:t xml:space="preserve">            "multiRegionConfig": { "asia-southeast1-eqsg3a": { "numReplicas": 2 } },</w:t>
+            </w:r>
+          </w:p>
+          <w:p>
+            <w:r>
+              <w:rPr>
+                <w:rFonts w:ascii="Consolas" w:eastAsia="Consolas" w:hAnsi="Consolas" w:cs="Consolas"/>
+                <w:sz w:val="16"/>
+                <w:szCs w:val="16"/>
+              </w:rPr>
+              <w:t xml:space="preserve">            "drainingSeconds": 10, "overlapSeconds": 20 }</w:t>
+            </w:r>
+          </w:p>
+          <w:p>
+            <w:r>
+              <w:rPr>
+                <w:rFonts w:ascii="Consolas" w:eastAsia="Consolas" w:hAnsi="Consolas" w:cs="Consolas"/>
+                <w:sz w:val="16"/>
+                <w:szCs w:val="16"/>
+              </w:rPr>
+              <w:t>"variableNames": [ "DATABASE_URL", "FIREBASE_PROJECT_ID", "FIREBASE_SERVICE_ACCOUNT", "FIREBASE_WEB_CONFIG",</w:t>
+            </w:r>
+          </w:p>
+          <w:p>
+            <w:r>
+              <w:rPr>
+                <w:rFonts w:ascii="Consolas" w:eastAsia="Consolas" w:hAnsi="Consolas" w:cs="Consolas"/>
+                <w:sz w:val="16"/>
+                <w:szCs w:val="16"/>
+              </w:rPr>
+              <w:t xml:space="preserve">                   "SESSION_SECRET", "SEED_ADMIN_PASSWORD", "SEED_ANALISTA_PASSWORD", "SEED_AUDITOR_PASSWORD", ... ]</w:t>
+            </w:r>
+          </w:p>
+        </w:tc>
+      </w:tr>
+    </w:tbl>
+    <w:p>
+      <w:pPr>
+        <w:spacing w:after="120" w:line="276" w:lineRule="auto"/>
+        <w:jc w:val="both"/>
+      </w:pPr>
+      <w:r>
+        <w:rPr>
+          <w:b/>
+          <w:bCs/>
+        </w:rPr>
+        <w:t>Lectura:</w:t>
+      </w:r>
+      <w:r>
+        <w:t xml:space="preserve"> Railway despliega la rama </w:t>
+      </w:r>
+      <w:r>
+        <w:rPr>
+          <w:b/>
+          <w:bCs/>
+        </w:rPr>
+        <w:t>main</w:t>
+      </w:r>
+      <w:r>
+        <w:t xml:space="preserve"> del repositorio (código final tras el merge de los PR #1 a #3), con 2 réplicas, healthcheck en /health y un único dominio público. La política de reinicio no aparece porque se usa el valor por defecto de Railway (On Failure, hasta 10 reintentos).</w:t>
+      </w:r>
+    </w:p>
+    <w:p>
+      <w:pPr>
+        <w:pStyle w:val="Ttulo2"/>
+      </w:pPr>
+      <w:bookmarkStart w:id="34" w:name="_Toc242055584"/>
+      <w:r>
+        <w:t>B.3 Log de build (extracto)</w:t>
+      </w:r>
+      <w:bookmarkEnd w:id="34"/>
+    </w:p>
+    <w:tbl>
+      <w:tblPr>
+        <w:tblW w:w="9360" w:type="dxa"/>
+        <w:tblBorders>
+          <w:top w:val="single" w:sz="4" w:space="0" w:color="auto"/>
+          <w:left w:val="single" w:sz="4" w:space="0" w:color="auto"/>
+          <w:bottom w:val="single" w:sz="4" w:space="0" w:color="auto"/>
+          <w:right w:val="single" w:sz="4" w:space="0" w:color="auto"/>
+          <w:insideH w:val="single" w:sz="4" w:space="0" w:color="auto"/>
+          <w:insideV w:val="single" w:sz="4" w:space="0" w:color="auto"/>
+        </w:tblBorders>
+        <w:tblCellMar>
+          <w:left w:w="10" w:type="dxa"/>
+          <w:right w:w="10" w:type="dxa"/>
+        </w:tblCellMar>
+        <w:tblLook w:val="04A0" w:firstRow="1" w:lastRow="0" w:firstColumn="1" w:lastColumn="0" w:noHBand="0" w:noVBand="1"/>
+      </w:tblPr>
+      <w:tblGrid>
+        <w:gridCol w:w="9360"/>
+      </w:tblGrid>
+      <w:tr>
+        <w:tblPrEx>
+          <w:tblCellMar>
+            <w:top w:w="0" w:type="dxa"/>
+            <w:bottom w:w="0" w:type="dxa"/>
+          </w:tblCellMar>
+        </w:tblPrEx>
+        <w:tc>
+          <w:tcPr>
+            <w:tcW w:w="9360" w:type="dxa"/>
+            <w:tcBorders>
+              <w:top w:val="single" w:sz="4" w:space="0" w:color="C9D1DC"/>
+              <w:left w:val="single" w:sz="4" w:space="0" w:color="C9D1DC"/>
+              <w:bottom w:val="single" w:sz="4" w:space="0" w:color="C9D1DC"/>
+              <w:right w:val="single" w:sz="4" w:space="0" w:color="C9D1DC"/>
+            </w:tcBorders>
+            <w:shd w:val="clear" w:color="auto" w:fill="F4F6F9"/>
+            <w:tcMar>
+              <w:top w:w="80" w:type="dxa"/>
+              <w:left w:w="120" w:type="dxa"/>
+              <w:bottom w:w="80" w:type="dxa"/>
+              <w:right w:w="120" w:type="dxa"/>
+            </w:tcMar>
+          </w:tcPr>
+          <w:p>
+            <w:r>
+              <w:rPr>
+                <w:rFonts w:ascii="Consolas" w:eastAsia="Consolas" w:hAnsi="Consolas" w:cs="Consolas"/>
+                <w:sz w:val="16"/>
+                <w:szCs w:val="16"/>
+              </w:rPr>
+              <w:t>[deps 1/4] FROM docker.io/library/node:22-alpine</w:t>
+            </w:r>
+          </w:p>
+          <w:p>
+            <w:r>
+              <w:rPr>
+                <w:rFonts w:ascii="Consolas" w:eastAsia="Consolas" w:hAnsi="Consolas" w:cs="Consolas"/>
+                <w:sz w:val="16"/>
+                <w:szCs w:val="16"/>
+              </w:rPr>
+              <w:t>[deps 4/4] RUN npm ci --omit=dev --ignore-scripts &amp;&amp; npm cache clean --force</w:t>
+            </w:r>
+          </w:p>
+          <w:p>
+            <w:r>
+              <w:rPr>
+                <w:rFonts w:ascii="Consolas" w:eastAsia="Consolas" w:hAnsi="Consolas" w:cs="Consolas"/>
+                <w:sz w:val="16"/>
+                <w:szCs w:val="16"/>
+              </w:rPr>
+              <w:t>[stage-1 3/6] COPY --from=deps /app/node_modules ./node_modules</w:t>
+            </w:r>
+          </w:p>
+          <w:p>
+            <w:r>
+              <w:rPr>
+                <w:rFonts w:ascii="Consolas" w:eastAsia="Consolas" w:hAnsi="Consolas" w:cs="Consolas"/>
+                <w:sz w:val="16"/>
+                <w:szCs w:val="16"/>
+              </w:rPr>
+              <w:t>[stage-1 5/6] COPY src ./src</w:t>
+            </w:r>
+          </w:p>
+          <w:p>
+            <w:r>
+              <w:rPr>
+                <w:rFonts w:ascii="Consolas" w:eastAsia="Consolas" w:hAnsi="Consolas" w:cs="Consolas"/>
+                <w:sz w:val="16"/>
+                <w:szCs w:val="16"/>
+              </w:rPr>
+              <w:t>[stage-1 6/6] COPY public ./public</w:t>
+            </w:r>
+          </w:p>
+          <w:p>
+            <w:r>
+              <w:rPr>
+                <w:rFonts w:ascii="Consolas" w:eastAsia="Consolas" w:hAnsi="Consolas" w:cs="Consolas"/>
+                <w:sz w:val="16"/>
+                <w:szCs w:val="16"/>
+              </w:rPr>
+              <w:t>Starting Healthcheck — Path: /health</w:t>
+            </w:r>
+          </w:p>
+          <w:p>
+            <w:r>
+              <w:rPr>
+                <w:rFonts w:ascii="Consolas" w:eastAsia="Consolas" w:hAnsi="Consolas" w:cs="Consolas"/>
+                <w:sz w:val="16"/>
+                <w:szCs w:val="16"/>
+              </w:rPr>
+              <w:t>[2/2] Healthcheck succeeded!</w:t>
+            </w:r>
+          </w:p>
+        </w:tc>
+      </w:tr>
+    </w:tbl>
+    <w:p>
+      <w:pPr>
+        <w:spacing w:after="120" w:line="276" w:lineRule="auto"/>
+        <w:jc w:val="both"/>
+      </w:pPr>
+      <w:r>
+        <w:rPr>
+          <w:b/>
+          <w:bCs/>
+        </w:rPr>
+        <w:t>Lectura:</w:t>
+      </w:r>
+      <w:r>
+        <w:t xml:space="preserve"> la imagen se construye con el Dockerfile multietapa del repositorio (etapas deps y stage-1, base node:22-alpine) y solo entra en servicio cuando el healthcheck responde en ambas réplicas.</w:t>
+      </w:r>
+    </w:p>
     <w:sectPr>
-      <w:headerReference w:type="default" r:id="rId17"/>
-      <w:footerReference w:type="default" r:id="rId18"/>
-      <w:headerReference w:type="first" r:id="rId19"/>
-      <w:footerReference w:type="first" r:id="rId20"/>
+      <w:headerReference w:type="default" r:id="rId20"/>
+      <w:footerReference w:type="default" r:id="rId21"/>
+      <w:headerReference w:type="first" r:id="rId22"/>
+      <w:footerReference w:type="first" r:id="rId23"/>
       <w:pgSz w:w="12240" w:h="15840"/>
       <w:pgMar w:top="1440" w:right="1440" w:bottom="1440" w:left="1440" w:header="708" w:footer="708" w:gutter="0"/>
       <w:cols w:space="720"/>
@@ -32871,68 +34436,64 @@
 <file path=word/numbering.xml><?xml version="1.0" encoding="utf-8"?>
 <w:numbering xmlns:wpc="http://schemas.microsoft.com/office/word/2010/wordprocessingCanvas" xmlns:cx="http://schemas.microsoft.com/office/drawing/2014/chartex" xmlns:cx1="http://schemas.microsoft.com/office/drawing/2015/9/8/chartex" xmlns:cx2="http://schemas.microsoft.com/office/drawing/2015/10/21/chartex" xmlns:cx3="http://schemas.microsoft.com/office/drawing/2016/5/9/chartex" xmlns:cx4="http://schemas.microsoft.com/office/drawing/2016/5/10/chartex" xmlns:cx5="http://schemas.microsoft.com/office/drawing/2016/5/11/chartex" xmlns:cx6="http://schemas.microsoft.com/office/drawing/2016/5/12/chartex" xmlns:cx7="http://schemas.microsoft.com/office/drawing/2016/5/13/chartex" xmlns:cx8="http://schemas.microsoft.com/office/drawing/2016/5/14/chartex" xmlns:mc="http://schemas.openxmlformats.org/markup-compatibility/2006" xmlns:aink="http://schemas.microsoft.com/office/drawing/2016/ink" xmlns:am3d="http://schemas.microsoft.com/office/drawing/2017/model3d" xmlns:o="urn:schemas-microsoft-com:office:office" xmlns:oel="http://schemas.microsoft.com/office/2019/extlst" xmlns:r="http://schemas.openxmlformats.org/officeDocument/2006/relationships" xmlns:m="http://schemas.openxmlformats.org/officeDocument/2006/math" xmlns:v="urn:schemas-microsoft-com:vml" xmlns:wp14="http://schemas.microsoft.com/office/word/2010/wordprocessingDrawing" xmlns:wp="http://schemas.openxmlformats.org/drawingml/2006/wordprocessingDrawing" xmlns:w10="urn:schemas-microsoft-com:office:word" xmlns:w="http://schemas.openxmlformats.org/wordprocessingml/2006/main" xmlns:w14="http://schemas.microsoft.com/office/word/2010/wordml" xmlns:w15="http://schemas.microsoft.com/office/word/2012/wordml" xmlns:w16cex="http://schemas.microsoft.com/office/word/2018/wordml/cex" xmlns:w16cid="http://schemas.microsoft.com/office/word/2016/wordml/cid" xmlns:w16="http://schemas.microsoft.com/office/word/2018/wordml" xmlns:w16du="http://schemas.microsoft.com/office/word/2023/wordml/word16du" xmlns:w16sdtdh="http://schemas.microsoft.com/office/word/2020/wordml/sdtdatahash" xmlns:w16sdtfl="http://schemas.microsoft.com/office/word/2024/wordml/sdtformatlock" xmlns:w16se="http://schemas.microsoft.com/office/word/2015/wordml/symex" xmlns:wpg="http://schemas.microsoft.com/office/word/2010/wordprocessingGroup" xmlns:wpi="http://schemas.microsoft.com/office/word/2010/wordprocessingInk" xmlns:wne="http://schemas.microsoft.com/office/word/2006/wordml" xmlns:wps="http://schemas.microsoft.com/office/word/2010/wordprocessingShape" mc:Ignorable="w14 w15 w16se w16cid w16 w16cex w16sdtdh w16sdtfl w16du wp14">
   <w:abstractNum w:abstractNumId="0" w15:restartNumberingAfterBreak="0">
-    <w:nsid w:val="074D4788"/>
+    <w:nsid w:val="211E3E1E"/>
     <w:multiLevelType w:val="hybridMultilevel"/>
-    <w:tmpl w:val="FF342442"/>
-    <w:lvl w:ilvl="0" w:tplc="675CCEE0">
+    <w:tmpl w:val="7F16DF7E"/>
+    <w:lvl w:ilvl="0" w:tplc="9D368F8C" w:tentative="1">
       <w:start w:val="1"/>
-      <w:numFmt w:val="bullet"/>
-      <w:lvlText w:val="•"/>
+      <w:numFmt w:val="decimal"/>
+      <w:lvlText w:val="%1."/>
       <w:lvlJc w:val="left"/>
       <w:pPr>
-        <w:ind w:left="540" w:hanging="270"/>
+        <w:ind w:left="540" w:hanging="300"/>
       </w:pPr>
     </w:lvl>
-    <w:lvl w:ilvl="1" w:tplc="DF44F792" w:tentative="1">
-      <w:start w:val="1"/>
-      <w:numFmt w:val="bullet"/>
-      <w:lvlText w:val="–"/>
-      <w:lvlJc w:val="left"/>
-      <w:pPr>
-        <w:ind w:left="1080" w:hanging="270"/>
-      </w:pPr>
-    </w:lvl>
-    <w:lvl w:ilvl="2" w:tplc="2402CF38">
+    <w:lvl w:ilvl="1" w:tplc="9B3CF904">
       <w:numFmt w:val="decimal"/>
       <w:lvlText w:val=""/>
       <w:lvlJc w:val="left"/>
     </w:lvl>
-    <w:lvl w:ilvl="3" w:tplc="4B3A76A6">
+    <w:lvl w:ilvl="2" w:tplc="A9106300">
       <w:numFmt w:val="decimal"/>
       <w:lvlText w:val=""/>
       <w:lvlJc w:val="left"/>
     </w:lvl>
-    <w:lvl w:ilvl="4" w:tplc="6006463E">
+    <w:lvl w:ilvl="3" w:tplc="94C85EDE">
       <w:numFmt w:val="decimal"/>
       <w:lvlText w:val=""/>
       <w:lvlJc w:val="left"/>
     </w:lvl>
-    <w:lvl w:ilvl="5" w:tplc="4DA4E752">
+    <w:lvl w:ilvl="4" w:tplc="F6D2610A">
       <w:numFmt w:val="decimal"/>
       <w:lvlText w:val=""/>
       <w:lvlJc w:val="left"/>
     </w:lvl>
-    <w:lvl w:ilvl="6" w:tplc="F976B8E8">
+    <w:lvl w:ilvl="5" w:tplc="2F96F076">
       <w:numFmt w:val="decimal"/>
       <w:lvlText w:val=""/>
       <w:lvlJc w:val="left"/>
     </w:lvl>
-    <w:lvl w:ilvl="7" w:tplc="2BA6F38A">
+    <w:lvl w:ilvl="6" w:tplc="A10CB4D2">
       <w:numFmt w:val="decimal"/>
       <w:lvlText w:val=""/>
       <w:lvlJc w:val="left"/>
     </w:lvl>
-    <w:lvl w:ilvl="8" w:tplc="7762552E">
+    <w:lvl w:ilvl="7" w:tplc="643A5F86">
+      <w:numFmt w:val="decimal"/>
+      <w:lvlText w:val=""/>
+      <w:lvlJc w:val="left"/>
+    </w:lvl>
+    <w:lvl w:ilvl="8" w:tplc="1074B950">
       <w:numFmt w:val="decimal"/>
       <w:lvlText w:val=""/>
       <w:lvlJc w:val="left"/>
     </w:lvl>
   </w:abstractNum>
   <w:abstractNum w:abstractNumId="1" w15:restartNumberingAfterBreak="0">
-    <w:nsid w:val="31F36E22"/>
+    <w:nsid w:val="47792766"/>
     <w:multiLevelType w:val="hybridMultilevel"/>
-    <w:tmpl w:val="AFD03AC2"/>
-    <w:lvl w:ilvl="0" w:tplc="A738C2C6" w:tentative="1">
+    <w:tmpl w:val="3962B31C"/>
+    <w:lvl w:ilvl="0" w:tplc="C792AE40" w:tentative="1">
       <w:start w:val="1"/>
       <w:numFmt w:val="bullet"/>
       <w:lvlText w:val="●"/>
@@ -32941,7 +34502,7 @@
         <w:ind w:left="720" w:hanging="360"/>
       </w:pPr>
     </w:lvl>
-    <w:lvl w:ilvl="1" w:tplc="BE2E7632" w:tentative="1">
+    <w:lvl w:ilvl="1" w:tplc="5F886896" w:tentative="1">
       <w:start w:val="1"/>
       <w:numFmt w:val="bullet"/>
       <w:lvlText w:val="○"/>
@@ -32950,7 +34511,7 @@
         <w:ind w:left="1440" w:hanging="360"/>
       </w:pPr>
     </w:lvl>
-    <w:lvl w:ilvl="2" w:tplc="F3247460" w:tentative="1">
+    <w:lvl w:ilvl="2" w:tplc="CC08D2C4" w:tentative="1">
       <w:start w:val="1"/>
       <w:numFmt w:val="bullet"/>
       <w:lvlText w:val="■"/>
@@ -32959,7 +34520,7 @@
         <w:ind w:left="2160" w:hanging="360"/>
       </w:pPr>
     </w:lvl>
-    <w:lvl w:ilvl="3" w:tplc="0852B414" w:tentative="1">
+    <w:lvl w:ilvl="3" w:tplc="3DF2B84C" w:tentative="1">
       <w:start w:val="1"/>
       <w:numFmt w:val="bullet"/>
       <w:lvlText w:val="●"/>
@@ -32968,7 +34529,7 @@
         <w:ind w:left="2880" w:hanging="360"/>
       </w:pPr>
     </w:lvl>
-    <w:lvl w:ilvl="4" w:tplc="DE6A20AC" w:tentative="1">
+    <w:lvl w:ilvl="4" w:tplc="CBFC1FE4" w:tentative="1">
       <w:start w:val="1"/>
       <w:numFmt w:val="bullet"/>
       <w:lvlText w:val="○"/>
@@ -32977,7 +34538,7 @@
         <w:ind w:left="3600" w:hanging="360"/>
       </w:pPr>
     </w:lvl>
-    <w:lvl w:ilvl="5" w:tplc="B462AA4E" w:tentative="1">
+    <w:lvl w:ilvl="5" w:tplc="EA148E2E" w:tentative="1">
       <w:start w:val="1"/>
       <w:numFmt w:val="bullet"/>
       <w:lvlText w:val="■"/>
@@ -32986,7 +34547,7 @@
         <w:ind w:left="4320" w:hanging="360"/>
       </w:pPr>
     </w:lvl>
-    <w:lvl w:ilvl="6" w:tplc="F998E3DC" w:tentative="1">
+    <w:lvl w:ilvl="6" w:tplc="0CB83140" w:tentative="1">
       <w:start w:val="1"/>
       <w:numFmt w:val="bullet"/>
       <w:lvlText w:val="●"/>
@@ -32995,7 +34556,7 @@
         <w:ind w:left="5040" w:hanging="360"/>
       </w:pPr>
     </w:lvl>
-    <w:lvl w:ilvl="7" w:tplc="FEBAAE84" w:tentative="1">
+    <w:lvl w:ilvl="7" w:tplc="D220C1E8" w:tentative="1">
       <w:start w:val="1"/>
       <w:numFmt w:val="bullet"/>
       <w:lvlText w:val="●"/>
@@ -33004,7 +34565,7 @@
         <w:ind w:left="5760" w:hanging="360"/>
       </w:pPr>
     </w:lvl>
-    <w:lvl w:ilvl="8" w:tplc="9D401324" w:tentative="1">
+    <w:lvl w:ilvl="8" w:tplc="5694C33E" w:tentative="1">
       <w:start w:val="1"/>
       <w:numFmt w:val="bullet"/>
       <w:lvlText w:val="●"/>
@@ -33015,67 +34576,71 @@
     </w:lvl>
   </w:abstractNum>
   <w:abstractNum w:abstractNumId="2" w15:restartNumberingAfterBreak="0">
-    <w:nsid w:val="5F2F48EA"/>
+    <w:nsid w:val="500A5CAF"/>
     <w:multiLevelType w:val="hybridMultilevel"/>
-    <w:tmpl w:val="E14257C4"/>
-    <w:lvl w:ilvl="0" w:tplc="765C12A4" w:tentative="1">
+    <w:tmpl w:val="F6C81162"/>
+    <w:lvl w:ilvl="0" w:tplc="5646327A">
       <w:start w:val="1"/>
-      <w:numFmt w:val="decimal"/>
-      <w:lvlText w:val="%1."/>
+      <w:numFmt w:val="bullet"/>
+      <w:lvlText w:val="•"/>
       <w:lvlJc w:val="left"/>
       <w:pPr>
-        <w:ind w:left="540" w:hanging="300"/>
+        <w:ind w:left="540" w:hanging="270"/>
       </w:pPr>
     </w:lvl>
-    <w:lvl w:ilvl="1" w:tplc="6090DCB8">
+    <w:lvl w:ilvl="1" w:tplc="E35CE6BE" w:tentative="1">
+      <w:start w:val="1"/>
+      <w:numFmt w:val="bullet"/>
+      <w:lvlText w:val="–"/>
+      <w:lvlJc w:val="left"/>
+      <w:pPr>
+        <w:ind w:left="1080" w:hanging="270"/>
+      </w:pPr>
+    </w:lvl>
+    <w:lvl w:ilvl="2" w:tplc="BDFAD3F8">
       <w:numFmt w:val="decimal"/>
       <w:lvlText w:val=""/>
       <w:lvlJc w:val="left"/>
     </w:lvl>
-    <w:lvl w:ilvl="2" w:tplc="402C54D0">
+    <w:lvl w:ilvl="3" w:tplc="4F10B1B2">
       <w:numFmt w:val="decimal"/>
       <w:lvlText w:val=""/>
       <w:lvlJc w:val="left"/>
     </w:lvl>
-    <w:lvl w:ilvl="3" w:tplc="4A2016EC">
+    <w:lvl w:ilvl="4" w:tplc="82FA5A76">
       <w:numFmt w:val="decimal"/>
       <w:lvlText w:val=""/>
       <w:lvlJc w:val="left"/>
     </w:lvl>
-    <w:lvl w:ilvl="4" w:tplc="A5F66182">
+    <w:lvl w:ilvl="5" w:tplc="FBA80D1C">
       <w:numFmt w:val="decimal"/>
       <w:lvlText w:val=""/>
       <w:lvlJc w:val="left"/>
     </w:lvl>
-    <w:lvl w:ilvl="5" w:tplc="133ADA06">
+    <w:lvl w:ilvl="6" w:tplc="62001DF4">
       <w:numFmt w:val="decimal"/>
       <w:lvlText w:val=""/>
       <w:lvlJc w:val="left"/>
     </w:lvl>
-    <w:lvl w:ilvl="6" w:tplc="B57CD582">
+    <w:lvl w:ilvl="7" w:tplc="622EDD72">
       <w:numFmt w:val="decimal"/>
       <w:lvlText w:val=""/>
       <w:lvlJc w:val="left"/>
     </w:lvl>
-    <w:lvl w:ilvl="7" w:tplc="6D9EC664">
-      <w:numFmt w:val="decimal"/>
-      <w:lvlText w:val=""/>
-      <w:lvlJc w:val="left"/>
-    </w:lvl>
-    <w:lvl w:ilvl="8" w:tplc="5F5CCDF8">
+    <w:lvl w:ilvl="8" w:tplc="FC107526">
       <w:numFmt w:val="decimal"/>
       <w:lvlText w:val=""/>
       <w:lvlJc w:val="left"/>
     </w:lvl>
   </w:abstractNum>
-  <w:num w:numId="1" w16cid:durableId="972637757">
+  <w:num w:numId="1" w16cid:durableId="1081027258">
     <w:abstractNumId w:val="1"/>
     <w:lvlOverride w:ilvl="0">
       <w:startOverride w:val="1"/>
     </w:lvlOverride>
   </w:num>
-  <w:num w:numId="2" w16cid:durableId="1174883854">
-    <w:abstractNumId w:val="0"/>
+  <w:num w:numId="2" w16cid:durableId="501512803">
+    <w:abstractNumId w:val="2"/>
     <w:lvlOverride w:ilvl="0">
       <w:startOverride w:val="1"/>
     </w:lvlOverride>
@@ -33715,7 +35280,7 @@
     <w:autoRedefine/>
     <w:uiPriority w:val="39"/>
     <w:unhideWhenUsed/>
-    <w:rsid w:val="00922869"/>
+    <w:rsid w:val="00DB6A84"/>
     <w:pPr>
       <w:spacing w:after="100"/>
     </w:pPr>
@@ -33727,7 +35292,7 @@
     <w:autoRedefine/>
     <w:uiPriority w:val="39"/>
     <w:unhideWhenUsed/>
-    <w:rsid w:val="00922869"/>
+    <w:rsid w:val="00DB6A84"/>
     <w:pPr>
       <w:spacing w:after="100"/>
       <w:ind w:left="220"/>

</xml_diff>